<commit_message>
Avanzado la parte de web y hecho el esquema ER de bases
</commit_message>
<xml_diff>
--- a/documentacion/Informe.docx
+++ b/documentacion/Informe.docx
@@ -14,20 +14,120 @@
     </w:p>
     <w:p>
       <w:r>
+        <w:t>MARCAS:</w:t>
+      </w:r>
+    </w:p>
+    <w:p>
+      <w:r>
+        <w:t xml:space="preserve">Empecé diseñando la web con Figma. Para el índice, hice 3 bocetos (wireframe, esquema y mock-up). </w:t>
+      </w:r>
+    </w:p>
+    <w:p>
+      <w:r>
+        <w:rPr>
+          <w:noProof/>
+        </w:rPr>
+        <w:drawing>
+          <wp:inline distT="0" distB="0" distL="0" distR="0" wp14:anchorId="06DC628C" wp14:editId="04C20FA8">
+            <wp:extent cx="5400040" cy="2505710"/>
+            <wp:effectExtent l="0" t="0" r="0" b="8890"/>
+            <wp:docPr id="800713091" name="Imagen 1"/>
+            <wp:cNvGraphicFramePr>
+              <a:graphicFrameLocks xmlns:a="http://schemas.openxmlformats.org/drawingml/2006/main" noChangeAspect="1"/>
+            </wp:cNvGraphicFramePr>
+            <a:graphic xmlns:a="http://schemas.openxmlformats.org/drawingml/2006/main">
+              <a:graphicData uri="http://schemas.openxmlformats.org/drawingml/2006/picture">
+                <pic:pic xmlns:pic="http://schemas.openxmlformats.org/drawingml/2006/picture">
+                  <pic:nvPicPr>
+                    <pic:cNvPr id="800713091" name=""/>
+                    <pic:cNvPicPr/>
+                  </pic:nvPicPr>
+                  <pic:blipFill>
+                    <a:blip r:embed="rId4"/>
+                    <a:stretch>
+                      <a:fillRect/>
+                    </a:stretch>
+                  </pic:blipFill>
+                  <pic:spPr>
+                    <a:xfrm>
+                      <a:off x="0" y="0"/>
+                      <a:ext cx="5400040" cy="2505710"/>
+                    </a:xfrm>
+                    <a:prstGeom prst="rect">
+                      <a:avLst/>
+                    </a:prstGeom>
+                  </pic:spPr>
+                </pic:pic>
+              </a:graphicData>
+            </a:graphic>
+          </wp:inline>
+        </w:drawing>
+      </w:r>
+    </w:p>
+    <w:p>
+      <w:r>
+        <w:t>BASES:</w:t>
+      </w:r>
+    </w:p>
+    <w:p>
+      <w:r>
+        <w:t>Diagrama entidad relación:</w:t>
+      </w:r>
+    </w:p>
+    <w:p>
+      <w:r>
+        <w:rPr>
+          <w:noProof/>
+        </w:rPr>
+        <w:drawing>
+          <wp:inline distT="0" distB="0" distL="0" distR="0" wp14:anchorId="4E4B63B0" wp14:editId="434A3155">
+            <wp:extent cx="5400040" cy="4210050"/>
+            <wp:effectExtent l="0" t="0" r="0" b="0"/>
+            <wp:docPr id="635600855" name="Imagen 1"/>
+            <wp:cNvGraphicFramePr>
+              <a:graphicFrameLocks xmlns:a="http://schemas.openxmlformats.org/drawingml/2006/main" noChangeAspect="1"/>
+            </wp:cNvGraphicFramePr>
+            <a:graphic xmlns:a="http://schemas.openxmlformats.org/drawingml/2006/main">
+              <a:graphicData uri="http://schemas.openxmlformats.org/drawingml/2006/picture">
+                <pic:pic xmlns:pic="http://schemas.openxmlformats.org/drawingml/2006/picture">
+                  <pic:nvPicPr>
+                    <pic:cNvPr id="635600855" name=""/>
+                    <pic:cNvPicPr/>
+                  </pic:nvPicPr>
+                  <pic:blipFill>
+                    <a:blip r:embed="rId5"/>
+                    <a:stretch>
+                      <a:fillRect/>
+                    </a:stretch>
+                  </pic:blipFill>
+                  <pic:spPr>
+                    <a:xfrm>
+                      <a:off x="0" y="0"/>
+                      <a:ext cx="5400040" cy="4210050"/>
+                    </a:xfrm>
+                    <a:prstGeom prst="rect">
+                      <a:avLst/>
+                    </a:prstGeom>
+                  </pic:spPr>
+                </pic:pic>
+              </a:graphicData>
+            </a:graphic>
+          </wp:inline>
+        </w:drawing>
+      </w:r>
+    </w:p>
+    <w:p>
+      <w:r>
+        <w:lastRenderedPageBreak/>
         <w:t>PROGRAMACIÓN</w:t>
       </w:r>
-    </w:p>
-    <w:p>
-      <w:r>
-        <w:t>Clase App (</w:t>
-      </w:r>
-      <w:proofErr w:type="spellStart"/>
-      <w:r>
-        <w:t>main</w:t>
-      </w:r>
-      <w:proofErr w:type="spellEnd"/>
-      <w:r>
-        <w:t>):</w:t>
+      <w:r>
+        <w:t>:</w:t>
+      </w:r>
+    </w:p>
+    <w:p>
+      <w:r>
+        <w:t>Clase App (main):</w:t>
       </w:r>
     </w:p>
     <w:p>
@@ -56,7 +156,7 @@
                     <pic:cNvPicPr/>
                   </pic:nvPicPr>
                   <pic:blipFill>
-                    <a:blip r:embed="rId4"/>
+                    <a:blip r:embed="rId6"/>
                     <a:stretch>
                       <a:fillRect/>
                     </a:stretch>
@@ -109,7 +209,7 @@
                     <pic:cNvPicPr/>
                   </pic:nvPicPr>
                   <pic:blipFill>
-                    <a:blip r:embed="rId5"/>
+                    <a:blip r:embed="rId7"/>
                     <a:stretch>
                       <a:fillRect/>
                     </a:stretch>
@@ -132,22 +232,13 @@
     </w:p>
     <w:p>
       <w:r>
-        <w:lastRenderedPageBreak/>
         <w:t xml:space="preserve">Un ejemplo de los </w:t>
       </w:r>
       <w:r>
         <w:t>métodos</w:t>
       </w:r>
       <w:r>
-        <w:t xml:space="preserve"> que realicé es el de </w:t>
-      </w:r>
-      <w:proofErr w:type="spellStart"/>
-      <w:r>
-        <w:t>addGaleria</w:t>
-      </w:r>
-      <w:proofErr w:type="spellEnd"/>
-      <w:r>
-        <w:t>, el cual añade una galería a la colección de galerías de un evento seleccionado por el usuario:</w:t>
+        <w:t xml:space="preserve"> que realicé es el de addGaleria, el cual añade una galería a la colección de galerías de un evento seleccionado por el usuario:</w:t>
       </w:r>
     </w:p>
     <w:p>
@@ -155,6 +246,7 @@
         <w:rPr>
           <w:noProof/>
         </w:rPr>
+        <w:lastRenderedPageBreak/>
         <w:drawing>
           <wp:inline distT="0" distB="0" distL="0" distR="0" wp14:anchorId="145FCF91" wp14:editId="5B63ACDE">
             <wp:extent cx="5400040" cy="4801235"/>
@@ -171,7 +263,7 @@
                     <pic:cNvPicPr/>
                   </pic:nvPicPr>
                   <pic:blipFill>
-                    <a:blip r:embed="rId6"/>
+                    <a:blip r:embed="rId8"/>
                     <a:stretch>
                       <a:fillRect/>
                     </a:stretch>
@@ -218,7 +310,7 @@
                     <pic:cNvPicPr/>
                   </pic:nvPicPr>
                   <pic:blipFill>
-                    <a:blip r:embed="rId7"/>
+                    <a:blip r:embed="rId9"/>
                     <a:stretch>
                       <a:fillRect/>
                     </a:stretch>
@@ -247,17 +339,9 @@
         <w:t xml:space="preserve">inicialmente </w:t>
       </w:r>
       <w:r>
-        <w:t xml:space="preserve">no sabía cómo hacerlo. Encontré un comentario en Stack </w:t>
-      </w:r>
-      <w:proofErr w:type="spellStart"/>
-      <w:r>
-        <w:t>Overflow</w:t>
-      </w:r>
-      <w:proofErr w:type="spellEnd"/>
-      <w:r>
-        <w:t xml:space="preserve"> que explicaba cómo hacerlo (</w:t>
-      </w:r>
-      <w:hyperlink r:id="rId8" w:history="1">
+        <w:t>no sabía cómo hacerlo. Encontré un comentario en Stack Overflow que explicaba cómo hacerlo (</w:t>
+      </w:r>
+      <w:hyperlink r:id="rId10" w:history="1">
         <w:r>
           <w:rPr>
             <w:rStyle w:val="Hipervnculo"/>
@@ -290,7 +374,7 @@
                     <pic:cNvPicPr/>
                   </pic:nvPicPr>
                   <pic:blipFill>
-                    <a:blip r:embed="rId9"/>
+                    <a:blip r:embed="rId11"/>
                     <a:stretch>
                       <a:fillRect/>
                     </a:stretch>

</xml_diff>

<commit_message>
Archivo SQL comenzado, actualizado el README y el informe
</commit_message>
<xml_diff>
--- a/documentacion/Informe.docx
+++ b/documentacion/Informe.docx
@@ -3,8 +3,57 @@
 <w:document xmlns:wpc="http://schemas.microsoft.com/office/word/2010/wordprocessingCanvas" xmlns:cx="http://schemas.microsoft.com/office/drawing/2014/chartex" xmlns:cx1="http://schemas.microsoft.com/office/drawing/2015/9/8/chartex" xmlns:cx2="http://schemas.microsoft.com/office/drawing/2015/10/21/chartex" xmlns:cx3="http://schemas.microsoft.com/office/drawing/2016/5/9/chartex" xmlns:cx4="http://schemas.microsoft.com/office/drawing/2016/5/10/chartex" xmlns:cx5="http://schemas.microsoft.com/office/drawing/2016/5/11/chartex" xmlns:cx6="http://schemas.microsoft.com/office/drawing/2016/5/12/chartex" xmlns:cx7="http://schemas.microsoft.com/office/drawing/2016/5/13/chartex" xmlns:cx8="http://schemas.microsoft.com/office/drawing/2016/5/14/chartex" xmlns:mc="http://schemas.openxmlformats.org/markup-compatibility/2006" xmlns:aink="http://schemas.microsoft.com/office/drawing/2016/ink" xmlns:am3d="http://schemas.microsoft.com/office/drawing/2017/model3d" xmlns:o="urn:schemas-microsoft-com:office:office" xmlns:oel="http://schemas.microsoft.com/office/2019/extlst" xmlns:r="http://schemas.openxmlformats.org/officeDocument/2006/relationships" xmlns:m="http://schemas.openxmlformats.org/officeDocument/2006/math" xmlns:v="urn:schemas-microsoft-com:vml" xmlns:wp14="http://schemas.microsoft.com/office/word/2010/wordprocessingDrawing" xmlns:wp="http://schemas.openxmlformats.org/drawingml/2006/wordprocessingDrawing" xmlns:w10="urn:schemas-microsoft-com:office:word" xmlns:w="http://schemas.openxmlformats.org/wordprocessingml/2006/main" xmlns:w14="http://schemas.microsoft.com/office/word/2010/wordml" xmlns:w15="http://schemas.microsoft.com/office/word/2012/wordml" xmlns:w16cex="http://schemas.microsoft.com/office/word/2018/wordml/cex" xmlns:w16cid="http://schemas.microsoft.com/office/word/2016/wordml/cid" xmlns:w16="http://schemas.microsoft.com/office/word/2018/wordml" xmlns:w16du="http://schemas.microsoft.com/office/word/2023/wordml/word16du" xmlns:w16sdtdh="http://schemas.microsoft.com/office/word/2020/wordml/sdtdatahash" xmlns:w16sdtfl="http://schemas.microsoft.com/office/word/2024/wordml/sdtformatlock" xmlns:w16se="http://schemas.microsoft.com/office/word/2015/wordml/symex" xmlns:wpg="http://schemas.microsoft.com/office/word/2010/wordprocessingGroup" xmlns:wpi="http://schemas.microsoft.com/office/word/2010/wordprocessingInk" xmlns:wne="http://schemas.microsoft.com/office/word/2006/wordml" xmlns:wps="http://schemas.microsoft.com/office/word/2010/wordprocessingShape" mc:Ignorable="w14 w15 w16se w16cid w16 w16cex w16sdtdh w16sdtfl w16du wp14">
   <w:body>
     <w:p>
-      <w:r>
+      <w:pPr>
+        <w:jc w:val="center"/>
+        <w:rPr>
+          <w:b/>
+          <w:bCs/>
+          <w:sz w:val="40"/>
+          <w:szCs w:val="40"/>
+          <w:u w:val="single"/>
+        </w:rPr>
+      </w:pPr>
+      <w:r>
+        <w:rPr>
+          <w:b/>
+          <w:bCs/>
+          <w:sz w:val="40"/>
+          <w:szCs w:val="40"/>
+          <w:u w:val="single"/>
+        </w:rPr>
         <w:t>INFORME</w:t>
+      </w:r>
+      <w:r>
+        <w:rPr>
+          <w:b/>
+          <w:bCs/>
+          <w:sz w:val="40"/>
+          <w:szCs w:val="40"/>
+          <w:u w:val="single"/>
+        </w:rPr>
+        <w:t xml:space="preserve"> DE PROYECTO</w:t>
+      </w:r>
+    </w:p>
+    <w:p>
+      <w:pPr>
+        <w:jc w:val="center"/>
+        <w:rPr>
+          <w:b/>
+          <w:bCs/>
+          <w:sz w:val="40"/>
+          <w:szCs w:val="40"/>
+          <w:u w:val="single"/>
+        </w:rPr>
+      </w:pPr>
+      <w:r>
+        <w:rPr>
+          <w:b/>
+          <w:bCs/>
+          <w:sz w:val="40"/>
+          <w:szCs w:val="40"/>
+          <w:u w:val="single"/>
+        </w:rPr>
+        <w:t>Héctor García Menéndez</w:t>
       </w:r>
     </w:p>
     <w:p>
@@ -79,6 +128,7 @@
         <w:rPr>
           <w:noProof/>
         </w:rPr>
+        <w:lastRenderedPageBreak/>
         <w:drawing>
           <wp:inline distT="0" distB="0" distL="0" distR="0" wp14:anchorId="4E4B63B0" wp14:editId="434A3155">
             <wp:extent cx="5400040" cy="4210050"/>
@@ -118,7 +168,6 @@
     </w:p>
     <w:p>
       <w:r>
-        <w:lastRenderedPageBreak/>
         <w:t>PROGRAMACIÓN</w:t>
       </w:r>
       <w:r>
@@ -193,6 +242,7 @@
         <w:rPr>
           <w:noProof/>
         </w:rPr>
+        <w:lastRenderedPageBreak/>
         <w:drawing>
           <wp:inline distT="0" distB="0" distL="0" distR="0" wp14:anchorId="12EE7F6D" wp14:editId="61B67B17">
             <wp:extent cx="3379845" cy="3840480"/>

</xml_diff>

<commit_message>
Avance del archivo SQL
</commit_message>
<xml_diff>
--- a/documentacion/Informe.docx
+++ b/documentacion/Informe.docx
@@ -40,8 +40,8 @@
         <w:rPr>
           <w:b/>
           <w:bCs/>
-          <w:sz w:val="40"/>
-          <w:szCs w:val="40"/>
+          <w:sz w:val="32"/>
+          <w:szCs w:val="32"/>
           <w:u w:val="single"/>
         </w:rPr>
       </w:pPr>
@@ -49,8 +49,8 @@
         <w:rPr>
           <w:b/>
           <w:bCs/>
-          <w:sz w:val="40"/>
-          <w:szCs w:val="40"/>
+          <w:sz w:val="32"/>
+          <w:szCs w:val="32"/>
           <w:u w:val="single"/>
         </w:rPr>
         <w:t>Héctor García Menéndez</w:t>
@@ -58,6 +58,314 @@
     </w:p>
     <w:p>
       <w:r>
+        <w:t>Eventos que forman el proyecto:</w:t>
+      </w:r>
+    </w:p>
+    <w:p>
+      <w:pPr>
+        <w:pStyle w:val="Prrafodelista"/>
+        <w:numPr>
+          <w:ilvl w:val="0"/>
+          <w:numId w:val="2"/>
+        </w:numPr>
+      </w:pPr>
+      <w:r>
+        <w:t>Real Sporting vs Deportivo La Coruña</w:t>
+      </w:r>
+    </w:p>
+    <w:p>
+      <w:pPr>
+        <w:pStyle w:val="Prrafodelista"/>
+        <w:numPr>
+          <w:ilvl w:val="1"/>
+          <w:numId w:val="2"/>
+        </w:numPr>
+      </w:pPr>
+      <w:r>
+        <w:t>Categoría: Deportes</w:t>
+      </w:r>
+    </w:p>
+    <w:p>
+      <w:pPr>
+        <w:pStyle w:val="Prrafodelista"/>
+        <w:numPr>
+          <w:ilvl w:val="1"/>
+          <w:numId w:val="2"/>
+        </w:numPr>
+      </w:pPr>
+      <w:r>
+        <w:t>Fecha: 28 de marzo de 2026 21:00</w:t>
+      </w:r>
+    </w:p>
+    <w:p>
+      <w:pPr>
+        <w:pStyle w:val="Prrafodelista"/>
+        <w:numPr>
+          <w:ilvl w:val="1"/>
+          <w:numId w:val="2"/>
+        </w:numPr>
+      </w:pPr>
+      <w:r>
+        <w:t>Obicación: Estadio el Molinón, Gijón</w:t>
+      </w:r>
+    </w:p>
+    <w:p>
+      <w:pPr>
+        <w:pStyle w:val="Prrafodelista"/>
+        <w:numPr>
+          <w:ilvl w:val="0"/>
+          <w:numId w:val="2"/>
+        </w:numPr>
+      </w:pPr>
+      <w:r>
+        <w:t>Hoguera de San Juan 2026</w:t>
+      </w:r>
+    </w:p>
+    <w:p>
+      <w:pPr>
+        <w:pStyle w:val="Prrafodelista"/>
+        <w:numPr>
+          <w:ilvl w:val="1"/>
+          <w:numId w:val="2"/>
+        </w:numPr>
+      </w:pPr>
+      <w:r>
+        <w:t>Categoría: Celebraciones</w:t>
+      </w:r>
+    </w:p>
+    <w:p>
+      <w:pPr>
+        <w:pStyle w:val="Prrafodelista"/>
+        <w:numPr>
+          <w:ilvl w:val="1"/>
+          <w:numId w:val="2"/>
+        </w:numPr>
+      </w:pPr>
+      <w:r>
+        <w:t>Fecha: 23 de junio de 2026</w:t>
+      </w:r>
+    </w:p>
+    <w:p>
+      <w:pPr>
+        <w:pStyle w:val="Prrafodelista"/>
+        <w:numPr>
+          <w:ilvl w:val="0"/>
+          <w:numId w:val="2"/>
+        </w:numPr>
+      </w:pPr>
+      <w:r>
+        <w:t>Boombastic Asturias 2026</w:t>
+      </w:r>
+    </w:p>
+    <w:p>
+      <w:pPr>
+        <w:pStyle w:val="Prrafodelista"/>
+        <w:numPr>
+          <w:ilvl w:val="1"/>
+          <w:numId w:val="2"/>
+        </w:numPr>
+      </w:pPr>
+      <w:r>
+        <w:t>Categoría: Música</w:t>
+      </w:r>
+    </w:p>
+    <w:p>
+      <w:pPr>
+        <w:pStyle w:val="Prrafodelista"/>
+        <w:numPr>
+          <w:ilvl w:val="1"/>
+          <w:numId w:val="2"/>
+        </w:numPr>
+      </w:pPr>
+      <w:r>
+        <w:t xml:space="preserve">Fecha: </w:t>
+      </w:r>
+      <w:r>
+        <w:t>16 – 18 de julio de 2026</w:t>
+      </w:r>
+    </w:p>
+    <w:p>
+      <w:pPr>
+        <w:pStyle w:val="Prrafodelista"/>
+        <w:numPr>
+          <w:ilvl w:val="1"/>
+          <w:numId w:val="2"/>
+        </w:numPr>
+      </w:pPr>
+      <w:r>
+        <w:t>Ubicación: Llanera</w:t>
+      </w:r>
+    </w:p>
+    <w:p>
+      <w:pPr>
+        <w:pStyle w:val="Prrafodelista"/>
+        <w:numPr>
+          <w:ilvl w:val="0"/>
+          <w:numId w:val="2"/>
+        </w:numPr>
+      </w:pPr>
+      <w:r>
+        <w:t>Estreno: Super Mario Galaxy: La película</w:t>
+      </w:r>
+    </w:p>
+    <w:p>
+      <w:pPr>
+        <w:pStyle w:val="Prrafodelista"/>
+        <w:numPr>
+          <w:ilvl w:val="1"/>
+          <w:numId w:val="2"/>
+        </w:numPr>
+      </w:pPr>
+      <w:r>
+        <w:t>Categoría: Cine</w:t>
+      </w:r>
+    </w:p>
+    <w:p>
+      <w:pPr>
+        <w:pStyle w:val="Prrafodelista"/>
+        <w:numPr>
+          <w:ilvl w:val="1"/>
+          <w:numId w:val="2"/>
+        </w:numPr>
+      </w:pPr>
+      <w:r>
+        <w:t>Fecha: 1 de abril de 2026</w:t>
+      </w:r>
+    </w:p>
+    <w:p>
+      <w:pPr>
+        <w:pStyle w:val="Prrafodelista"/>
+        <w:numPr>
+          <w:ilvl w:val="0"/>
+          <w:numId w:val="2"/>
+        </w:numPr>
+      </w:pPr>
+      <w:r>
+        <w:t>Concierto La Oreja De Van Gogh Gijón</w:t>
+      </w:r>
+    </w:p>
+    <w:p>
+      <w:pPr>
+        <w:pStyle w:val="Prrafodelista"/>
+        <w:numPr>
+          <w:ilvl w:val="1"/>
+          <w:numId w:val="2"/>
+        </w:numPr>
+      </w:pPr>
+      <w:r>
+        <w:t>Categoría: Música</w:t>
+      </w:r>
+    </w:p>
+    <w:p>
+      <w:pPr>
+        <w:pStyle w:val="Prrafodelista"/>
+        <w:numPr>
+          <w:ilvl w:val="1"/>
+          <w:numId w:val="2"/>
+        </w:numPr>
+      </w:pPr>
+      <w:r>
+        <w:t>Fecha: 10 de julio de 2026</w:t>
+      </w:r>
+    </w:p>
+    <w:p>
+      <w:pPr>
+        <w:pStyle w:val="Prrafodelista"/>
+        <w:numPr>
+          <w:ilvl w:val="1"/>
+          <w:numId w:val="2"/>
+        </w:numPr>
+      </w:pPr>
+      <w:r>
+        <w:t>Ubicación: Gijón Life</w:t>
+      </w:r>
+    </w:p>
+    <w:p>
+      <w:pPr>
+        <w:pStyle w:val="Prrafodelista"/>
+        <w:numPr>
+          <w:ilvl w:val="0"/>
+          <w:numId w:val="2"/>
+        </w:numPr>
+      </w:pPr>
+      <w:r>
+        <w:t>Concierto Fito y Fitipaldis</w:t>
+      </w:r>
+    </w:p>
+    <w:p>
+      <w:pPr>
+        <w:pStyle w:val="Prrafodelista"/>
+        <w:numPr>
+          <w:ilvl w:val="1"/>
+          <w:numId w:val="2"/>
+        </w:numPr>
+      </w:pPr>
+      <w:r>
+        <w:t>Categoría: Música</w:t>
+      </w:r>
+    </w:p>
+    <w:p>
+      <w:pPr>
+        <w:pStyle w:val="Prrafodelista"/>
+        <w:numPr>
+          <w:ilvl w:val="1"/>
+          <w:numId w:val="2"/>
+        </w:numPr>
+      </w:pPr>
+      <w:r>
+        <w:t>Fecha: 20 de diciembre de 2025</w:t>
+      </w:r>
+    </w:p>
+    <w:p>
+      <w:pPr>
+        <w:pStyle w:val="Prrafodelista"/>
+        <w:numPr>
+          <w:ilvl w:val="1"/>
+          <w:numId w:val="2"/>
+        </w:numPr>
+      </w:pPr>
+      <w:r>
+        <w:t>Ubicación: Palacio de Deportes, Gijón</w:t>
+      </w:r>
+    </w:p>
+    <w:p>
+      <w:pPr>
+        <w:pStyle w:val="Prrafodelista"/>
+        <w:numPr>
+          <w:ilvl w:val="0"/>
+          <w:numId w:val="2"/>
+        </w:numPr>
+      </w:pPr>
+      <w:r>
+        <w:t>Carnaval 2026</w:t>
+      </w:r>
+    </w:p>
+    <w:p>
+      <w:pPr>
+        <w:pStyle w:val="Prrafodelista"/>
+        <w:numPr>
+          <w:ilvl w:val="1"/>
+          <w:numId w:val="2"/>
+        </w:numPr>
+      </w:pPr>
+      <w:r>
+        <w:t>Categoría: Celebraciones</w:t>
+      </w:r>
+    </w:p>
+    <w:p>
+      <w:pPr>
+        <w:pStyle w:val="Prrafodelista"/>
+        <w:numPr>
+          <w:ilvl w:val="1"/>
+          <w:numId w:val="2"/>
+        </w:numPr>
+      </w:pPr>
+      <w:r>
+        <w:t>Fecha: 12 – 18 de febrero de 2026</w:t>
+      </w:r>
+    </w:p>
+    <w:p>
+      <w:r>
         <w:t>WEB (HTML Y CSS)</w:t>
       </w:r>
     </w:p>
@@ -76,6 +384,7 @@
         <w:rPr>
           <w:noProof/>
         </w:rPr>
+        <w:lastRenderedPageBreak/>
         <w:drawing>
           <wp:inline distT="0" distB="0" distL="0" distR="0" wp14:anchorId="06DC628C" wp14:editId="04C20FA8">
             <wp:extent cx="5400040" cy="2505710"/>
@@ -92,7 +401,7 @@
                     <pic:cNvPicPr/>
                   </pic:nvPicPr>
                   <pic:blipFill>
-                    <a:blip r:embed="rId4"/>
+                    <a:blip r:embed="rId5"/>
                     <a:stretch>
                       <a:fillRect/>
                     </a:stretch>
@@ -128,7 +437,6 @@
         <w:rPr>
           <w:noProof/>
         </w:rPr>
-        <w:lastRenderedPageBreak/>
         <w:drawing>
           <wp:inline distT="0" distB="0" distL="0" distR="0" wp14:anchorId="4E4B63B0" wp14:editId="434A3155">
             <wp:extent cx="5400040" cy="4210050"/>
@@ -145,7 +453,7 @@
                     <pic:cNvPicPr/>
                   </pic:nvPicPr>
                   <pic:blipFill>
-                    <a:blip r:embed="rId5"/>
+                    <a:blip r:embed="rId6"/>
                     <a:stretch>
                       <a:fillRect/>
                     </a:stretch>
@@ -189,6 +497,7 @@
         <w:rPr>
           <w:noProof/>
         </w:rPr>
+        <w:lastRenderedPageBreak/>
         <w:drawing>
           <wp:inline distT="0" distB="0" distL="0" distR="0" wp14:anchorId="3F7A7E8B" wp14:editId="25EFC4C0">
             <wp:extent cx="3514786" cy="2758440"/>
@@ -205,7 +514,7 @@
                     <pic:cNvPicPr/>
                   </pic:nvPicPr>
                   <pic:blipFill>
-                    <a:blip r:embed="rId6"/>
+                    <a:blip r:embed="rId7"/>
                     <a:stretch>
                       <a:fillRect/>
                     </a:stretch>
@@ -242,7 +551,6 @@
         <w:rPr>
           <w:noProof/>
         </w:rPr>
-        <w:lastRenderedPageBreak/>
         <w:drawing>
           <wp:inline distT="0" distB="0" distL="0" distR="0" wp14:anchorId="12EE7F6D" wp14:editId="61B67B17">
             <wp:extent cx="3379845" cy="3840480"/>
@@ -259,7 +567,7 @@
                     <pic:cNvPicPr/>
                   </pic:nvPicPr>
                   <pic:blipFill>
-                    <a:blip r:embed="rId7"/>
+                    <a:blip r:embed="rId8"/>
                     <a:stretch>
                       <a:fillRect/>
                     </a:stretch>
@@ -313,7 +621,7 @@
                     <pic:cNvPicPr/>
                   </pic:nvPicPr>
                   <pic:blipFill>
-                    <a:blip r:embed="rId8"/>
+                    <a:blip r:embed="rId9"/>
                     <a:stretch>
                       <a:fillRect/>
                     </a:stretch>
@@ -360,7 +668,7 @@
                     <pic:cNvPicPr/>
                   </pic:nvPicPr>
                   <pic:blipFill>
-                    <a:blip r:embed="rId9"/>
+                    <a:blip r:embed="rId10"/>
                     <a:stretch>
                       <a:fillRect/>
                     </a:stretch>
@@ -391,7 +699,7 @@
       <w:r>
         <w:t>no sabía cómo hacerlo. Encontré un comentario en Stack Overflow que explicaba cómo hacerlo (</w:t>
       </w:r>
-      <w:hyperlink r:id="rId10" w:history="1">
+      <w:hyperlink r:id="rId11" w:history="1">
         <w:r>
           <w:rPr>
             <w:rStyle w:val="Hipervnculo"/>
@@ -424,7 +732,7 @@
                     <pic:cNvPicPr/>
                   </pic:nvPicPr>
                   <pic:blipFill>
-                    <a:blip r:embed="rId11"/>
+                    <a:blip r:embed="rId12"/>
                     <a:stretch>
                       <a:fillRect/>
                     </a:stretch>
@@ -453,6 +761,241 @@
     </w:sectPr>
   </w:body>
 </w:document>
+</file>
+
+<file path=word/numbering.xml><?xml version="1.0" encoding="utf-8"?>
+<w:numbering xmlns:wpc="http://schemas.microsoft.com/office/word/2010/wordprocessingCanvas" xmlns:cx="http://schemas.microsoft.com/office/drawing/2014/chartex" xmlns:cx1="http://schemas.microsoft.com/office/drawing/2015/9/8/chartex" xmlns:cx2="http://schemas.microsoft.com/office/drawing/2015/10/21/chartex" xmlns:cx3="http://schemas.microsoft.com/office/drawing/2016/5/9/chartex" xmlns:cx4="http://schemas.microsoft.com/office/drawing/2016/5/10/chartex" xmlns:cx5="http://schemas.microsoft.com/office/drawing/2016/5/11/chartex" xmlns:cx6="http://schemas.microsoft.com/office/drawing/2016/5/12/chartex" xmlns:cx7="http://schemas.microsoft.com/office/drawing/2016/5/13/chartex" xmlns:cx8="http://schemas.microsoft.com/office/drawing/2016/5/14/chartex" xmlns:mc="http://schemas.openxmlformats.org/markup-compatibility/2006" xmlns:aink="http://schemas.microsoft.com/office/drawing/2016/ink" xmlns:am3d="http://schemas.microsoft.com/office/drawing/2017/model3d" xmlns:o="urn:schemas-microsoft-com:office:office" xmlns:oel="http://schemas.microsoft.com/office/2019/extlst" xmlns:r="http://schemas.openxmlformats.org/officeDocument/2006/relationships" xmlns:m="http://schemas.openxmlformats.org/officeDocument/2006/math" xmlns:v="urn:schemas-microsoft-com:vml" xmlns:wp14="http://schemas.microsoft.com/office/word/2010/wordprocessingDrawing" xmlns:wp="http://schemas.openxmlformats.org/drawingml/2006/wordprocessingDrawing" xmlns:w10="urn:schemas-microsoft-com:office:word" xmlns:w="http://schemas.openxmlformats.org/wordprocessingml/2006/main" xmlns:w14="http://schemas.microsoft.com/office/word/2010/wordml" xmlns:w15="http://schemas.microsoft.com/office/word/2012/wordml" xmlns:w16cex="http://schemas.microsoft.com/office/word/2018/wordml/cex" xmlns:w16cid="http://schemas.microsoft.com/office/word/2016/wordml/cid" xmlns:w16="http://schemas.microsoft.com/office/word/2018/wordml" xmlns:w16du="http://schemas.microsoft.com/office/word/2023/wordml/word16du" xmlns:w16sdtdh="http://schemas.microsoft.com/office/word/2020/wordml/sdtdatahash" xmlns:w16sdtfl="http://schemas.microsoft.com/office/word/2024/wordml/sdtformatlock" xmlns:w16se="http://schemas.microsoft.com/office/word/2015/wordml/symex" xmlns:wpg="http://schemas.microsoft.com/office/word/2010/wordprocessingGroup" xmlns:wpi="http://schemas.microsoft.com/office/word/2010/wordprocessingInk" xmlns:wne="http://schemas.microsoft.com/office/word/2006/wordml" xmlns:wps="http://schemas.microsoft.com/office/word/2010/wordprocessingShape" mc:Ignorable="w14 w15 w16se w16cid w16 w16cex w16sdtdh w16sdtfl w16du wp14">
+  <w:abstractNum w:abstractNumId="0" w15:restartNumberingAfterBreak="0">
+    <w:nsid w:val="09D26CD4"/>
+    <w:multiLevelType w:val="hybridMultilevel"/>
+    <w:tmpl w:val="62AE327E"/>
+    <w:lvl w:ilvl="0" w:tplc="FCD29F44">
+      <w:numFmt w:val="bullet"/>
+      <w:lvlText w:val="-"/>
+      <w:lvlJc w:val="left"/>
+      <w:pPr>
+        <w:ind w:left="720" w:hanging="360"/>
+      </w:pPr>
+      <w:rPr>
+        <w:rFonts w:ascii="Calibri" w:eastAsiaTheme="minorHAnsi" w:hAnsi="Calibri" w:cs="Calibri" w:hint="default"/>
+      </w:rPr>
+    </w:lvl>
+    <w:lvl w:ilvl="1" w:tplc="0C0A0003" w:tentative="1">
+      <w:start w:val="1"/>
+      <w:numFmt w:val="bullet"/>
+      <w:lvlText w:val="o"/>
+      <w:lvlJc w:val="left"/>
+      <w:pPr>
+        <w:ind w:left="1440" w:hanging="360"/>
+      </w:pPr>
+      <w:rPr>
+        <w:rFonts w:ascii="Courier New" w:hAnsi="Courier New" w:cs="Courier New" w:hint="default"/>
+      </w:rPr>
+    </w:lvl>
+    <w:lvl w:ilvl="2" w:tplc="0C0A0005" w:tentative="1">
+      <w:start w:val="1"/>
+      <w:numFmt w:val="bullet"/>
+      <w:lvlText w:val=""/>
+      <w:lvlJc w:val="left"/>
+      <w:pPr>
+        <w:ind w:left="2160" w:hanging="360"/>
+      </w:pPr>
+      <w:rPr>
+        <w:rFonts w:ascii="Wingdings" w:hAnsi="Wingdings" w:hint="default"/>
+      </w:rPr>
+    </w:lvl>
+    <w:lvl w:ilvl="3" w:tplc="0C0A0001" w:tentative="1">
+      <w:start w:val="1"/>
+      <w:numFmt w:val="bullet"/>
+      <w:lvlText w:val=""/>
+      <w:lvlJc w:val="left"/>
+      <w:pPr>
+        <w:ind w:left="2880" w:hanging="360"/>
+      </w:pPr>
+      <w:rPr>
+        <w:rFonts w:ascii="Symbol" w:hAnsi="Symbol" w:hint="default"/>
+      </w:rPr>
+    </w:lvl>
+    <w:lvl w:ilvl="4" w:tplc="0C0A0003" w:tentative="1">
+      <w:start w:val="1"/>
+      <w:numFmt w:val="bullet"/>
+      <w:lvlText w:val="o"/>
+      <w:lvlJc w:val="left"/>
+      <w:pPr>
+        <w:ind w:left="3600" w:hanging="360"/>
+      </w:pPr>
+      <w:rPr>
+        <w:rFonts w:ascii="Courier New" w:hAnsi="Courier New" w:cs="Courier New" w:hint="default"/>
+      </w:rPr>
+    </w:lvl>
+    <w:lvl w:ilvl="5" w:tplc="0C0A0005" w:tentative="1">
+      <w:start w:val="1"/>
+      <w:numFmt w:val="bullet"/>
+      <w:lvlText w:val=""/>
+      <w:lvlJc w:val="left"/>
+      <w:pPr>
+        <w:ind w:left="4320" w:hanging="360"/>
+      </w:pPr>
+      <w:rPr>
+        <w:rFonts w:ascii="Wingdings" w:hAnsi="Wingdings" w:hint="default"/>
+      </w:rPr>
+    </w:lvl>
+    <w:lvl w:ilvl="6" w:tplc="0C0A0001" w:tentative="1">
+      <w:start w:val="1"/>
+      <w:numFmt w:val="bullet"/>
+      <w:lvlText w:val=""/>
+      <w:lvlJc w:val="left"/>
+      <w:pPr>
+        <w:ind w:left="5040" w:hanging="360"/>
+      </w:pPr>
+      <w:rPr>
+        <w:rFonts w:ascii="Symbol" w:hAnsi="Symbol" w:hint="default"/>
+      </w:rPr>
+    </w:lvl>
+    <w:lvl w:ilvl="7" w:tplc="0C0A0003" w:tentative="1">
+      <w:start w:val="1"/>
+      <w:numFmt w:val="bullet"/>
+      <w:lvlText w:val="o"/>
+      <w:lvlJc w:val="left"/>
+      <w:pPr>
+        <w:ind w:left="5760" w:hanging="360"/>
+      </w:pPr>
+      <w:rPr>
+        <w:rFonts w:ascii="Courier New" w:hAnsi="Courier New" w:cs="Courier New" w:hint="default"/>
+      </w:rPr>
+    </w:lvl>
+    <w:lvl w:ilvl="8" w:tplc="0C0A0005" w:tentative="1">
+      <w:start w:val="1"/>
+      <w:numFmt w:val="bullet"/>
+      <w:lvlText w:val=""/>
+      <w:lvlJc w:val="left"/>
+      <w:pPr>
+        <w:ind w:left="6480" w:hanging="360"/>
+      </w:pPr>
+      <w:rPr>
+        <w:rFonts w:ascii="Wingdings" w:hAnsi="Wingdings" w:hint="default"/>
+      </w:rPr>
+    </w:lvl>
+  </w:abstractNum>
+  <w:abstractNum w:abstractNumId="1" w15:restartNumberingAfterBreak="0">
+    <w:nsid w:val="0C5C4D06"/>
+    <w:multiLevelType w:val="hybridMultilevel"/>
+    <w:tmpl w:val="1E3E8522"/>
+    <w:lvl w:ilvl="0" w:tplc="A7225B2C">
+      <w:numFmt w:val="bullet"/>
+      <w:lvlText w:val="-"/>
+      <w:lvlJc w:val="left"/>
+      <w:pPr>
+        <w:ind w:left="720" w:hanging="360"/>
+      </w:pPr>
+      <w:rPr>
+        <w:rFonts w:ascii="Calibri" w:eastAsiaTheme="minorHAnsi" w:hAnsi="Calibri" w:cs="Calibri" w:hint="default"/>
+      </w:rPr>
+    </w:lvl>
+    <w:lvl w:ilvl="1" w:tplc="0C0A0003">
+      <w:start w:val="1"/>
+      <w:numFmt w:val="bullet"/>
+      <w:lvlText w:val="o"/>
+      <w:lvlJc w:val="left"/>
+      <w:pPr>
+        <w:ind w:left="1440" w:hanging="360"/>
+      </w:pPr>
+      <w:rPr>
+        <w:rFonts w:ascii="Courier New" w:hAnsi="Courier New" w:cs="Courier New" w:hint="default"/>
+      </w:rPr>
+    </w:lvl>
+    <w:lvl w:ilvl="2" w:tplc="0C0A0005" w:tentative="1">
+      <w:start w:val="1"/>
+      <w:numFmt w:val="bullet"/>
+      <w:lvlText w:val=""/>
+      <w:lvlJc w:val="left"/>
+      <w:pPr>
+        <w:ind w:left="2160" w:hanging="360"/>
+      </w:pPr>
+      <w:rPr>
+        <w:rFonts w:ascii="Wingdings" w:hAnsi="Wingdings" w:hint="default"/>
+      </w:rPr>
+    </w:lvl>
+    <w:lvl w:ilvl="3" w:tplc="0C0A0001" w:tentative="1">
+      <w:start w:val="1"/>
+      <w:numFmt w:val="bullet"/>
+      <w:lvlText w:val=""/>
+      <w:lvlJc w:val="left"/>
+      <w:pPr>
+        <w:ind w:left="2880" w:hanging="360"/>
+      </w:pPr>
+      <w:rPr>
+        <w:rFonts w:ascii="Symbol" w:hAnsi="Symbol" w:hint="default"/>
+      </w:rPr>
+    </w:lvl>
+    <w:lvl w:ilvl="4" w:tplc="0C0A0003" w:tentative="1">
+      <w:start w:val="1"/>
+      <w:numFmt w:val="bullet"/>
+      <w:lvlText w:val="o"/>
+      <w:lvlJc w:val="left"/>
+      <w:pPr>
+        <w:ind w:left="3600" w:hanging="360"/>
+      </w:pPr>
+      <w:rPr>
+        <w:rFonts w:ascii="Courier New" w:hAnsi="Courier New" w:cs="Courier New" w:hint="default"/>
+      </w:rPr>
+    </w:lvl>
+    <w:lvl w:ilvl="5" w:tplc="0C0A0005" w:tentative="1">
+      <w:start w:val="1"/>
+      <w:numFmt w:val="bullet"/>
+      <w:lvlText w:val=""/>
+      <w:lvlJc w:val="left"/>
+      <w:pPr>
+        <w:ind w:left="4320" w:hanging="360"/>
+      </w:pPr>
+      <w:rPr>
+        <w:rFonts w:ascii="Wingdings" w:hAnsi="Wingdings" w:hint="default"/>
+      </w:rPr>
+    </w:lvl>
+    <w:lvl w:ilvl="6" w:tplc="0C0A0001" w:tentative="1">
+      <w:start w:val="1"/>
+      <w:numFmt w:val="bullet"/>
+      <w:lvlText w:val=""/>
+      <w:lvlJc w:val="left"/>
+      <w:pPr>
+        <w:ind w:left="5040" w:hanging="360"/>
+      </w:pPr>
+      <w:rPr>
+        <w:rFonts w:ascii="Symbol" w:hAnsi="Symbol" w:hint="default"/>
+      </w:rPr>
+    </w:lvl>
+    <w:lvl w:ilvl="7" w:tplc="0C0A0003" w:tentative="1">
+      <w:start w:val="1"/>
+      <w:numFmt w:val="bullet"/>
+      <w:lvlText w:val="o"/>
+      <w:lvlJc w:val="left"/>
+      <w:pPr>
+        <w:ind w:left="5760" w:hanging="360"/>
+      </w:pPr>
+      <w:rPr>
+        <w:rFonts w:ascii="Courier New" w:hAnsi="Courier New" w:cs="Courier New" w:hint="default"/>
+      </w:rPr>
+    </w:lvl>
+    <w:lvl w:ilvl="8" w:tplc="0C0A0005" w:tentative="1">
+      <w:start w:val="1"/>
+      <w:numFmt w:val="bullet"/>
+      <w:lvlText w:val=""/>
+      <w:lvlJc w:val="left"/>
+      <w:pPr>
+        <w:ind w:left="6480" w:hanging="360"/>
+      </w:pPr>
+      <w:rPr>
+        <w:rFonts w:ascii="Wingdings" w:hAnsi="Wingdings" w:hint="default"/>
+      </w:rPr>
+    </w:lvl>
+  </w:abstractNum>
+  <w:num w:numId="1" w16cid:durableId="508104013">
+    <w:abstractNumId w:val="0"/>
+  </w:num>
+  <w:num w:numId="2" w16cid:durableId="1537544127">
+    <w:abstractNumId w:val="1"/>
+  </w:num>
+</w:numbering>
 </file>
 
 <file path=word/styles.xml><?xml version="1.0" encoding="utf-8"?>

</xml_diff>

<commit_message>
Web 2.0 actualizada: Los eventos son leidos de un archivo json automáticamente
</commit_message>
<xml_diff>
--- a/documentacion/Informe.docx
+++ b/documentacion/Informe.docx
@@ -58,7 +58,13 @@
     </w:p>
     <w:p>
       <w:r>
-        <w:t>Eventos que forman el proyecto:</w:t>
+        <w:t xml:space="preserve">Eventos que forman </w:t>
+      </w:r>
+      <w:r>
+        <w:t>la web</w:t>
+      </w:r>
+      <w:r>
+        <w:t>:</w:t>
       </w:r>
     </w:p>
     <w:p>
@@ -464,14 +470,40 @@
         </w:drawing>
       </w:r>
     </w:p>
-    <w:p>
+    <w:p/>
+    <w:p>
+      <w:r>
+        <w:t>Para hacer el input para buscar eventos, consulté la siguiente página:</w:t>
+      </w:r>
+    </w:p>
+    <w:p>
+      <w:hyperlink r:id="rId6" w:history="1">
+        <w:r>
+          <w:rPr>
+            <w:rStyle w:val="Hipervnculo"/>
+          </w:rPr>
+          <w:t>HTML inp</w:t>
+        </w:r>
+        <w:r>
+          <w:rPr>
+            <w:rStyle w:val="Hipervnculo"/>
+          </w:rPr>
+          <w:t>u</w:t>
+        </w:r>
+        <w:r>
+          <w:rPr>
+            <w:rStyle w:val="Hipervnculo"/>
+          </w:rPr>
+          <w:t>t tag</w:t>
+        </w:r>
+      </w:hyperlink>
       <w:r>
         <w:br w:type="page"/>
       </w:r>
     </w:p>
-    <w:p>
-      <w:r>
-        <w:lastRenderedPageBreak/>
+    <w:p/>
+    <w:p>
+      <w:r>
         <w:t>BASES:</w:t>
       </w:r>
     </w:p>
@@ -501,7 +533,7 @@
                     <pic:cNvPicPr/>
                   </pic:nvPicPr>
                   <pic:blipFill>
-                    <a:blip r:embed="rId6"/>
+                    <a:blip r:embed="rId7"/>
                     <a:stretch>
                       <a:fillRect/>
                     </a:stretch>
@@ -569,7 +601,7 @@
                     <pic:cNvPicPr/>
                   </pic:nvPicPr>
                   <pic:blipFill>
-                    <a:blip r:embed="rId7"/>
+                    <a:blip r:embed="rId8"/>
                     <a:stretch>
                       <a:fillRect/>
                     </a:stretch>
@@ -623,7 +655,7 @@
                     <pic:cNvPicPr/>
                   </pic:nvPicPr>
                   <pic:blipFill>
-                    <a:blip r:embed="rId8"/>
+                    <a:blip r:embed="rId9"/>
                     <a:stretch>
                       <a:fillRect/>
                     </a:stretch>
@@ -685,7 +717,7 @@
                     <pic:cNvPicPr/>
                   </pic:nvPicPr>
                   <pic:blipFill>
-                    <a:blip r:embed="rId9"/>
+                    <a:blip r:embed="rId10"/>
                     <a:stretch>
                       <a:fillRect/>
                     </a:stretch>
@@ -732,7 +764,7 @@
                     <pic:cNvPicPr/>
                   </pic:nvPicPr>
                   <pic:blipFill>
-                    <a:blip r:embed="rId10"/>
+                    <a:blip r:embed="rId11"/>
                     <a:stretch>
                       <a:fillRect/>
                     </a:stretch>
@@ -771,7 +803,7 @@
       <w:r>
         <w:t xml:space="preserve"> que explicaba cómo hacerlo (</w:t>
       </w:r>
-      <w:hyperlink r:id="rId11" w:history="1">
+      <w:hyperlink r:id="rId12" w:history="1">
         <w:r>
           <w:rPr>
             <w:rStyle w:val="Hipervnculo"/>
@@ -804,7 +836,7 @@
                     <pic:cNvPicPr/>
                   </pic:nvPicPr>
                   <pic:blipFill>
-                    <a:blip r:embed="rId12"/>
+                    <a:blip r:embed="rId13"/>
                     <a:stretch>
                       <a:fillRect/>
                     </a:stretch>
@@ -1673,7 +1705,6 @@
   <w:style w:type="character" w:default="1" w:styleId="Fuentedeprrafopredeter">
     <w:name w:val="Default Paragraph Font"/>
     <w:uiPriority w:val="1"/>
-    <w:semiHidden/>
     <w:unhideWhenUsed/>
   </w:style>
   <w:style w:type="table" w:default="1" w:styleId="Tablanormal">
@@ -2008,6 +2039,18 @@
     <w:rPr>
       <w:color w:val="605E5C"/>
       <w:shd w:val="clear" w:color="auto" w:fill="E1DFDD"/>
+    </w:rPr>
+  </w:style>
+  <w:style w:type="character" w:styleId="Hipervnculovisitado">
+    <w:name w:val="FollowedHyperlink"/>
+    <w:basedOn w:val="Fuentedeprrafopredeter"/>
+    <w:uiPriority w:val="99"/>
+    <w:semiHidden/>
+    <w:unhideWhenUsed/>
+    <w:rsid w:val="00DE383A"/>
+    <w:rPr>
+      <w:color w:val="954F72" w:themeColor="followedHyperlink"/>
+      <w:u w:val="single"/>
     </w:rPr>
   </w:style>
 </w:styles>

</xml_diff>

<commit_message>
Informe avanzado Proyecto de java mejorado Web mejorada
</commit_message>
<xml_diff>
--- a/documentacion/Informe.docx
+++ b/documentacion/Informe.docx
@@ -157,37 +157,12 @@
           <w:szCs w:val="24"/>
         </w:rPr>
       </w:pPr>
-      <w:proofErr w:type="spellStart"/>
-      <w:r>
-        <w:rPr>
-          <w:sz w:val="24"/>
-          <w:szCs w:val="24"/>
-        </w:rPr>
-        <w:t>Obicación</w:t>
-      </w:r>
-      <w:proofErr w:type="spellEnd"/>
-      <w:r>
-        <w:rPr>
-          <w:sz w:val="24"/>
-          <w:szCs w:val="24"/>
-        </w:rPr>
-        <w:t xml:space="preserve">: Estadio el </w:t>
-      </w:r>
-      <w:proofErr w:type="spellStart"/>
-      <w:r>
-        <w:rPr>
-          <w:sz w:val="24"/>
-          <w:szCs w:val="24"/>
-        </w:rPr>
-        <w:t>Molinón</w:t>
-      </w:r>
-      <w:proofErr w:type="spellEnd"/>
-      <w:r>
-        <w:rPr>
-          <w:sz w:val="24"/>
-          <w:szCs w:val="24"/>
-        </w:rPr>
-        <w:t>, Gijón</w:t>
+      <w:r>
+        <w:rPr>
+          <w:sz w:val="24"/>
+          <w:szCs w:val="24"/>
+        </w:rPr>
+        <w:t>Obicación: Estadio el Molinón, Gijón</w:t>
       </w:r>
     </w:p>
     <w:p>
@@ -262,21 +237,12 @@
           <w:szCs w:val="24"/>
         </w:rPr>
       </w:pPr>
-      <w:proofErr w:type="spellStart"/>
-      <w:r>
-        <w:rPr>
-          <w:sz w:val="24"/>
-          <w:szCs w:val="24"/>
-        </w:rPr>
-        <w:t>Boombastic</w:t>
-      </w:r>
-      <w:proofErr w:type="spellEnd"/>
-      <w:r>
-        <w:rPr>
-          <w:sz w:val="24"/>
-          <w:szCs w:val="24"/>
-        </w:rPr>
-        <w:t xml:space="preserve"> Asturias 2026</w:t>
+      <w:r>
+        <w:rPr>
+          <w:sz w:val="24"/>
+          <w:szCs w:val="24"/>
+        </w:rPr>
+        <w:t>Boombastic Asturias 2026</w:t>
       </w:r>
     </w:p>
     <w:p>
@@ -643,88 +609,82 @@
     </w:p>
     <w:p>
       <w:pPr>
-        <w:rPr>
-          <w:sz w:val="24"/>
-          <w:szCs w:val="24"/>
-        </w:rPr>
-      </w:pPr>
-      <w:r>
-        <w:rPr>
-          <w:sz w:val="24"/>
-          <w:szCs w:val="24"/>
+        <w:jc w:val="center"/>
+        <w:rPr>
+          <w:b/>
+          <w:bCs/>
+          <w:sz w:val="40"/>
+          <w:szCs w:val="40"/>
+        </w:rPr>
+      </w:pPr>
+      <w:r>
+        <w:rPr>
+          <w:b/>
+          <w:bCs/>
+          <w:sz w:val="40"/>
+          <w:szCs w:val="40"/>
         </w:rPr>
         <w:lastRenderedPageBreak/>
-        <w:t>DÍA 1 (23/3/2026)</w:t>
-      </w:r>
-      <w:r>
-        <w:rPr>
-          <w:sz w:val="24"/>
-          <w:szCs w:val="24"/>
-        </w:rPr>
-        <w:t>:</w:t>
-      </w:r>
-    </w:p>
-    <w:p>
-      <w:pPr>
-        <w:rPr>
-          <w:sz w:val="24"/>
-          <w:szCs w:val="24"/>
-        </w:rPr>
-      </w:pPr>
-      <w:r>
-        <w:rPr>
-          <w:sz w:val="24"/>
-          <w:szCs w:val="24"/>
-        </w:rPr>
-        <w:t xml:space="preserve">Empecé diseñando la web con </w:t>
-      </w:r>
-      <w:proofErr w:type="spellStart"/>
-      <w:r>
-        <w:rPr>
-          <w:sz w:val="24"/>
-          <w:szCs w:val="24"/>
-        </w:rPr>
-        <w:t>Figma</w:t>
-      </w:r>
-      <w:proofErr w:type="spellEnd"/>
-      <w:r>
-        <w:rPr>
-          <w:sz w:val="24"/>
-          <w:szCs w:val="24"/>
-        </w:rPr>
-        <w:t>. Para el índice, hice 3 bocetos (</w:t>
-      </w:r>
-      <w:proofErr w:type="spellStart"/>
-      <w:r>
-        <w:rPr>
-          <w:sz w:val="24"/>
-          <w:szCs w:val="24"/>
-        </w:rPr>
-        <w:t>wireframe</w:t>
-      </w:r>
-      <w:proofErr w:type="spellEnd"/>
-      <w:r>
-        <w:rPr>
-          <w:sz w:val="24"/>
-          <w:szCs w:val="24"/>
-        </w:rPr>
-        <w:t xml:space="preserve">, esquema y </w:t>
-      </w:r>
-      <w:proofErr w:type="spellStart"/>
-      <w:r>
-        <w:rPr>
-          <w:sz w:val="24"/>
-          <w:szCs w:val="24"/>
-        </w:rPr>
-        <w:t>mock</w:t>
-      </w:r>
-      <w:proofErr w:type="spellEnd"/>
-      <w:r>
-        <w:rPr>
-          <w:sz w:val="24"/>
-          <w:szCs w:val="24"/>
-        </w:rPr>
-        <w:t xml:space="preserve">-up). </w:t>
+        <w:t>LENGUAJE DE MARCAS:</w:t>
+      </w:r>
+    </w:p>
+    <w:p>
+      <w:pPr>
+        <w:rPr>
+          <w:b/>
+          <w:bCs/>
+          <w:sz w:val="40"/>
+          <w:szCs w:val="40"/>
+        </w:rPr>
+      </w:pPr>
+      <w:r>
+        <w:rPr>
+          <w:b/>
+          <w:bCs/>
+          <w:sz w:val="40"/>
+          <w:szCs w:val="40"/>
+        </w:rPr>
+        <w:br w:type="page"/>
+      </w:r>
+    </w:p>
+    <w:p>
+      <w:pPr>
+        <w:jc w:val="center"/>
+        <w:rPr>
+          <w:b/>
+          <w:bCs/>
+          <w:sz w:val="40"/>
+          <w:szCs w:val="40"/>
+        </w:rPr>
+      </w:pPr>
+      <w:r>
+        <w:rPr>
+          <w:b/>
+          <w:bCs/>
+          <w:sz w:val="40"/>
+          <w:szCs w:val="40"/>
+        </w:rPr>
+        <w:lastRenderedPageBreak/>
+        <w:t>BASES DE DATOS</w:t>
+      </w:r>
+    </w:p>
+    <w:p>
+      <w:pPr>
+        <w:rPr>
+          <w:b/>
+          <w:bCs/>
+          <w:sz w:val="28"/>
+          <w:szCs w:val="28"/>
+        </w:rPr>
+      </w:pPr>
+      <w:r>
+        <w:rPr>
+          <w:b/>
+          <w:bCs/>
+          <w:sz w:val="28"/>
+          <w:szCs w:val="28"/>
+        </w:rPr>
+        <w:t>Esquema entidad-relación:</w:t>
       </w:r>
     </w:p>
     <w:p>
@@ -737,14 +697,12 @@
       <w:r>
         <w:rPr>
           <w:noProof/>
-          <w:sz w:val="24"/>
-          <w:szCs w:val="24"/>
         </w:rPr>
         <w:drawing>
-          <wp:inline distT="0" distB="0" distL="0" distR="0" wp14:anchorId="06DC628C" wp14:editId="04C20FA8">
-            <wp:extent cx="5400040" cy="2505710"/>
-            <wp:effectExtent l="0" t="0" r="0" b="8890"/>
-            <wp:docPr id="800713091" name="Imagen 1"/>
+          <wp:inline distT="0" distB="0" distL="0" distR="0" wp14:anchorId="4E855D64" wp14:editId="6D5CB040">
+            <wp:extent cx="5400040" cy="4208780"/>
+            <wp:effectExtent l="0" t="0" r="0" b="1270"/>
+            <wp:docPr id="440304045" name="Imagen 1"/>
             <wp:cNvGraphicFramePr>
               <a:graphicFrameLocks xmlns:a="http://schemas.openxmlformats.org/drawingml/2006/main" noChangeAspect="1"/>
             </wp:cNvGraphicFramePr>
@@ -752,7 +710,7 @@
               <a:graphicData uri="http://schemas.openxmlformats.org/drawingml/2006/picture">
                 <pic:pic xmlns:pic="http://schemas.openxmlformats.org/drawingml/2006/picture">
                   <pic:nvPicPr>
-                    <pic:cNvPr id="800713091" name=""/>
+                    <pic:cNvPr id="440304045" name=""/>
                     <pic:cNvPicPr/>
                   </pic:nvPicPr>
                   <pic:blipFill>
@@ -764,7 +722,7 @@
                   <pic:spPr>
                     <a:xfrm>
                       <a:off x="0" y="0"/>
-                      <a:ext cx="5400040" cy="2505710"/>
+                      <a:ext cx="5400040" cy="4208780"/>
                     </a:xfrm>
                     <a:prstGeom prst="rect">
                       <a:avLst/>
@@ -776,101 +734,186 @@
           </wp:inline>
         </w:drawing>
       </w:r>
-      <w:r>
-        <w:rPr>
-          <w:sz w:val="24"/>
-          <w:szCs w:val="24"/>
-        </w:rPr>
-        <w:br w:type="page"/>
-      </w:r>
-    </w:p>
-    <w:p>
-      <w:pPr>
-        <w:rPr>
-          <w:sz w:val="24"/>
-          <w:szCs w:val="24"/>
-        </w:rPr>
-      </w:pPr>
-      <w:r>
-        <w:rPr>
-          <w:sz w:val="24"/>
-          <w:szCs w:val="24"/>
+    </w:p>
+    <w:p>
+      <w:pPr>
+        <w:rPr>
+          <w:sz w:val="24"/>
+          <w:szCs w:val="24"/>
+        </w:rPr>
+      </w:pPr>
+    </w:p>
+    <w:p>
+      <w:pPr>
+        <w:rPr>
+          <w:sz w:val="24"/>
+          <w:szCs w:val="24"/>
+        </w:rPr>
+      </w:pPr>
+    </w:p>
+    <w:p>
+      <w:pPr>
+        <w:rPr>
+          <w:sz w:val="24"/>
+          <w:szCs w:val="24"/>
+        </w:rPr>
+      </w:pPr>
+      <w:r>
+        <w:rPr>
+          <w:b/>
+          <w:bCs/>
+          <w:sz w:val="28"/>
+          <w:szCs w:val="28"/>
+        </w:rPr>
+        <w:t>TABLAS</w:t>
+      </w:r>
+    </w:p>
+    <w:p>
+      <w:pPr>
+        <w:rPr>
+          <w:b/>
+          <w:bCs/>
+          <w:sz w:val="24"/>
+          <w:szCs w:val="24"/>
+        </w:rPr>
+      </w:pPr>
+      <w:r>
+        <w:rPr>
+          <w:b/>
+          <w:bCs/>
+          <w:sz w:val="24"/>
+          <w:szCs w:val="24"/>
+        </w:rPr>
+        <w:t>Tabla usuario:</w:t>
+      </w:r>
+    </w:p>
+    <w:p>
+      <w:pPr>
+        <w:rPr>
+          <w:sz w:val="24"/>
+          <w:szCs w:val="24"/>
+        </w:rPr>
+      </w:pPr>
+      <w:r>
+        <w:rPr>
+          <w:sz w:val="24"/>
+          <w:szCs w:val="24"/>
+        </w:rPr>
+        <w:t>Contiene:</w:t>
+      </w:r>
+    </w:p>
+    <w:p>
+      <w:pPr>
+        <w:pStyle w:val="Prrafodelista"/>
+        <w:numPr>
+          <w:ilvl w:val="0"/>
+          <w:numId w:val="2"/>
+        </w:numPr>
+        <w:rPr>
+          <w:sz w:val="24"/>
+          <w:szCs w:val="24"/>
+        </w:rPr>
+      </w:pPr>
+      <w:r>
+        <w:rPr>
+          <w:sz w:val="24"/>
+          <w:szCs w:val="24"/>
+        </w:rPr>
+        <w:t>ID del usuario</w:t>
+      </w:r>
+    </w:p>
+    <w:p>
+      <w:pPr>
+        <w:pStyle w:val="Prrafodelista"/>
+        <w:numPr>
+          <w:ilvl w:val="0"/>
+          <w:numId w:val="2"/>
+        </w:numPr>
+        <w:rPr>
+          <w:sz w:val="24"/>
+          <w:szCs w:val="24"/>
+        </w:rPr>
+      </w:pPr>
+      <w:r>
+        <w:rPr>
+          <w:sz w:val="24"/>
+          <w:szCs w:val="24"/>
+        </w:rPr>
+        <w:t>Nombre del usuario</w:t>
+      </w:r>
+    </w:p>
+    <w:p>
+      <w:pPr>
+        <w:pStyle w:val="Prrafodelista"/>
+        <w:numPr>
+          <w:ilvl w:val="0"/>
+          <w:numId w:val="2"/>
+        </w:numPr>
+        <w:rPr>
+          <w:sz w:val="24"/>
+          <w:szCs w:val="24"/>
+        </w:rPr>
+      </w:pPr>
+      <w:r>
+        <w:rPr>
+          <w:sz w:val="24"/>
+          <w:szCs w:val="24"/>
+        </w:rPr>
+        <w:t>Email del usuario</w:t>
+      </w:r>
+    </w:p>
+    <w:p>
+      <w:pPr>
+        <w:pStyle w:val="Prrafodelista"/>
+        <w:numPr>
+          <w:ilvl w:val="0"/>
+          <w:numId w:val="2"/>
+        </w:numPr>
+        <w:rPr>
+          <w:sz w:val="24"/>
+          <w:szCs w:val="24"/>
+        </w:rPr>
+      </w:pPr>
+      <w:r>
+        <w:rPr>
+          <w:sz w:val="24"/>
+          <w:szCs w:val="24"/>
+        </w:rPr>
+        <w:t>Contraseña del usuario</w:t>
+      </w:r>
+    </w:p>
+    <w:p>
+      <w:pPr>
+        <w:rPr>
+          <w:sz w:val="24"/>
+          <w:szCs w:val="24"/>
+        </w:rPr>
+      </w:pPr>
+      <w:r>
+        <w:rPr>
+          <w:sz w:val="24"/>
+          <w:szCs w:val="24"/>
+        </w:rPr>
+        <w:t>Su clave principal es el ID de usuario</w:t>
+      </w:r>
+    </w:p>
+    <w:p>
+      <w:pPr>
+        <w:rPr>
+          <w:sz w:val="24"/>
+          <w:szCs w:val="24"/>
+        </w:rPr>
+      </w:pPr>
+      <w:r>
+        <w:rPr>
+          <w:noProof/>
         </w:rPr>
         <w:lastRenderedPageBreak/>
-        <w:t>DÍA 2 (24/3/2026)</w:t>
-      </w:r>
-      <w:r>
-        <w:rPr>
-          <w:sz w:val="24"/>
-          <w:szCs w:val="24"/>
-        </w:rPr>
-        <w:t>:</w:t>
-      </w:r>
-    </w:p>
-    <w:p>
-      <w:pPr>
-        <w:rPr>
-          <w:sz w:val="24"/>
-          <w:szCs w:val="24"/>
-        </w:rPr>
-      </w:pPr>
-      <w:r>
-        <w:rPr>
-          <w:sz w:val="24"/>
-          <w:szCs w:val="24"/>
-        </w:rPr>
-        <w:t>Clase App (</w:t>
-      </w:r>
-      <w:proofErr w:type="spellStart"/>
-      <w:r>
-        <w:rPr>
-          <w:sz w:val="24"/>
-          <w:szCs w:val="24"/>
-        </w:rPr>
-        <w:t>main</w:t>
-      </w:r>
-      <w:proofErr w:type="spellEnd"/>
-      <w:r>
-        <w:rPr>
-          <w:sz w:val="24"/>
-          <w:szCs w:val="24"/>
-        </w:rPr>
-        <w:t>):</w:t>
-      </w:r>
-    </w:p>
-    <w:p>
-      <w:pPr>
-        <w:rPr>
-          <w:sz w:val="24"/>
-          <w:szCs w:val="24"/>
-        </w:rPr>
-      </w:pPr>
-      <w:r>
-        <w:rPr>
-          <w:sz w:val="24"/>
-          <w:szCs w:val="24"/>
-        </w:rPr>
-        <w:t>Hice que el programa diga las opciones disponibles para el menú</w:t>
-      </w:r>
-    </w:p>
-    <w:p>
-      <w:pPr>
-        <w:rPr>
-          <w:sz w:val="24"/>
-          <w:szCs w:val="24"/>
-        </w:rPr>
-      </w:pPr>
-      <w:r>
-        <w:rPr>
-          <w:noProof/>
-          <w:sz w:val="24"/>
-          <w:szCs w:val="24"/>
-        </w:rPr>
         <w:drawing>
-          <wp:inline distT="0" distB="0" distL="0" distR="0" wp14:anchorId="3F7A7E8B" wp14:editId="25EFC4C0">
-            <wp:extent cx="3514786" cy="2758440"/>
-            <wp:effectExtent l="0" t="0" r="9525" b="3810"/>
-            <wp:docPr id="709837823" name="Imagen 1"/>
+          <wp:inline distT="0" distB="0" distL="0" distR="0" wp14:anchorId="214CC3E3" wp14:editId="3E186424">
+            <wp:extent cx="4335780" cy="1701885"/>
+            <wp:effectExtent l="0" t="0" r="7620" b="0"/>
+            <wp:docPr id="265983726" name="Imagen 1"/>
             <wp:cNvGraphicFramePr>
               <a:graphicFrameLocks xmlns:a="http://schemas.openxmlformats.org/drawingml/2006/main" noChangeAspect="1"/>
             </wp:cNvGraphicFramePr>
@@ -878,7 +921,7 @@
               <a:graphicData uri="http://schemas.openxmlformats.org/drawingml/2006/picture">
                 <pic:pic xmlns:pic="http://schemas.openxmlformats.org/drawingml/2006/picture">
                   <pic:nvPicPr>
-                    <pic:cNvPr id="709837823" name=""/>
+                    <pic:cNvPr id="265983726" name=""/>
                     <pic:cNvPicPr/>
                   </pic:nvPicPr>
                   <pic:blipFill>
@@ -890,7 +933,7 @@
                   <pic:spPr>
                     <a:xfrm>
                       <a:off x="0" y="0"/>
-                      <a:ext cx="3516867" cy="2760073"/>
+                      <a:ext cx="4340613" cy="1703782"/>
                     </a:xfrm>
                     <a:prstGeom prst="rect">
                       <a:avLst/>
@@ -910,26 +953,154 @@
           <w:szCs w:val="24"/>
         </w:rPr>
       </w:pPr>
-      <w:r>
-        <w:rPr>
-          <w:sz w:val="24"/>
-          <w:szCs w:val="24"/>
-        </w:rPr>
-        <w:t>Luego, la opción seleccionada pasará por un switch. Este llamará a el método responsable de realizar la opción. De momento solo creé las 5 primeras opciones</w:t>
-      </w:r>
-      <w:r>
-        <w:rPr>
-          <w:sz w:val="24"/>
-          <w:szCs w:val="24"/>
-        </w:rPr>
-        <w:t xml:space="preserve"> y la de salir</w:t>
-      </w:r>
-      <w:r>
-        <w:rPr>
-          <w:sz w:val="24"/>
-          <w:szCs w:val="24"/>
-        </w:rPr>
-        <w:t>.</w:t>
+    </w:p>
+    <w:p>
+      <w:pPr>
+        <w:rPr>
+          <w:b/>
+          <w:bCs/>
+          <w:sz w:val="24"/>
+          <w:szCs w:val="24"/>
+        </w:rPr>
+      </w:pPr>
+      <w:r>
+        <w:rPr>
+          <w:b/>
+          <w:bCs/>
+          <w:sz w:val="24"/>
+          <w:szCs w:val="24"/>
+        </w:rPr>
+        <w:t>Tabla eventos:</w:t>
+      </w:r>
+    </w:p>
+    <w:p>
+      <w:pPr>
+        <w:rPr>
+          <w:sz w:val="24"/>
+          <w:szCs w:val="24"/>
+        </w:rPr>
+      </w:pPr>
+      <w:r>
+        <w:rPr>
+          <w:sz w:val="24"/>
+          <w:szCs w:val="24"/>
+        </w:rPr>
+        <w:t>Contiene:</w:t>
+      </w:r>
+    </w:p>
+    <w:p>
+      <w:pPr>
+        <w:pStyle w:val="Prrafodelista"/>
+        <w:numPr>
+          <w:ilvl w:val="0"/>
+          <w:numId w:val="2"/>
+        </w:numPr>
+        <w:rPr>
+          <w:sz w:val="24"/>
+          <w:szCs w:val="24"/>
+        </w:rPr>
+      </w:pPr>
+      <w:r>
+        <w:rPr>
+          <w:sz w:val="24"/>
+          <w:szCs w:val="24"/>
+        </w:rPr>
+        <w:t>ID del evento</w:t>
+      </w:r>
+    </w:p>
+    <w:p>
+      <w:pPr>
+        <w:pStyle w:val="Prrafodelista"/>
+        <w:numPr>
+          <w:ilvl w:val="0"/>
+          <w:numId w:val="2"/>
+        </w:numPr>
+        <w:rPr>
+          <w:sz w:val="24"/>
+          <w:szCs w:val="24"/>
+        </w:rPr>
+      </w:pPr>
+      <w:r>
+        <w:rPr>
+          <w:sz w:val="24"/>
+          <w:szCs w:val="24"/>
+        </w:rPr>
+        <w:t>Fecha del evento</w:t>
+      </w:r>
+    </w:p>
+    <w:p>
+      <w:pPr>
+        <w:pStyle w:val="Prrafodelista"/>
+        <w:numPr>
+          <w:ilvl w:val="0"/>
+          <w:numId w:val="2"/>
+        </w:numPr>
+        <w:rPr>
+          <w:sz w:val="24"/>
+          <w:szCs w:val="24"/>
+        </w:rPr>
+      </w:pPr>
+      <w:r>
+        <w:rPr>
+          <w:sz w:val="24"/>
+          <w:szCs w:val="24"/>
+        </w:rPr>
+        <w:t>Título del evento</w:t>
+      </w:r>
+    </w:p>
+    <w:p>
+      <w:pPr>
+        <w:pStyle w:val="Prrafodelista"/>
+        <w:numPr>
+          <w:ilvl w:val="0"/>
+          <w:numId w:val="2"/>
+        </w:numPr>
+        <w:rPr>
+          <w:sz w:val="24"/>
+          <w:szCs w:val="24"/>
+        </w:rPr>
+      </w:pPr>
+      <w:r>
+        <w:rPr>
+          <w:sz w:val="24"/>
+          <w:szCs w:val="24"/>
+        </w:rPr>
+        <w:t>Ubicación del evento</w:t>
+      </w:r>
+    </w:p>
+    <w:p>
+      <w:pPr>
+        <w:pStyle w:val="Prrafodelista"/>
+        <w:numPr>
+          <w:ilvl w:val="0"/>
+          <w:numId w:val="2"/>
+        </w:numPr>
+        <w:rPr>
+          <w:sz w:val="24"/>
+          <w:szCs w:val="24"/>
+        </w:rPr>
+      </w:pPr>
+      <w:r>
+        <w:rPr>
+          <w:sz w:val="24"/>
+          <w:szCs w:val="24"/>
+        </w:rPr>
+        <w:t>Descripción del evento</w:t>
+      </w:r>
+    </w:p>
+    <w:p>
+      <w:pPr>
+        <w:rPr>
+          <w:sz w:val="24"/>
+          <w:szCs w:val="24"/>
+        </w:rPr>
+      </w:pPr>
+      <w:r>
+        <w:rPr>
+          <w:sz w:val="24"/>
+          <w:szCs w:val="24"/>
+        </w:rPr>
+        <w:t>La clave principal es de ID del evento</w:t>
       </w:r>
     </w:p>
     <w:p>
@@ -942,14 +1113,12 @@
       <w:r>
         <w:rPr>
           <w:noProof/>
-          <w:sz w:val="24"/>
-          <w:szCs w:val="24"/>
         </w:rPr>
         <w:drawing>
-          <wp:inline distT="0" distB="0" distL="0" distR="0" wp14:anchorId="12EE7F6D" wp14:editId="61B67B17">
-            <wp:extent cx="3379845" cy="3840480"/>
-            <wp:effectExtent l="0" t="0" r="0" b="7620"/>
-            <wp:docPr id="1596420707" name="Imagen 1"/>
+          <wp:inline distT="0" distB="0" distL="0" distR="0" wp14:anchorId="788F4EA5" wp14:editId="64C613AF">
+            <wp:extent cx="4632960" cy="2021200"/>
+            <wp:effectExtent l="0" t="0" r="0" b="0"/>
+            <wp:docPr id="838195695" name="Imagen 1"/>
             <wp:cNvGraphicFramePr>
               <a:graphicFrameLocks xmlns:a="http://schemas.openxmlformats.org/drawingml/2006/main" noChangeAspect="1"/>
             </wp:cNvGraphicFramePr>
@@ -957,7 +1126,7 @@
               <a:graphicData uri="http://schemas.openxmlformats.org/drawingml/2006/picture">
                 <pic:pic xmlns:pic="http://schemas.openxmlformats.org/drawingml/2006/picture">
                   <pic:nvPicPr>
-                    <pic:cNvPr id="1596420707" name=""/>
+                    <pic:cNvPr id="838195695" name=""/>
                     <pic:cNvPicPr/>
                   </pic:nvPicPr>
                   <pic:blipFill>
@@ -969,7 +1138,7 @@
                   <pic:spPr>
                     <a:xfrm>
                       <a:off x="0" y="0"/>
-                      <a:ext cx="3382324" cy="3843297"/>
+                      <a:ext cx="4639431" cy="2024023"/>
                     </a:xfrm>
                     <a:prstGeom prst="rect">
                       <a:avLst/>
@@ -994,23 +1163,147 @@
           <w:sz w:val="24"/>
           <w:szCs w:val="24"/>
         </w:rPr>
-        <w:t xml:space="preserve">Un ejemplo de los métodos que realicé es el de </w:t>
-      </w:r>
-      <w:proofErr w:type="spellStart"/>
-      <w:r>
-        <w:rPr>
-          <w:sz w:val="24"/>
-          <w:szCs w:val="24"/>
-        </w:rPr>
-        <w:t>addGaleria</w:t>
-      </w:r>
-      <w:proofErr w:type="spellEnd"/>
-      <w:r>
-        <w:rPr>
-          <w:sz w:val="24"/>
-          <w:szCs w:val="24"/>
-        </w:rPr>
-        <w:t>, el cual añade una galería a la colección de galerías de un evento seleccionado por el usuario:</w:t>
+        <w:br w:type="page"/>
+      </w:r>
+    </w:p>
+    <w:p>
+      <w:pPr>
+        <w:rPr>
+          <w:b/>
+          <w:bCs/>
+          <w:sz w:val="24"/>
+          <w:szCs w:val="24"/>
+        </w:rPr>
+      </w:pPr>
+      <w:r>
+        <w:rPr>
+          <w:b/>
+          <w:bCs/>
+          <w:sz w:val="24"/>
+          <w:szCs w:val="24"/>
+        </w:rPr>
+        <w:lastRenderedPageBreak/>
+        <w:t>Tabla galerías:</w:t>
+      </w:r>
+    </w:p>
+    <w:p>
+      <w:pPr>
+        <w:rPr>
+          <w:sz w:val="24"/>
+          <w:szCs w:val="24"/>
+        </w:rPr>
+      </w:pPr>
+      <w:r>
+        <w:rPr>
+          <w:sz w:val="24"/>
+          <w:szCs w:val="24"/>
+        </w:rPr>
+        <w:t>Contiene:</w:t>
+      </w:r>
+    </w:p>
+    <w:p>
+      <w:pPr>
+        <w:pStyle w:val="Prrafodelista"/>
+        <w:numPr>
+          <w:ilvl w:val="0"/>
+          <w:numId w:val="2"/>
+        </w:numPr>
+        <w:rPr>
+          <w:sz w:val="24"/>
+          <w:szCs w:val="24"/>
+        </w:rPr>
+      </w:pPr>
+      <w:r>
+        <w:rPr>
+          <w:sz w:val="24"/>
+          <w:szCs w:val="24"/>
+        </w:rPr>
+        <w:t>ID de la galería</w:t>
+      </w:r>
+    </w:p>
+    <w:p>
+      <w:pPr>
+        <w:pStyle w:val="Prrafodelista"/>
+        <w:numPr>
+          <w:ilvl w:val="0"/>
+          <w:numId w:val="2"/>
+        </w:numPr>
+        <w:rPr>
+          <w:sz w:val="24"/>
+          <w:szCs w:val="24"/>
+        </w:rPr>
+      </w:pPr>
+      <w:r>
+        <w:rPr>
+          <w:sz w:val="24"/>
+          <w:szCs w:val="24"/>
+        </w:rPr>
+        <w:t>Título de la galería</w:t>
+      </w:r>
+    </w:p>
+    <w:p>
+      <w:pPr>
+        <w:pStyle w:val="Prrafodelista"/>
+        <w:numPr>
+          <w:ilvl w:val="0"/>
+          <w:numId w:val="2"/>
+        </w:numPr>
+        <w:rPr>
+          <w:sz w:val="24"/>
+          <w:szCs w:val="24"/>
+        </w:rPr>
+      </w:pPr>
+      <w:r>
+        <w:rPr>
+          <w:sz w:val="24"/>
+          <w:szCs w:val="24"/>
+        </w:rPr>
+        <w:t>ID del evento</w:t>
+      </w:r>
+    </w:p>
+    <w:p>
+      <w:pPr>
+        <w:pStyle w:val="Prrafodelista"/>
+        <w:rPr>
+          <w:sz w:val="24"/>
+          <w:szCs w:val="24"/>
+        </w:rPr>
+      </w:pPr>
+    </w:p>
+    <w:p>
+      <w:pPr>
+        <w:rPr>
+          <w:sz w:val="24"/>
+          <w:szCs w:val="24"/>
+        </w:rPr>
+      </w:pPr>
+      <w:r>
+        <w:rPr>
+          <w:sz w:val="24"/>
+          <w:szCs w:val="24"/>
+        </w:rPr>
+        <w:t>La clave principal es el ID de la galería</w:t>
+      </w:r>
+      <w:r>
+        <w:rPr>
+          <w:sz w:val="24"/>
+          <w:szCs w:val="24"/>
+        </w:rPr>
+        <w:t xml:space="preserve">. Tiene como clave foránea el ID de un </w:t>
+      </w:r>
+      <w:r>
+        <w:rPr>
+          <w:sz w:val="24"/>
+          <w:szCs w:val="24"/>
+        </w:rPr>
+        <w:t>evento</w:t>
+      </w:r>
+      <w:r>
+        <w:rPr>
+          <w:sz w:val="24"/>
+          <w:szCs w:val="24"/>
+        </w:rPr>
+        <w:t>.</w:t>
       </w:r>
     </w:p>
     <w:p>
@@ -1023,15 +1316,12 @@
       <w:r>
         <w:rPr>
           <w:noProof/>
-          <w:sz w:val="24"/>
-          <w:szCs w:val="24"/>
-        </w:rPr>
-        <w:lastRenderedPageBreak/>
+        </w:rPr>
         <w:drawing>
-          <wp:inline distT="0" distB="0" distL="0" distR="0" wp14:anchorId="145FCF91" wp14:editId="5B63ACDE">
-            <wp:extent cx="5400040" cy="4801235"/>
+          <wp:inline distT="0" distB="0" distL="0" distR="0" wp14:anchorId="5059EF38" wp14:editId="63D0BDB0">
+            <wp:extent cx="5400040" cy="1447800"/>
             <wp:effectExtent l="0" t="0" r="0" b="0"/>
-            <wp:docPr id="1310199855" name="Imagen 1"/>
+            <wp:docPr id="1903986546" name="Imagen 1"/>
             <wp:cNvGraphicFramePr>
               <a:graphicFrameLocks xmlns:a="http://schemas.openxmlformats.org/drawingml/2006/main" noChangeAspect="1"/>
             </wp:cNvGraphicFramePr>
@@ -1039,7 +1329,7 @@
               <a:graphicData uri="http://schemas.openxmlformats.org/drawingml/2006/picture">
                 <pic:pic xmlns:pic="http://schemas.openxmlformats.org/drawingml/2006/picture">
                   <pic:nvPicPr>
-                    <pic:cNvPr id="1310199855" name=""/>
+                    <pic:cNvPr id="1903986546" name=""/>
                     <pic:cNvPicPr/>
                   </pic:nvPicPr>
                   <pic:blipFill>
@@ -1051,7 +1341,7 @@
                   <pic:spPr>
                     <a:xfrm>
                       <a:off x="0" y="0"/>
-                      <a:ext cx="5400040" cy="4801235"/>
+                      <a:ext cx="5400040" cy="1447800"/>
                     </a:xfrm>
                     <a:prstGeom prst="rect">
                       <a:avLst/>
@@ -1067,16 +1357,130 @@
     <w:p>
       <w:pPr>
         <w:rPr>
-          <w:sz w:val="24"/>
-          <w:szCs w:val="24"/>
-        </w:rPr>
-      </w:pPr>
-      <w:r>
-        <w:rPr>
-          <w:sz w:val="24"/>
-          <w:szCs w:val="24"/>
-        </w:rPr>
-        <w:t>Empecé por hacer una comprobación rápida para ver si existe algún evento, ya que son necesarios.</w:t>
+          <w:b/>
+          <w:bCs/>
+          <w:sz w:val="24"/>
+          <w:szCs w:val="24"/>
+        </w:rPr>
+      </w:pPr>
+      <w:r>
+        <w:rPr>
+          <w:b/>
+          <w:bCs/>
+          <w:sz w:val="24"/>
+          <w:szCs w:val="24"/>
+        </w:rPr>
+        <w:t>Tabla imágenes:</w:t>
+      </w:r>
+    </w:p>
+    <w:p>
+      <w:pPr>
+        <w:rPr>
+          <w:sz w:val="24"/>
+          <w:szCs w:val="24"/>
+        </w:rPr>
+      </w:pPr>
+      <w:r>
+        <w:rPr>
+          <w:sz w:val="24"/>
+          <w:szCs w:val="24"/>
+        </w:rPr>
+        <w:t>Contiene:</w:t>
+      </w:r>
+    </w:p>
+    <w:p>
+      <w:pPr>
+        <w:pStyle w:val="Prrafodelista"/>
+        <w:numPr>
+          <w:ilvl w:val="0"/>
+          <w:numId w:val="2"/>
+        </w:numPr>
+        <w:rPr>
+          <w:sz w:val="24"/>
+          <w:szCs w:val="24"/>
+        </w:rPr>
+      </w:pPr>
+      <w:r>
+        <w:rPr>
+          <w:sz w:val="24"/>
+          <w:szCs w:val="24"/>
+        </w:rPr>
+        <w:t>ID de la imagen</w:t>
+      </w:r>
+    </w:p>
+    <w:p>
+      <w:pPr>
+        <w:pStyle w:val="Prrafodelista"/>
+        <w:numPr>
+          <w:ilvl w:val="0"/>
+          <w:numId w:val="2"/>
+        </w:numPr>
+        <w:rPr>
+          <w:sz w:val="24"/>
+          <w:szCs w:val="24"/>
+        </w:rPr>
+      </w:pPr>
+      <w:r>
+        <w:rPr>
+          <w:sz w:val="24"/>
+          <w:szCs w:val="24"/>
+        </w:rPr>
+        <w:t>Título de la imagen</w:t>
+      </w:r>
+    </w:p>
+    <w:p>
+      <w:pPr>
+        <w:pStyle w:val="Prrafodelista"/>
+        <w:numPr>
+          <w:ilvl w:val="0"/>
+          <w:numId w:val="2"/>
+        </w:numPr>
+        <w:rPr>
+          <w:sz w:val="24"/>
+          <w:szCs w:val="24"/>
+        </w:rPr>
+      </w:pPr>
+      <w:r>
+        <w:rPr>
+          <w:sz w:val="24"/>
+          <w:szCs w:val="24"/>
+        </w:rPr>
+        <w:t>Imagen</w:t>
+      </w:r>
+    </w:p>
+    <w:p>
+      <w:pPr>
+        <w:pStyle w:val="Prrafodelista"/>
+        <w:numPr>
+          <w:ilvl w:val="0"/>
+          <w:numId w:val="2"/>
+        </w:numPr>
+        <w:rPr>
+          <w:sz w:val="24"/>
+          <w:szCs w:val="24"/>
+        </w:rPr>
+      </w:pPr>
+      <w:r>
+        <w:rPr>
+          <w:sz w:val="24"/>
+          <w:szCs w:val="24"/>
+        </w:rPr>
+        <w:t>ID de la galería a la que pertenece la imagen</w:t>
+      </w:r>
+    </w:p>
+    <w:p>
+      <w:pPr>
+        <w:rPr>
+          <w:sz w:val="24"/>
+          <w:szCs w:val="24"/>
+        </w:rPr>
+      </w:pPr>
+      <w:r>
+        <w:rPr>
+          <w:sz w:val="24"/>
+          <w:szCs w:val="24"/>
+        </w:rPr>
+        <w:t>Tiene como clave principal el ID de la imagen. Tiene una clave foránea que toma como referencia un ID de galería.</w:t>
       </w:r>
     </w:p>
     <w:p>
@@ -1089,14 +1493,12 @@
       <w:r>
         <w:rPr>
           <w:noProof/>
-          <w:sz w:val="24"/>
-          <w:szCs w:val="24"/>
         </w:rPr>
         <w:drawing>
-          <wp:inline distT="0" distB="0" distL="0" distR="0" wp14:anchorId="3AFBF8BC" wp14:editId="50E28C1E">
-            <wp:extent cx="4195216" cy="922020"/>
-            <wp:effectExtent l="0" t="0" r="0" b="0"/>
-            <wp:docPr id="1701060483" name="Imagen 1"/>
+          <wp:inline distT="0" distB="0" distL="0" distR="0" wp14:anchorId="36676309" wp14:editId="34F7D8F0">
+            <wp:extent cx="5400040" cy="1464310"/>
+            <wp:effectExtent l="0" t="0" r="0" b="2540"/>
+            <wp:docPr id="807591961" name="Imagen 1"/>
             <wp:cNvGraphicFramePr>
               <a:graphicFrameLocks xmlns:a="http://schemas.openxmlformats.org/drawingml/2006/main" noChangeAspect="1"/>
             </wp:cNvGraphicFramePr>
@@ -1104,7 +1506,7 @@
               <a:graphicData uri="http://schemas.openxmlformats.org/drawingml/2006/picture">
                 <pic:pic xmlns:pic="http://schemas.openxmlformats.org/drawingml/2006/picture">
                   <pic:nvPicPr>
-                    <pic:cNvPr id="1701060483" name=""/>
+                    <pic:cNvPr id="807591961" name=""/>
                     <pic:cNvPicPr/>
                   </pic:nvPicPr>
                   <pic:blipFill>
@@ -1116,7 +1518,7 @@
                   <pic:spPr>
                     <a:xfrm>
                       <a:off x="0" y="0"/>
-                      <a:ext cx="4231784" cy="930057"/>
+                      <a:ext cx="5400040" cy="1464310"/>
                     </a:xfrm>
                     <a:prstGeom prst="rect">
                       <a:avLst/>
@@ -1141,54 +1543,97 @@
           <w:sz w:val="24"/>
           <w:szCs w:val="24"/>
         </w:rPr>
-        <w:t xml:space="preserve">Luego, puse un bucle para mostrar todos los eventos disponibles. Tuve que investigar en el Internet porque </w:t>
-      </w:r>
-      <w:r>
-        <w:rPr>
-          <w:sz w:val="24"/>
-          <w:szCs w:val="24"/>
-        </w:rPr>
-        <w:t xml:space="preserve">inicialmente </w:t>
-      </w:r>
-      <w:r>
-        <w:rPr>
-          <w:sz w:val="24"/>
-          <w:szCs w:val="24"/>
-        </w:rPr>
-        <w:t xml:space="preserve">no sabía cómo hacerlo. Encontré un comentario en Stack </w:t>
-      </w:r>
-      <w:proofErr w:type="spellStart"/>
-      <w:r>
-        <w:rPr>
-          <w:sz w:val="24"/>
-          <w:szCs w:val="24"/>
-        </w:rPr>
-        <w:t>Overflow</w:t>
-      </w:r>
-      <w:proofErr w:type="spellEnd"/>
-      <w:r>
-        <w:rPr>
-          <w:sz w:val="24"/>
-          <w:szCs w:val="24"/>
-        </w:rPr>
-        <w:t xml:space="preserve"> que explicaba cómo hacerlo (</w:t>
-      </w:r>
-      <w:hyperlink r:id="rId10" w:history="1">
-        <w:r>
-          <w:rPr>
-            <w:rStyle w:val="Hipervnculo"/>
-            <w:sz w:val="24"/>
-            <w:szCs w:val="24"/>
-          </w:rPr>
-          <w:t>https://stackoverflow.com/a/17068246</w:t>
-        </w:r>
-      </w:hyperlink>
-      <w:r>
-        <w:rPr>
-          <w:sz w:val="24"/>
-          <w:szCs w:val="24"/>
-        </w:rPr>
-        <w:t>) así que lo implementé:</w:t>
+        <w:br w:type="page"/>
+      </w:r>
+    </w:p>
+    <w:p>
+      <w:pPr>
+        <w:rPr>
+          <w:b/>
+          <w:bCs/>
+          <w:sz w:val="24"/>
+          <w:szCs w:val="24"/>
+        </w:rPr>
+      </w:pPr>
+      <w:r>
+        <w:rPr>
+          <w:b/>
+          <w:bCs/>
+          <w:sz w:val="24"/>
+          <w:szCs w:val="24"/>
+        </w:rPr>
+        <w:lastRenderedPageBreak/>
+        <w:t>Tabla favoritos:</w:t>
+      </w:r>
+    </w:p>
+    <w:p>
+      <w:pPr>
+        <w:rPr>
+          <w:sz w:val="24"/>
+          <w:szCs w:val="24"/>
+        </w:rPr>
+      </w:pPr>
+      <w:r>
+        <w:rPr>
+          <w:sz w:val="24"/>
+          <w:szCs w:val="24"/>
+        </w:rPr>
+        <w:t>Contiene:</w:t>
+      </w:r>
+    </w:p>
+    <w:p>
+      <w:pPr>
+        <w:pStyle w:val="Prrafodelista"/>
+        <w:numPr>
+          <w:ilvl w:val="0"/>
+          <w:numId w:val="2"/>
+        </w:numPr>
+        <w:rPr>
+          <w:sz w:val="24"/>
+          <w:szCs w:val="24"/>
+        </w:rPr>
+      </w:pPr>
+      <w:r>
+        <w:rPr>
+          <w:sz w:val="24"/>
+          <w:szCs w:val="24"/>
+        </w:rPr>
+        <w:t>ID del usuario</w:t>
+      </w:r>
+    </w:p>
+    <w:p>
+      <w:pPr>
+        <w:pStyle w:val="Prrafodelista"/>
+        <w:numPr>
+          <w:ilvl w:val="0"/>
+          <w:numId w:val="2"/>
+        </w:numPr>
+        <w:rPr>
+          <w:sz w:val="24"/>
+          <w:szCs w:val="24"/>
+        </w:rPr>
+      </w:pPr>
+      <w:r>
+        <w:rPr>
+          <w:sz w:val="24"/>
+          <w:szCs w:val="24"/>
+        </w:rPr>
+        <w:t>ID del evento</w:t>
+      </w:r>
+    </w:p>
+    <w:p>
+      <w:pPr>
+        <w:rPr>
+          <w:sz w:val="24"/>
+          <w:szCs w:val="24"/>
+        </w:rPr>
+      </w:pPr>
+      <w:r>
+        <w:rPr>
+          <w:sz w:val="24"/>
+          <w:szCs w:val="24"/>
+        </w:rPr>
+        <w:t>La clave principal es una combinación de los dos atributos. Tiene 2 claves foráneas que representan el ID del usuario y evento.</w:t>
       </w:r>
     </w:p>
     <w:p>
@@ -1201,14 +1646,12 @@
       <w:r>
         <w:rPr>
           <w:noProof/>
-          <w:sz w:val="24"/>
-          <w:szCs w:val="24"/>
         </w:rPr>
         <w:drawing>
-          <wp:inline distT="0" distB="0" distL="0" distR="0" wp14:anchorId="37945907" wp14:editId="7B723F22">
-            <wp:extent cx="5455920" cy="937335"/>
+          <wp:inline distT="0" distB="0" distL="0" distR="0" wp14:anchorId="0D1F7734" wp14:editId="2EC27A40">
+            <wp:extent cx="5400040" cy="1220470"/>
             <wp:effectExtent l="0" t="0" r="0" b="0"/>
-            <wp:docPr id="1135605040" name="Imagen 1"/>
+            <wp:docPr id="460030581" name="Imagen 1"/>
             <wp:cNvGraphicFramePr>
               <a:graphicFrameLocks xmlns:a="http://schemas.openxmlformats.org/drawingml/2006/main" noChangeAspect="1"/>
             </wp:cNvGraphicFramePr>
@@ -1216,7 +1659,113 @@
               <a:graphicData uri="http://schemas.openxmlformats.org/drawingml/2006/picture">
                 <pic:pic xmlns:pic="http://schemas.openxmlformats.org/drawingml/2006/picture">
                   <pic:nvPicPr>
-                    <pic:cNvPr id="1135605040" name=""/>
+                    <pic:cNvPr id="460030581" name=""/>
+                    <pic:cNvPicPr/>
+                  </pic:nvPicPr>
+                  <pic:blipFill>
+                    <a:blip r:embed="rId10"/>
+                    <a:stretch>
+                      <a:fillRect/>
+                    </a:stretch>
+                  </pic:blipFill>
+                  <pic:spPr>
+                    <a:xfrm>
+                      <a:off x="0" y="0"/>
+                      <a:ext cx="5400040" cy="1220470"/>
+                    </a:xfrm>
+                    <a:prstGeom prst="rect">
+                      <a:avLst/>
+                    </a:prstGeom>
+                  </pic:spPr>
+                </pic:pic>
+              </a:graphicData>
+            </a:graphic>
+          </wp:inline>
+        </w:drawing>
+      </w:r>
+    </w:p>
+    <w:p>
+      <w:pPr>
+        <w:rPr>
+          <w:sz w:val="24"/>
+          <w:szCs w:val="24"/>
+        </w:rPr>
+      </w:pPr>
+      <w:r>
+        <w:rPr>
+          <w:sz w:val="24"/>
+          <w:szCs w:val="24"/>
+        </w:rPr>
+        <w:br w:type="page"/>
+      </w:r>
+    </w:p>
+    <w:p>
+      <w:pPr>
+        <w:rPr>
+          <w:b/>
+          <w:bCs/>
+          <w:sz w:val="28"/>
+          <w:szCs w:val="28"/>
+        </w:rPr>
+      </w:pPr>
+      <w:r>
+        <w:rPr>
+          <w:b/>
+          <w:bCs/>
+          <w:sz w:val="28"/>
+          <w:szCs w:val="28"/>
+        </w:rPr>
+        <w:lastRenderedPageBreak/>
+        <w:t>VALORES</w:t>
+      </w:r>
+    </w:p>
+    <w:p>
+      <w:pPr>
+        <w:rPr>
+          <w:sz w:val="24"/>
+          <w:szCs w:val="24"/>
+        </w:rPr>
+      </w:pPr>
+    </w:p>
+    <w:p>
+      <w:pPr>
+        <w:rPr>
+          <w:sz w:val="24"/>
+          <w:szCs w:val="24"/>
+        </w:rPr>
+      </w:pPr>
+      <w:r>
+        <w:rPr>
+          <w:sz w:val="24"/>
+          <w:szCs w:val="24"/>
+        </w:rPr>
+        <w:t>Los eventos insertados en la base de datos son:</w:t>
+      </w:r>
+    </w:p>
+    <w:p>
+      <w:pPr>
+        <w:rPr>
+          <w:sz w:val="24"/>
+          <w:szCs w:val="24"/>
+        </w:rPr>
+      </w:pPr>
+      <w:r>
+        <w:rPr>
+          <w:noProof/>
+        </w:rPr>
+        <w:drawing>
+          <wp:inline distT="0" distB="0" distL="0" distR="0" wp14:anchorId="15EDC7FD" wp14:editId="17985D0D">
+            <wp:extent cx="5400040" cy="1286510"/>
+            <wp:effectExtent l="0" t="0" r="0" b="8890"/>
+            <wp:docPr id="1828177667" name="Imagen 1"/>
+            <wp:cNvGraphicFramePr>
+              <a:graphicFrameLocks xmlns:a="http://schemas.openxmlformats.org/drawingml/2006/main" noChangeAspect="1"/>
+            </wp:cNvGraphicFramePr>
+            <a:graphic xmlns:a="http://schemas.openxmlformats.org/drawingml/2006/main">
+              <a:graphicData uri="http://schemas.openxmlformats.org/drawingml/2006/picture">
+                <pic:pic xmlns:pic="http://schemas.openxmlformats.org/drawingml/2006/picture">
+                  <pic:nvPicPr>
+                    <pic:cNvPr id="1828177667" name=""/>
                     <pic:cNvPicPr/>
                   </pic:nvPicPr>
                   <pic:blipFill>
@@ -1228,7 +1777,7 @@
                   <pic:spPr>
                     <a:xfrm>
                       <a:off x="0" y="0"/>
-                      <a:ext cx="5463936" cy="938712"/>
+                      <a:ext cx="5400040" cy="1286510"/>
                     </a:xfrm>
                     <a:prstGeom prst="rect">
                       <a:avLst/>
@@ -1253,70 +1802,8 @@
           <w:sz w:val="24"/>
           <w:szCs w:val="24"/>
         </w:rPr>
-        <w:br w:type="page"/>
-      </w:r>
-    </w:p>
-    <w:p>
-      <w:pPr>
-        <w:rPr>
-          <w:sz w:val="24"/>
-          <w:szCs w:val="24"/>
-        </w:rPr>
-      </w:pPr>
-      <w:r>
-        <w:rPr>
-          <w:sz w:val="24"/>
-          <w:szCs w:val="24"/>
-        </w:rPr>
-        <w:lastRenderedPageBreak/>
-        <w:t>DÍA 3 (25/3/2026):</w:t>
-      </w:r>
-    </w:p>
-    <w:p>
-      <w:pPr>
-        <w:rPr>
-          <w:sz w:val="24"/>
-          <w:szCs w:val="24"/>
-        </w:rPr>
-      </w:pPr>
-      <w:r>
-        <w:rPr>
-          <w:sz w:val="24"/>
-          <w:szCs w:val="24"/>
-        </w:rPr>
-        <w:t>Empecé con la web</w:t>
-      </w:r>
-    </w:p>
-    <w:p>
-      <w:pPr>
-        <w:rPr>
-          <w:sz w:val="24"/>
-          <w:szCs w:val="24"/>
-        </w:rPr>
-      </w:pPr>
-      <w:r>
-        <w:rPr>
-          <w:sz w:val="24"/>
-          <w:szCs w:val="24"/>
-        </w:rPr>
-        <w:t>Creé el d</w:t>
-      </w:r>
-      <w:r>
-        <w:rPr>
-          <w:sz w:val="24"/>
-          <w:szCs w:val="24"/>
-        </w:rPr>
-        <w:t>iagrama entidad relación:</w:t>
-      </w:r>
-    </w:p>
-    <w:p>
-      <w:pPr>
-        <w:rPr>
-          <w:sz w:val="24"/>
-          <w:szCs w:val="24"/>
-          <w:u w:val="single"/>
-        </w:rPr>
-      </w:pPr>
+        <w:t>Los usuarios insertados en la base de datos son:</w:t>
+      </w:r>
     </w:p>
     <w:p>
       <w:pPr>
@@ -1328,14 +1815,12 @@
       <w:r>
         <w:rPr>
           <w:noProof/>
-          <w:sz w:val="24"/>
-          <w:szCs w:val="24"/>
         </w:rPr>
         <w:drawing>
-          <wp:inline distT="0" distB="0" distL="0" distR="0" wp14:anchorId="264F9186" wp14:editId="558E96B9">
-            <wp:extent cx="5400040" cy="4210050"/>
-            <wp:effectExtent l="0" t="0" r="0" b="0"/>
-            <wp:docPr id="635600855" name="Imagen 1"/>
+          <wp:inline distT="0" distB="0" distL="0" distR="0" wp14:anchorId="2B34114F" wp14:editId="47CF2467">
+            <wp:extent cx="5400040" cy="418465"/>
+            <wp:effectExtent l="0" t="0" r="0" b="635"/>
+            <wp:docPr id="921517919" name="Imagen 1"/>
             <wp:cNvGraphicFramePr>
               <a:graphicFrameLocks xmlns:a="http://schemas.openxmlformats.org/drawingml/2006/main" noChangeAspect="1"/>
             </wp:cNvGraphicFramePr>
@@ -1343,7 +1828,7 @@
               <a:graphicData uri="http://schemas.openxmlformats.org/drawingml/2006/picture">
                 <pic:pic xmlns:pic="http://schemas.openxmlformats.org/drawingml/2006/picture">
                   <pic:nvPicPr>
-                    <pic:cNvPr id="635600855" name=""/>
+                    <pic:cNvPr id="921517919" name=""/>
                     <pic:cNvPicPr/>
                   </pic:nvPicPr>
                   <pic:blipFill>
@@ -1355,7 +1840,7 @@
                   <pic:spPr>
                     <a:xfrm>
                       <a:off x="0" y="0"/>
-                      <a:ext cx="5400040" cy="4210050"/>
+                      <a:ext cx="5400040" cy="418465"/>
                     </a:xfrm>
                     <a:prstGeom prst="rect">
                       <a:avLst/>
@@ -1380,23 +1865,49 @@
           <w:sz w:val="24"/>
           <w:szCs w:val="24"/>
         </w:rPr>
-        <w:br w:type="page"/>
-      </w:r>
-    </w:p>
-    <w:p>
-      <w:pPr>
-        <w:rPr>
-          <w:sz w:val="24"/>
-          <w:szCs w:val="24"/>
-        </w:rPr>
-      </w:pPr>
-      <w:r>
-        <w:rPr>
-          <w:sz w:val="24"/>
-          <w:szCs w:val="24"/>
-        </w:rPr>
-        <w:lastRenderedPageBreak/>
-        <w:t>Creé el archivo SQL, haciendo las tablas.</w:t>
+        <w:t>L</w:t>
+      </w:r>
+      <w:r>
+        <w:rPr>
+          <w:sz w:val="24"/>
+          <w:szCs w:val="24"/>
+        </w:rPr>
+        <w:t>a</w:t>
+      </w:r>
+      <w:r>
+        <w:rPr>
+          <w:sz w:val="24"/>
+          <w:szCs w:val="24"/>
+        </w:rPr>
+        <w:t xml:space="preserve">s </w:t>
+      </w:r>
+      <w:r>
+        <w:rPr>
+          <w:sz w:val="24"/>
+          <w:szCs w:val="24"/>
+        </w:rPr>
+        <w:t xml:space="preserve">galerías </w:t>
+      </w:r>
+      <w:r>
+        <w:rPr>
+          <w:sz w:val="24"/>
+          <w:szCs w:val="24"/>
+        </w:rPr>
+        <w:t>insertad</w:t>
+      </w:r>
+      <w:r>
+        <w:rPr>
+          <w:sz w:val="24"/>
+          <w:szCs w:val="24"/>
+        </w:rPr>
+        <w:t xml:space="preserve">as </w:t>
+      </w:r>
+      <w:r>
+        <w:rPr>
+          <w:sz w:val="24"/>
+          <w:szCs w:val="24"/>
+        </w:rPr>
+        <w:t>en la base de datos son:</w:t>
       </w:r>
     </w:p>
     <w:p>
@@ -1409,14 +1920,12 @@
       <w:r>
         <w:rPr>
           <w:noProof/>
-          <w:sz w:val="24"/>
-          <w:szCs w:val="24"/>
         </w:rPr>
         <w:drawing>
-          <wp:inline distT="0" distB="0" distL="0" distR="0" wp14:anchorId="2DC054FD" wp14:editId="644D5CA3">
-            <wp:extent cx="5400040" cy="5071745"/>
+          <wp:inline distT="0" distB="0" distL="0" distR="0" wp14:anchorId="39C325F7" wp14:editId="5AA32254">
+            <wp:extent cx="5400040" cy="461010"/>
             <wp:effectExtent l="0" t="0" r="0" b="0"/>
-            <wp:docPr id="1436278224" name="Imagen 1"/>
+            <wp:docPr id="5051180" name="Imagen 1"/>
             <wp:cNvGraphicFramePr>
               <a:graphicFrameLocks xmlns:a="http://schemas.openxmlformats.org/drawingml/2006/main" noChangeAspect="1"/>
             </wp:cNvGraphicFramePr>
@@ -1424,7 +1933,7 @@
               <a:graphicData uri="http://schemas.openxmlformats.org/drawingml/2006/picture">
                 <pic:pic xmlns:pic="http://schemas.openxmlformats.org/drawingml/2006/picture">
                   <pic:nvPicPr>
-                    <pic:cNvPr id="1436278224" name=""/>
+                    <pic:cNvPr id="5051180" name=""/>
                     <pic:cNvPicPr/>
                   </pic:nvPicPr>
                   <pic:blipFill>
@@ -1436,7 +1945,7 @@
                   <pic:spPr>
                     <a:xfrm>
                       <a:off x="0" y="0"/>
-                      <a:ext cx="5400040" cy="5071745"/>
+                      <a:ext cx="5400040" cy="461010"/>
                     </a:xfrm>
                     <a:prstGeom prst="rect">
                       <a:avLst/>
@@ -1461,38 +1970,56 @@
           <w:sz w:val="24"/>
           <w:szCs w:val="24"/>
         </w:rPr>
-        <w:br w:type="page"/>
-      </w:r>
-    </w:p>
-    <w:p>
-      <w:pPr>
-        <w:rPr>
-          <w:sz w:val="24"/>
-          <w:szCs w:val="24"/>
-        </w:rPr>
-      </w:pPr>
-      <w:r>
-        <w:rPr>
-          <w:sz w:val="24"/>
-          <w:szCs w:val="24"/>
-        </w:rPr>
-        <w:lastRenderedPageBreak/>
-        <w:t>DÍA 4 (26/3/2026):</w:t>
-      </w:r>
-    </w:p>
-    <w:p>
-      <w:pPr>
-        <w:rPr>
-          <w:sz w:val="24"/>
-          <w:szCs w:val="24"/>
-        </w:rPr>
-      </w:pPr>
-      <w:r>
-        <w:rPr>
-          <w:sz w:val="24"/>
-          <w:szCs w:val="24"/>
-        </w:rPr>
-        <w:t>Refactorización del código de Java. Creé varios métodos para facilitar la selección de eventos y galería y evitar redundancia.</w:t>
+        <w:t>L</w:t>
+      </w:r>
+      <w:r>
+        <w:rPr>
+          <w:sz w:val="24"/>
+          <w:szCs w:val="24"/>
+        </w:rPr>
+        <w:t>as</w:t>
+      </w:r>
+      <w:r>
+        <w:rPr>
+          <w:sz w:val="24"/>
+          <w:szCs w:val="24"/>
+        </w:rPr>
+        <w:t xml:space="preserve"> </w:t>
+      </w:r>
+      <w:r>
+        <w:rPr>
+          <w:sz w:val="24"/>
+          <w:szCs w:val="24"/>
+        </w:rPr>
+        <w:t xml:space="preserve">imágenes </w:t>
+      </w:r>
+      <w:r>
+        <w:rPr>
+          <w:sz w:val="24"/>
+          <w:szCs w:val="24"/>
+        </w:rPr>
+        <w:t>insertad</w:t>
+      </w:r>
+      <w:r>
+        <w:rPr>
+          <w:sz w:val="24"/>
+          <w:szCs w:val="24"/>
+        </w:rPr>
+        <w:t>a</w:t>
+      </w:r>
+      <w:r>
+        <w:rPr>
+          <w:sz w:val="24"/>
+          <w:szCs w:val="24"/>
+        </w:rPr>
+        <w:t>s</w:t>
+      </w:r>
+      <w:r>
+        <w:rPr>
+          <w:sz w:val="24"/>
+          <w:szCs w:val="24"/>
+        </w:rPr>
+        <w:t xml:space="preserve"> en la base de datos son:</w:t>
       </w:r>
     </w:p>
     <w:p>
@@ -1505,14 +2032,12 @@
       <w:r>
         <w:rPr>
           <w:noProof/>
-          <w:sz w:val="24"/>
-          <w:szCs w:val="24"/>
         </w:rPr>
         <w:drawing>
-          <wp:inline distT="0" distB="0" distL="0" distR="0" wp14:anchorId="5A794656" wp14:editId="3AD9F6A1">
-            <wp:extent cx="5400040" cy="4271645"/>
+          <wp:inline distT="0" distB="0" distL="0" distR="0" wp14:anchorId="7A477416" wp14:editId="7E9ED481">
+            <wp:extent cx="5400040" cy="1624330"/>
             <wp:effectExtent l="0" t="0" r="0" b="0"/>
-            <wp:docPr id="1026802461" name="Imagen 1"/>
+            <wp:docPr id="1647584167" name="Imagen 1"/>
             <wp:cNvGraphicFramePr>
               <a:graphicFrameLocks xmlns:a="http://schemas.openxmlformats.org/drawingml/2006/main" noChangeAspect="1"/>
             </wp:cNvGraphicFramePr>
@@ -1520,7 +2045,7 @@
               <a:graphicData uri="http://schemas.openxmlformats.org/drawingml/2006/picture">
                 <pic:pic xmlns:pic="http://schemas.openxmlformats.org/drawingml/2006/picture">
                   <pic:nvPicPr>
-                    <pic:cNvPr id="1026802461" name=""/>
+                    <pic:cNvPr id="1647584167" name=""/>
                     <pic:cNvPicPr/>
                   </pic:nvPicPr>
                   <pic:blipFill>
@@ -1532,7 +2057,7 @@
                   <pic:spPr>
                     <a:xfrm>
                       <a:off x="0" y="0"/>
-                      <a:ext cx="5400040" cy="4271645"/>
+                      <a:ext cx="5400040" cy="1624330"/>
                     </a:xfrm>
                     <a:prstGeom prst="rect">
                       <a:avLst/>
@@ -1552,41 +2077,30 @@
           <w:szCs w:val="24"/>
         </w:rPr>
       </w:pPr>
-    </w:p>
-    <w:p>
-      <w:pPr>
-        <w:rPr>
-          <w:sz w:val="24"/>
-          <w:szCs w:val="24"/>
-        </w:rPr>
-      </w:pPr>
-      <w:r>
-        <w:rPr>
-          <w:sz w:val="24"/>
-          <w:szCs w:val="24"/>
-        </w:rPr>
-        <w:t>Avance de la web:</w:t>
-      </w:r>
-    </w:p>
-    <w:p>
-      <w:pPr>
-        <w:rPr>
-          <w:sz w:val="24"/>
-          <w:szCs w:val="24"/>
-          <w:u w:val="single"/>
+      <w:r>
+        <w:rPr>
+          <w:sz w:val="24"/>
+          <w:szCs w:val="24"/>
+        </w:rPr>
+        <w:t>Los favoritos insertados en la base de datos son:</w:t>
+      </w:r>
+    </w:p>
+    <w:p>
+      <w:pPr>
+        <w:rPr>
+          <w:sz w:val="24"/>
+          <w:szCs w:val="24"/>
         </w:rPr>
       </w:pPr>
       <w:r>
         <w:rPr>
           <w:noProof/>
-          <w:sz w:val="24"/>
-          <w:szCs w:val="24"/>
         </w:rPr>
         <w:drawing>
-          <wp:inline distT="0" distB="0" distL="0" distR="0" wp14:anchorId="7C66AD16" wp14:editId="02364258">
-            <wp:extent cx="5400040" cy="954405"/>
-            <wp:effectExtent l="0" t="0" r="0" b="0"/>
-            <wp:docPr id="1636500999" name="Imagen 1"/>
+          <wp:inline distT="0" distB="0" distL="0" distR="0" wp14:anchorId="7D4273E3" wp14:editId="6BD4631E">
+            <wp:extent cx="2529840" cy="1722444"/>
+            <wp:effectExtent l="0" t="0" r="3810" b="0"/>
+            <wp:docPr id="1812450712" name="Imagen 1"/>
             <wp:cNvGraphicFramePr>
               <a:graphicFrameLocks xmlns:a="http://schemas.openxmlformats.org/drawingml/2006/main" noChangeAspect="1"/>
             </wp:cNvGraphicFramePr>
@@ -1594,7 +2108,7 @@
               <a:graphicData uri="http://schemas.openxmlformats.org/drawingml/2006/picture">
                 <pic:pic xmlns:pic="http://schemas.openxmlformats.org/drawingml/2006/picture">
                   <pic:nvPicPr>
-                    <pic:cNvPr id="1636500999" name=""/>
+                    <pic:cNvPr id="1812450712" name=""/>
                     <pic:cNvPicPr/>
                   </pic:nvPicPr>
                   <pic:blipFill>
@@ -1606,7 +2120,7 @@
                   <pic:spPr>
                     <a:xfrm>
                       <a:off x="0" y="0"/>
-                      <a:ext cx="5400040" cy="954405"/>
+                      <a:ext cx="2538941" cy="1728640"/>
                     </a:xfrm>
                     <a:prstGeom prst="rect">
                       <a:avLst/>
@@ -1624,23 +2138,20 @@
         <w:rPr>
           <w:sz w:val="24"/>
           <w:szCs w:val="24"/>
-          <w:u w:val="single"/>
-        </w:rPr>
-      </w:pPr>
-    </w:p>
-    <w:p>
-      <w:pPr>
-        <w:rPr>
-          <w:sz w:val="24"/>
-          <w:szCs w:val="24"/>
-          <w:u w:val="single"/>
-        </w:rPr>
-      </w:pPr>
-      <w:r>
-        <w:rPr>
-          <w:sz w:val="24"/>
-          <w:szCs w:val="24"/>
-          <w:u w:val="single"/>
+        </w:rPr>
+      </w:pPr>
+    </w:p>
+    <w:p>
+      <w:pPr>
+        <w:rPr>
+          <w:sz w:val="24"/>
+          <w:szCs w:val="24"/>
+        </w:rPr>
+      </w:pPr>
+      <w:r>
+        <w:rPr>
+          <w:sz w:val="24"/>
+          <w:szCs w:val="24"/>
         </w:rPr>
         <w:br w:type="page"/>
       </w:r>
@@ -1648,25 +2159,56 @@
     <w:p>
       <w:pPr>
         <w:rPr>
-          <w:sz w:val="24"/>
-          <w:szCs w:val="24"/>
-        </w:rPr>
-      </w:pPr>
-      <w:r>
-        <w:rPr>
-          <w:sz w:val="24"/>
-          <w:szCs w:val="24"/>
+          <w:b/>
+          <w:bCs/>
+          <w:sz w:val="28"/>
+          <w:szCs w:val="28"/>
+        </w:rPr>
+      </w:pPr>
+      <w:r>
+        <w:rPr>
+          <w:b/>
+          <w:bCs/>
+          <w:sz w:val="28"/>
+          <w:szCs w:val="28"/>
         </w:rPr>
         <w:lastRenderedPageBreak/>
-        <w:t>Continué con el archivo SQL. Añadí todos los valores:</w:t>
-      </w:r>
-    </w:p>
-    <w:p>
-      <w:pPr>
-        <w:rPr>
-          <w:sz w:val="24"/>
-          <w:szCs w:val="24"/>
-          <w:u w:val="single"/>
+        <w:t>VISTAS</w:t>
+      </w:r>
+      <w:r>
+        <w:rPr>
+          <w:b/>
+          <w:bCs/>
+          <w:sz w:val="28"/>
+          <w:szCs w:val="28"/>
+        </w:rPr>
+        <w:t xml:space="preserve"> (Código + captura del resultado)</w:t>
+      </w:r>
+    </w:p>
+    <w:p>
+      <w:pPr>
+        <w:rPr>
+          <w:b/>
+          <w:bCs/>
+          <w:sz w:val="24"/>
+          <w:szCs w:val="24"/>
+        </w:rPr>
+      </w:pPr>
+      <w:r>
+        <w:rPr>
+          <w:b/>
+          <w:bCs/>
+          <w:sz w:val="24"/>
+          <w:szCs w:val="24"/>
+        </w:rPr>
+        <w:t xml:space="preserve">Vista 1 (Devolver las galerías anteriores al 28-02-2026): </w:t>
+      </w:r>
+    </w:p>
+    <w:p>
+      <w:pPr>
+        <w:rPr>
+          <w:sz w:val="24"/>
+          <w:szCs w:val="24"/>
         </w:rPr>
       </w:pPr>
       <w:r>
@@ -1674,10 +2216,10 @@
           <w:noProof/>
         </w:rPr>
         <w:drawing>
-          <wp:inline distT="0" distB="0" distL="0" distR="0" wp14:anchorId="0A0D496C" wp14:editId="3AC65AD3">
-            <wp:extent cx="5400040" cy="2561590"/>
-            <wp:effectExtent l="0" t="0" r="0" b="0"/>
-            <wp:docPr id="820076990" name="Imagen 1"/>
+          <wp:inline distT="0" distB="0" distL="0" distR="0" wp14:anchorId="57C401B4" wp14:editId="5334BD9E">
+            <wp:extent cx="4072041" cy="1409700"/>
+            <wp:effectExtent l="0" t="0" r="5080" b="0"/>
+            <wp:docPr id="2120884639" name="Imagen 1"/>
             <wp:cNvGraphicFramePr>
               <a:graphicFrameLocks xmlns:a="http://schemas.openxmlformats.org/drawingml/2006/main" noChangeAspect="1"/>
             </wp:cNvGraphicFramePr>
@@ -1685,7 +2227,7 @@
               <a:graphicData uri="http://schemas.openxmlformats.org/drawingml/2006/picture">
                 <pic:pic xmlns:pic="http://schemas.openxmlformats.org/drawingml/2006/picture">
                   <pic:nvPicPr>
-                    <pic:cNvPr id="820076990" name=""/>
+                    <pic:cNvPr id="2120884639" name=""/>
                     <pic:cNvPicPr/>
                   </pic:nvPicPr>
                   <pic:blipFill>
@@ -1697,7 +2239,7 @@
                   <pic:spPr>
                     <a:xfrm>
                       <a:off x="0" y="0"/>
-                      <a:ext cx="5400040" cy="2561590"/>
+                      <a:ext cx="4073270" cy="1410126"/>
                     </a:xfrm>
                     <a:prstGeom prst="rect">
                       <a:avLst/>
@@ -1709,52 +2251,12 @@
           </wp:inline>
         </w:drawing>
       </w:r>
-      <w:r>
-        <w:rPr>
-          <w:sz w:val="24"/>
-          <w:szCs w:val="24"/>
-          <w:u w:val="single"/>
-        </w:rPr>
-        <w:t xml:space="preserve"> </w:t>
-      </w:r>
-    </w:p>
-    <w:p>
-      <w:pPr>
-        <w:rPr>
-          <w:sz w:val="24"/>
-          <w:szCs w:val="24"/>
-        </w:rPr>
-      </w:pPr>
-    </w:p>
-    <w:p>
-      <w:pPr>
-        <w:rPr>
-          <w:sz w:val="24"/>
-          <w:szCs w:val="24"/>
-        </w:rPr>
-      </w:pPr>
-    </w:p>
-    <w:p>
-      <w:pPr>
-        <w:rPr>
-          <w:sz w:val="24"/>
-          <w:szCs w:val="24"/>
-        </w:rPr>
-      </w:pPr>
-      <w:r>
-        <w:rPr>
-          <w:sz w:val="24"/>
-          <w:szCs w:val="24"/>
-        </w:rPr>
-        <w:t>Luego creé las vistas del archivo SQL:</w:t>
-      </w:r>
-    </w:p>
-    <w:p>
-      <w:pPr>
-        <w:rPr>
-          <w:sz w:val="24"/>
-          <w:szCs w:val="24"/>
-          <w:u w:val="single"/>
+    </w:p>
+    <w:p>
+      <w:pPr>
+        <w:rPr>
+          <w:sz w:val="24"/>
+          <w:szCs w:val="24"/>
         </w:rPr>
       </w:pPr>
       <w:r>
@@ -1762,10 +2264,10 @@
           <w:noProof/>
         </w:rPr>
         <w:drawing>
-          <wp:inline distT="0" distB="0" distL="0" distR="0" wp14:anchorId="3853013E" wp14:editId="6EE8AA58">
-            <wp:extent cx="3955472" cy="4759683"/>
-            <wp:effectExtent l="0" t="0" r="6985" b="3175"/>
-            <wp:docPr id="508948121" name="Imagen 1"/>
+          <wp:inline distT="0" distB="0" distL="0" distR="0" wp14:anchorId="295D02DC" wp14:editId="21615BE3">
+            <wp:extent cx="5400040" cy="841375"/>
+            <wp:effectExtent l="0" t="0" r="0" b="0"/>
+            <wp:docPr id="1787179891" name="Imagen 1"/>
             <wp:cNvGraphicFramePr>
               <a:graphicFrameLocks xmlns:a="http://schemas.openxmlformats.org/drawingml/2006/main" noChangeAspect="1"/>
             </wp:cNvGraphicFramePr>
@@ -1773,7 +2275,7 @@
               <a:graphicData uri="http://schemas.openxmlformats.org/drawingml/2006/picture">
                 <pic:pic xmlns:pic="http://schemas.openxmlformats.org/drawingml/2006/picture">
                   <pic:nvPicPr>
-                    <pic:cNvPr id="508948121" name=""/>
+                    <pic:cNvPr id="1787179891" name=""/>
                     <pic:cNvPicPr/>
                   </pic:nvPicPr>
                   <pic:blipFill>
@@ -1785,7 +2287,7 @@
                   <pic:spPr>
                     <a:xfrm>
                       <a:off x="0" y="0"/>
-                      <a:ext cx="3957275" cy="4761852"/>
+                      <a:ext cx="5400040" cy="841375"/>
                     </a:xfrm>
                     <a:prstGeom prst="rect">
                       <a:avLst/>
@@ -1797,74 +2299,78 @@
           </wp:inline>
         </w:drawing>
       </w:r>
-      <w:r>
-        <w:rPr>
-          <w:sz w:val="24"/>
-          <w:szCs w:val="24"/>
-          <w:u w:val="single"/>
-        </w:rPr>
-        <w:t xml:space="preserve"> </w:t>
-      </w:r>
-      <w:r>
-        <w:rPr>
-          <w:sz w:val="24"/>
-          <w:szCs w:val="24"/>
-          <w:u w:val="single"/>
-        </w:rPr>
-        <w:br w:type="page"/>
-      </w:r>
-    </w:p>
-    <w:p>
-      <w:pPr>
-        <w:rPr>
-          <w:sz w:val="24"/>
-          <w:szCs w:val="24"/>
-        </w:rPr>
-      </w:pPr>
-      <w:r>
-        <w:rPr>
-          <w:sz w:val="24"/>
-          <w:szCs w:val="24"/>
-        </w:rPr>
-        <w:lastRenderedPageBreak/>
-        <w:t>DÍA 5 (27/3/2026):</w:t>
-      </w:r>
-    </w:p>
-    <w:p>
-      <w:pPr>
+    </w:p>
+    <w:p>
+      <w:pPr>
+        <w:rPr>
+          <w:b/>
+          <w:bCs/>
+          <w:sz w:val="24"/>
+          <w:szCs w:val="24"/>
+        </w:rPr>
+      </w:pPr>
+      <w:r>
+        <w:rPr>
+          <w:b/>
+          <w:bCs/>
+          <w:sz w:val="24"/>
+          <w:szCs w:val="24"/>
+        </w:rPr>
+        <w:t xml:space="preserve">Vista </w:t>
+      </w:r>
+      <w:r>
+        <w:rPr>
+          <w:b/>
+          <w:bCs/>
+          <w:sz w:val="24"/>
+          <w:szCs w:val="24"/>
+        </w:rPr>
+        <w:t>2</w:t>
+      </w:r>
+      <w:r>
+        <w:rPr>
+          <w:b/>
+          <w:bCs/>
+          <w:sz w:val="24"/>
+          <w:szCs w:val="24"/>
+        </w:rPr>
+        <w:t xml:space="preserve"> (Devolver </w:t>
+      </w:r>
+      <w:r>
+        <w:rPr>
+          <w:b/>
+          <w:bCs/>
+          <w:sz w:val="24"/>
+          <w:szCs w:val="24"/>
+        </w:rPr>
+        <w:t>los eventos favoritos del usuario 1</w:t>
+      </w:r>
+      <w:r>
+        <w:rPr>
+          <w:b/>
+          <w:bCs/>
+          <w:sz w:val="24"/>
+          <w:szCs w:val="24"/>
+        </w:rPr>
+        <w:t xml:space="preserve">): </w:t>
+      </w:r>
+    </w:p>
+    <w:p>
+      <w:pPr>
+        <w:rPr>
+          <w:sz w:val="24"/>
+          <w:szCs w:val="24"/>
+        </w:rPr>
+      </w:pPr>
+      <w:r>
         <w:rPr>
           <w:noProof/>
-          <w:sz w:val="24"/>
-          <w:szCs w:val="24"/>
-        </w:rPr>
-      </w:pPr>
-      <w:r>
-        <w:rPr>
-          <w:noProof/>
-          <w:sz w:val="24"/>
-          <w:szCs w:val="24"/>
-        </w:rPr>
-        <w:t>Hecha la página de eventos:</w:t>
-      </w:r>
-    </w:p>
-    <w:p>
-      <w:pPr>
-        <w:rPr>
-          <w:sz w:val="24"/>
-          <w:szCs w:val="24"/>
-        </w:rPr>
-      </w:pPr>
-      <w:r>
-        <w:rPr>
-          <w:noProof/>
-          <w:sz w:val="24"/>
-          <w:szCs w:val="24"/>
         </w:rPr>
         <w:drawing>
-          <wp:inline distT="0" distB="0" distL="0" distR="0" wp14:anchorId="483CCD64" wp14:editId="6B781AC6">
-            <wp:extent cx="3874477" cy="1684377"/>
+          <wp:inline distT="0" distB="0" distL="0" distR="0" wp14:anchorId="7C2A3FAC" wp14:editId="7E80A9EE">
+            <wp:extent cx="4274820" cy="1418573"/>
             <wp:effectExtent l="0" t="0" r="0" b="0"/>
-            <wp:docPr id="173322734" name="Imagen 1"/>
+            <wp:docPr id="902624929" name="Imagen 1"/>
             <wp:cNvGraphicFramePr>
               <a:graphicFrameLocks xmlns:a="http://schemas.openxmlformats.org/drawingml/2006/main" noChangeAspect="1"/>
             </wp:cNvGraphicFramePr>
@@ -1872,7 +2378,7 @@
               <a:graphicData uri="http://schemas.openxmlformats.org/drawingml/2006/picture">
                 <pic:pic xmlns:pic="http://schemas.openxmlformats.org/drawingml/2006/picture">
                   <pic:nvPicPr>
-                    <pic:cNvPr id="173322734" name=""/>
+                    <pic:cNvPr id="902624929" name=""/>
                     <pic:cNvPicPr/>
                   </pic:nvPicPr>
                   <pic:blipFill>
@@ -1884,7 +2390,7 @@
                   <pic:spPr>
                     <a:xfrm>
                       <a:off x="0" y="0"/>
-                      <a:ext cx="3877360" cy="1685630"/>
+                      <a:ext cx="4283551" cy="1421470"/>
                     </a:xfrm>
                     <a:prstGeom prst="rect">
                       <a:avLst/>
@@ -1906,30 +2412,13 @@
       </w:pPr>
       <w:r>
         <w:rPr>
-          <w:sz w:val="24"/>
-          <w:szCs w:val="24"/>
-        </w:rPr>
-        <w:t>Web hecha más responsiva:</w:t>
-      </w:r>
-    </w:p>
-    <w:p>
-      <w:pPr>
-        <w:rPr>
-          <w:sz w:val="24"/>
-          <w:szCs w:val="24"/>
-        </w:rPr>
-      </w:pPr>
-      <w:r>
-        <w:rPr>
           <w:noProof/>
-          <w:sz w:val="24"/>
-          <w:szCs w:val="24"/>
         </w:rPr>
         <w:drawing>
-          <wp:inline distT="0" distB="0" distL="0" distR="0" wp14:anchorId="15DE352D" wp14:editId="1C39EB3C">
-            <wp:extent cx="2907323" cy="2648522"/>
-            <wp:effectExtent l="0" t="0" r="7620" b="0"/>
-            <wp:docPr id="1145495028" name="Imagen 1"/>
+          <wp:inline distT="0" distB="0" distL="0" distR="0" wp14:anchorId="23E3556D" wp14:editId="78B1398D">
+            <wp:extent cx="4274820" cy="1017027"/>
+            <wp:effectExtent l="0" t="0" r="0" b="0"/>
+            <wp:docPr id="1746968717" name="Imagen 1"/>
             <wp:cNvGraphicFramePr>
               <a:graphicFrameLocks xmlns:a="http://schemas.openxmlformats.org/drawingml/2006/main" noChangeAspect="1"/>
             </wp:cNvGraphicFramePr>
@@ -1937,7 +2426,7 @@
               <a:graphicData uri="http://schemas.openxmlformats.org/drawingml/2006/picture">
                 <pic:pic xmlns:pic="http://schemas.openxmlformats.org/drawingml/2006/picture">
                   <pic:nvPicPr>
-                    <pic:cNvPr id="1145495028" name=""/>
+                    <pic:cNvPr id="1746968717" name=""/>
                     <pic:cNvPicPr/>
                   </pic:nvPicPr>
                   <pic:blipFill>
@@ -1949,7 +2438,7 @@
                   <pic:spPr>
                     <a:xfrm>
                       <a:off x="0" y="0"/>
-                      <a:ext cx="2911690" cy="2652500"/>
+                      <a:ext cx="4285652" cy="1019604"/>
                     </a:xfrm>
                     <a:prstGeom prst="rect">
                       <a:avLst/>
@@ -1965,16 +2454,56 @@
     <w:p>
       <w:pPr>
         <w:rPr>
-          <w:sz w:val="24"/>
-          <w:szCs w:val="24"/>
-        </w:rPr>
-      </w:pPr>
-      <w:r>
-        <w:rPr>
-          <w:sz w:val="24"/>
-          <w:szCs w:val="24"/>
-        </w:rPr>
-        <w:t>Refactoricé el proyecto de java, añadiendo información sobre variables, clases y métodos:</w:t>
+          <w:b/>
+          <w:bCs/>
+          <w:sz w:val="24"/>
+          <w:szCs w:val="24"/>
+        </w:rPr>
+      </w:pPr>
+      <w:r>
+        <w:rPr>
+          <w:b/>
+          <w:bCs/>
+          <w:sz w:val="24"/>
+          <w:szCs w:val="24"/>
+        </w:rPr>
+        <w:t xml:space="preserve">Vista </w:t>
+      </w:r>
+      <w:r>
+        <w:rPr>
+          <w:b/>
+          <w:bCs/>
+          <w:sz w:val="24"/>
+          <w:szCs w:val="24"/>
+        </w:rPr>
+        <w:t>3</w:t>
+      </w:r>
+      <w:r>
+        <w:rPr>
+          <w:b/>
+          <w:bCs/>
+          <w:sz w:val="24"/>
+          <w:szCs w:val="24"/>
+        </w:rPr>
+        <w:t xml:space="preserve"> (Devolver</w:t>
+      </w:r>
+      <w:r>
+        <w:rPr>
+          <w:b/>
+          <w:bCs/>
+          <w:sz w:val="24"/>
+          <w:szCs w:val="24"/>
+        </w:rPr>
+        <w:t xml:space="preserve"> las imágenes de la galería del evento del 12-01-2026</w:t>
+      </w:r>
+      <w:r>
+        <w:rPr>
+          <w:b/>
+          <w:bCs/>
+          <w:sz w:val="24"/>
+          <w:szCs w:val="24"/>
+        </w:rPr>
+        <w:t xml:space="preserve">): </w:t>
       </w:r>
     </w:p>
     <w:p>
@@ -1987,15 +2516,12 @@
       <w:r>
         <w:rPr>
           <w:noProof/>
-          <w:sz w:val="24"/>
-          <w:szCs w:val="24"/>
-        </w:rPr>
-        <w:lastRenderedPageBreak/>
+        </w:rPr>
         <w:drawing>
-          <wp:inline distT="0" distB="0" distL="0" distR="0" wp14:anchorId="7B6F819C" wp14:editId="41DAAB6E">
-            <wp:extent cx="3604846" cy="3080482"/>
-            <wp:effectExtent l="0" t="0" r="0" b="5715"/>
-            <wp:docPr id="308616671" name="Imagen 1"/>
+          <wp:inline distT="0" distB="0" distL="0" distR="0" wp14:anchorId="06151CEE" wp14:editId="5E83A791">
+            <wp:extent cx="4168140" cy="1370918"/>
+            <wp:effectExtent l="0" t="0" r="3810" b="1270"/>
+            <wp:docPr id="2018816636" name="Imagen 1"/>
             <wp:cNvGraphicFramePr>
               <a:graphicFrameLocks xmlns:a="http://schemas.openxmlformats.org/drawingml/2006/main" noChangeAspect="1"/>
             </wp:cNvGraphicFramePr>
@@ -2003,7 +2529,7 @@
               <a:graphicData uri="http://schemas.openxmlformats.org/drawingml/2006/picture">
                 <pic:pic xmlns:pic="http://schemas.openxmlformats.org/drawingml/2006/picture">
                   <pic:nvPicPr>
-                    <pic:cNvPr id="308616671" name=""/>
+                    <pic:cNvPr id="2018816636" name=""/>
                     <pic:cNvPicPr/>
                   </pic:nvPicPr>
                   <pic:blipFill>
@@ -2015,7 +2541,7 @@
                   <pic:spPr>
                     <a:xfrm>
                       <a:off x="0" y="0"/>
-                      <a:ext cx="3606468" cy="3081868"/>
+                      <a:ext cx="4172760" cy="1372438"/>
                     </a:xfrm>
                     <a:prstGeom prst="rect">
                       <a:avLst/>
@@ -2037,116 +2563,14 @@
       </w:pPr>
       <w:r>
         <w:rPr>
-          <w:sz w:val="24"/>
-          <w:szCs w:val="24"/>
-        </w:rPr>
-        <w:br w:type="page"/>
-      </w:r>
-    </w:p>
-    <w:p>
-      <w:pPr>
-        <w:rPr>
-          <w:sz w:val="24"/>
-          <w:szCs w:val="24"/>
-        </w:rPr>
-      </w:pPr>
-      <w:r>
-        <w:rPr>
-          <w:sz w:val="24"/>
-          <w:szCs w:val="24"/>
+          <w:noProof/>
         </w:rPr>
         <w:lastRenderedPageBreak/>
-        <w:t>DÍA 6 (6/4/2026):</w:t>
-      </w:r>
-    </w:p>
-    <w:p>
-      <w:pPr>
-        <w:rPr>
-          <w:sz w:val="24"/>
-          <w:szCs w:val="24"/>
-          <w:u w:val="single"/>
-        </w:rPr>
-      </w:pPr>
-      <w:r>
-        <w:rPr>
-          <w:sz w:val="24"/>
-          <w:szCs w:val="24"/>
-        </w:rPr>
-        <w:t xml:space="preserve">Footer hecho al completo, junto a su diseño en </w:t>
-      </w:r>
-      <w:proofErr w:type="spellStart"/>
-      <w:r>
-        <w:rPr>
-          <w:sz w:val="24"/>
-          <w:szCs w:val="24"/>
-        </w:rPr>
-        <w:t>figma</w:t>
-      </w:r>
-      <w:proofErr w:type="spellEnd"/>
-      <w:r>
-        <w:rPr>
-          <w:sz w:val="24"/>
-          <w:szCs w:val="24"/>
-          <w:u w:val="single"/>
-        </w:rPr>
-        <w:t>:</w:t>
-      </w:r>
-    </w:p>
-    <w:p>
-      <w:pPr>
-        <w:rPr>
-          <w:sz w:val="24"/>
-          <w:szCs w:val="24"/>
-          <w:u w:val="single"/>
-        </w:rPr>
-      </w:pPr>
-    </w:p>
-    <w:p>
-      <w:pPr>
-        <w:rPr>
-          <w:sz w:val="24"/>
-          <w:szCs w:val="24"/>
-          <w:u w:val="single"/>
-        </w:rPr>
-      </w:pPr>
-      <w:r>
-        <w:rPr>
-          <w:sz w:val="24"/>
-          <w:szCs w:val="24"/>
-          <w:u w:val="single"/>
-        </w:rPr>
-        <w:t xml:space="preserve">Parte de </w:t>
-      </w:r>
-      <w:proofErr w:type="spellStart"/>
-      <w:r>
-        <w:rPr>
-          <w:sz w:val="24"/>
-          <w:szCs w:val="24"/>
-          <w:u w:val="single"/>
-        </w:rPr>
-        <w:t>figma</w:t>
-      </w:r>
-      <w:proofErr w:type="spellEnd"/>
-    </w:p>
-    <w:p>
-      <w:pPr>
-        <w:rPr>
-          <w:sz w:val="24"/>
-          <w:szCs w:val="24"/>
-          <w:u w:val="single"/>
-        </w:rPr>
-      </w:pPr>
-      <w:r>
-        <w:rPr>
-          <w:noProof/>
-          <w:sz w:val="24"/>
-          <w:szCs w:val="24"/>
-        </w:rPr>
         <w:drawing>
-          <wp:inline distT="0" distB="0" distL="0" distR="0" wp14:anchorId="7F009E38" wp14:editId="4458A08D">
-            <wp:extent cx="5400040" cy="1069975"/>
-            <wp:effectExtent l="0" t="0" r="0" b="0"/>
-            <wp:docPr id="381399511" name="Imagen 1"/>
+          <wp:inline distT="0" distB="0" distL="0" distR="0" wp14:anchorId="32264947" wp14:editId="01D5F17A">
+            <wp:extent cx="4829175" cy="1047750"/>
+            <wp:effectExtent l="0" t="0" r="9525" b="0"/>
+            <wp:docPr id="1634788485" name="Imagen 1"/>
             <wp:cNvGraphicFramePr>
               <a:graphicFrameLocks xmlns:a="http://schemas.openxmlformats.org/drawingml/2006/main" noChangeAspect="1"/>
             </wp:cNvGraphicFramePr>
@@ -2154,7 +2578,7 @@
               <a:graphicData uri="http://schemas.openxmlformats.org/drawingml/2006/picture">
                 <pic:pic xmlns:pic="http://schemas.openxmlformats.org/drawingml/2006/picture">
                   <pic:nvPicPr>
-                    <pic:cNvPr id="381399511" name=""/>
+                    <pic:cNvPr id="1634788485" name=""/>
                     <pic:cNvPicPr/>
                   </pic:nvPicPr>
                   <pic:blipFill>
@@ -2166,7 +2590,7 @@
                   <pic:spPr>
                     <a:xfrm>
                       <a:off x="0" y="0"/>
-                      <a:ext cx="5400040" cy="1069975"/>
+                      <a:ext cx="4829175" cy="1047750"/>
                     </a:xfrm>
                     <a:prstGeom prst="rect">
                       <a:avLst/>
@@ -2182,38 +2606,39 @@
     <w:p>
       <w:pPr>
         <w:rPr>
-          <w:sz w:val="24"/>
-          <w:szCs w:val="24"/>
-          <w:u w:val="single"/>
-        </w:rPr>
-      </w:pPr>
-    </w:p>
-    <w:p>
-      <w:pPr>
-        <w:rPr>
-          <w:sz w:val="24"/>
-          <w:szCs w:val="24"/>
-          <w:u w:val="single"/>
-        </w:rPr>
-      </w:pPr>
-      <w:r>
-        <w:rPr>
-          <w:sz w:val="24"/>
-          <w:szCs w:val="24"/>
-          <w:u w:val="single"/>
-        </w:rPr>
-        <w:t xml:space="preserve">Parte de </w:t>
-      </w:r>
-      <w:proofErr w:type="spellStart"/>
-      <w:r>
-        <w:rPr>
-          <w:sz w:val="24"/>
-          <w:szCs w:val="24"/>
-          <w:u w:val="single"/>
-        </w:rPr>
-        <w:t>html</w:t>
-      </w:r>
-      <w:proofErr w:type="spellEnd"/>
+          <w:b/>
+          <w:bCs/>
+          <w:sz w:val="24"/>
+          <w:szCs w:val="24"/>
+        </w:rPr>
+      </w:pPr>
+      <w:r>
+        <w:rPr>
+          <w:b/>
+          <w:bCs/>
+          <w:sz w:val="24"/>
+          <w:szCs w:val="24"/>
+        </w:rPr>
+        <w:t xml:space="preserve">Vista </w:t>
+      </w:r>
+      <w:r>
+        <w:rPr>
+          <w:b/>
+          <w:bCs/>
+          <w:sz w:val="24"/>
+          <w:szCs w:val="24"/>
+        </w:rPr>
+        <w:t>4 (Devolver los eventos favoritos del usuario 2 posteriores al 28-02-2026</w:t>
+      </w:r>
+      <w:r>
+        <w:rPr>
+          <w:b/>
+          <w:bCs/>
+          <w:sz w:val="24"/>
+          <w:szCs w:val="24"/>
+        </w:rPr>
+        <w:t>):</w:t>
+      </w:r>
     </w:p>
     <w:p>
       <w:pPr>
@@ -2225,14 +2650,12 @@
       <w:r>
         <w:rPr>
           <w:noProof/>
-          <w:sz w:val="24"/>
-          <w:szCs w:val="24"/>
         </w:rPr>
         <w:drawing>
-          <wp:inline distT="0" distB="0" distL="0" distR="0" wp14:anchorId="32236E7F" wp14:editId="1172BF43">
-            <wp:extent cx="5400040" cy="1419860"/>
-            <wp:effectExtent l="0" t="0" r="0" b="8890"/>
-            <wp:docPr id="2005574894" name="Imagen 1"/>
+          <wp:inline distT="0" distB="0" distL="0" distR="0" wp14:anchorId="394BEE10" wp14:editId="3D94E0DF">
+            <wp:extent cx="4091940" cy="1452196"/>
+            <wp:effectExtent l="0" t="0" r="3810" b="0"/>
+            <wp:docPr id="1480426017" name="Imagen 1"/>
             <wp:cNvGraphicFramePr>
               <a:graphicFrameLocks xmlns:a="http://schemas.openxmlformats.org/drawingml/2006/main" noChangeAspect="1"/>
             </wp:cNvGraphicFramePr>
@@ -2240,7 +2663,7 @@
               <a:graphicData uri="http://schemas.openxmlformats.org/drawingml/2006/picture">
                 <pic:pic xmlns:pic="http://schemas.openxmlformats.org/drawingml/2006/picture">
                   <pic:nvPicPr>
-                    <pic:cNvPr id="2005574894" name=""/>
+                    <pic:cNvPr id="1480426017" name=""/>
                     <pic:cNvPicPr/>
                   </pic:nvPicPr>
                   <pic:blipFill>
@@ -2252,7 +2675,7 @@
                   <pic:spPr>
                     <a:xfrm>
                       <a:off x="0" y="0"/>
-                      <a:ext cx="5400040" cy="1419860"/>
+                      <a:ext cx="4097538" cy="1454183"/>
                     </a:xfrm>
                     <a:prstGeom prst="rect">
                       <a:avLst/>
@@ -2274,100 +2697,13 @@
       </w:pPr>
       <w:r>
         <w:rPr>
-          <w:sz w:val="24"/>
-          <w:szCs w:val="24"/>
-        </w:rPr>
-        <w:t>También cambié la estructura de carpetas de la web.</w:t>
-      </w:r>
-    </w:p>
-    <w:p>
-      <w:pPr>
-        <w:rPr>
-          <w:sz w:val="24"/>
-          <w:szCs w:val="24"/>
-        </w:rPr>
-      </w:pPr>
-      <w:r>
-        <w:rPr>
-          <w:sz w:val="24"/>
-          <w:szCs w:val="24"/>
-        </w:rPr>
-        <w:br w:type="page"/>
-      </w:r>
-    </w:p>
-    <w:p>
-      <w:pPr>
-        <w:rPr>
-          <w:sz w:val="24"/>
-          <w:szCs w:val="24"/>
-        </w:rPr>
-      </w:pPr>
-      <w:r>
-        <w:rPr>
-          <w:sz w:val="24"/>
-          <w:szCs w:val="24"/>
-        </w:rPr>
-        <w:lastRenderedPageBreak/>
-        <w:t>DÍA 7 (7/4/2026):</w:t>
-      </w:r>
-    </w:p>
-    <w:p>
-      <w:pPr>
-        <w:rPr>
-          <w:sz w:val="24"/>
-          <w:szCs w:val="24"/>
-        </w:rPr>
-      </w:pPr>
-      <w:r>
-        <w:rPr>
-          <w:sz w:val="24"/>
-          <w:szCs w:val="24"/>
-        </w:rPr>
-        <w:t xml:space="preserve">Rehice la web en </w:t>
-      </w:r>
-      <w:proofErr w:type="spellStart"/>
-      <w:r>
-        <w:rPr>
-          <w:sz w:val="24"/>
-          <w:szCs w:val="24"/>
-        </w:rPr>
-        <w:t>React</w:t>
-      </w:r>
-      <w:proofErr w:type="spellEnd"/>
-      <w:r>
-        <w:rPr>
-          <w:sz w:val="24"/>
-          <w:szCs w:val="24"/>
-        </w:rPr>
-        <w:t xml:space="preserve">. No me llevó mucho ya que la mayoría del proceso era copiar y pegar código de la web ya hecha en nuevos componentes. </w:t>
-      </w:r>
-    </w:p>
-    <w:p>
-      <w:pPr>
-        <w:rPr>
-          <w:sz w:val="24"/>
-          <w:szCs w:val="24"/>
-        </w:rPr>
-      </w:pPr>
-    </w:p>
-    <w:p>
-      <w:pPr>
-        <w:rPr>
-          <w:sz w:val="24"/>
-          <w:szCs w:val="24"/>
-        </w:rPr>
-      </w:pPr>
-      <w:r>
-        <w:rPr>
           <w:noProof/>
-          <w:sz w:val="24"/>
-          <w:szCs w:val="24"/>
         </w:rPr>
         <w:drawing>
-          <wp:inline distT="0" distB="0" distL="0" distR="0" wp14:anchorId="750BD0BE" wp14:editId="310CD81A">
-            <wp:extent cx="2423639" cy="4495800"/>
-            <wp:effectExtent l="0" t="0" r="0" b="0"/>
-            <wp:docPr id="592566613" name="Imagen 1"/>
+          <wp:inline distT="0" distB="0" distL="0" distR="0" wp14:anchorId="23665FD9" wp14:editId="20AD3494">
+            <wp:extent cx="5400040" cy="982345"/>
+            <wp:effectExtent l="0" t="0" r="0" b="8255"/>
+            <wp:docPr id="1819326095" name="Imagen 1"/>
             <wp:cNvGraphicFramePr>
               <a:graphicFrameLocks xmlns:a="http://schemas.openxmlformats.org/drawingml/2006/main" noChangeAspect="1"/>
             </wp:cNvGraphicFramePr>
@@ -2375,7 +2711,7 @@
               <a:graphicData uri="http://schemas.openxmlformats.org/drawingml/2006/picture">
                 <pic:pic xmlns:pic="http://schemas.openxmlformats.org/drawingml/2006/picture">
                   <pic:nvPicPr>
-                    <pic:cNvPr id="592566613" name=""/>
+                    <pic:cNvPr id="1819326095" name=""/>
                     <pic:cNvPicPr/>
                   </pic:nvPicPr>
                   <pic:blipFill>
@@ -2387,7 +2723,7 @@
                   <pic:spPr>
                     <a:xfrm>
                       <a:off x="0" y="0"/>
-                      <a:ext cx="2434938" cy="4516760"/>
+                      <a:ext cx="5400040" cy="982345"/>
                     </a:xfrm>
                     <a:prstGeom prst="rect">
                       <a:avLst/>
@@ -2417,33 +2753,57 @@
     </w:p>
     <w:p>
       <w:pPr>
-        <w:rPr>
-          <w:sz w:val="24"/>
-          <w:szCs w:val="24"/>
-        </w:rPr>
-      </w:pPr>
-      <w:r>
-        <w:rPr>
-          <w:sz w:val="24"/>
-          <w:szCs w:val="24"/>
+        <w:jc w:val="center"/>
+        <w:rPr>
+          <w:b/>
+          <w:bCs/>
+          <w:sz w:val="40"/>
+          <w:szCs w:val="40"/>
+        </w:rPr>
+      </w:pPr>
+      <w:r>
+        <w:rPr>
+          <w:b/>
+          <w:bCs/>
+          <w:sz w:val="40"/>
+          <w:szCs w:val="40"/>
         </w:rPr>
         <w:lastRenderedPageBreak/>
-        <w:t>DÍA 8 (8/4/2026):</w:t>
-      </w:r>
-    </w:p>
-    <w:p>
-      <w:pPr>
-        <w:rPr>
-          <w:sz w:val="24"/>
-          <w:szCs w:val="24"/>
-        </w:rPr>
-      </w:pPr>
-      <w:r>
-        <w:rPr>
-          <w:sz w:val="24"/>
-          <w:szCs w:val="24"/>
-        </w:rPr>
-        <w:t>Creé un archivo JSON con los eventos que creé. La web automáticamente lee el archivo y añade los eventos al HTML de la web.</w:t>
+        <w:t>PROGRAMACIÓN</w:t>
+      </w:r>
+    </w:p>
+    <w:p>
+      <w:pPr>
+        <w:rPr>
+          <w:b/>
+          <w:bCs/>
+          <w:sz w:val="28"/>
+          <w:szCs w:val="28"/>
+        </w:rPr>
+      </w:pPr>
+      <w:r>
+        <w:rPr>
+          <w:b/>
+          <w:bCs/>
+          <w:sz w:val="28"/>
+          <w:szCs w:val="28"/>
+        </w:rPr>
+        <w:t>El menú</w:t>
+      </w:r>
+    </w:p>
+    <w:p>
+      <w:pPr>
+        <w:rPr>
+          <w:sz w:val="24"/>
+          <w:szCs w:val="24"/>
+        </w:rPr>
+      </w:pPr>
+      <w:r>
+        <w:rPr>
+          <w:sz w:val="24"/>
+          <w:szCs w:val="24"/>
+        </w:rPr>
+        <w:t>Al iniciar el programa, el usuario se encuentra un menú con las siguientes opciones:</w:t>
       </w:r>
     </w:p>
     <w:p>
@@ -2456,14 +2816,12 @@
       <w:r>
         <w:rPr>
           <w:noProof/>
-          <w:sz w:val="24"/>
-          <w:szCs w:val="24"/>
         </w:rPr>
         <w:drawing>
-          <wp:inline distT="0" distB="0" distL="0" distR="0" wp14:anchorId="63834AB8" wp14:editId="6BDCC0D0">
-            <wp:extent cx="4454769" cy="2199097"/>
-            <wp:effectExtent l="0" t="0" r="3175" b="0"/>
-            <wp:docPr id="1028923622" name="Imagen 1"/>
+          <wp:inline distT="0" distB="0" distL="0" distR="0" wp14:anchorId="4CE8F0B7" wp14:editId="59075E7D">
+            <wp:extent cx="1775460" cy="2116139"/>
+            <wp:effectExtent l="0" t="0" r="0" b="0"/>
+            <wp:docPr id="1219167853" name="Imagen 1"/>
             <wp:cNvGraphicFramePr>
               <a:graphicFrameLocks xmlns:a="http://schemas.openxmlformats.org/drawingml/2006/main" noChangeAspect="1"/>
             </wp:cNvGraphicFramePr>
@@ -2471,7 +2829,7 @@
               <a:graphicData uri="http://schemas.openxmlformats.org/drawingml/2006/picture">
                 <pic:pic xmlns:pic="http://schemas.openxmlformats.org/drawingml/2006/picture">
                   <pic:nvPicPr>
-                    <pic:cNvPr id="1028923622" name=""/>
+                    <pic:cNvPr id="1219167853" name=""/>
                     <pic:cNvPicPr/>
                   </pic:nvPicPr>
                   <pic:blipFill>
@@ -2483,7 +2841,7 @@
                   <pic:spPr>
                     <a:xfrm>
                       <a:off x="0" y="0"/>
-                      <a:ext cx="4460065" cy="2201712"/>
+                      <a:ext cx="1779066" cy="2120437"/>
                     </a:xfrm>
                     <a:prstGeom prst="rect">
                       <a:avLst/>
@@ -2499,92 +2857,140 @@
     <w:p>
       <w:pPr>
         <w:rPr>
-          <w:sz w:val="24"/>
-          <w:szCs w:val="24"/>
-        </w:rPr>
-      </w:pPr>
-      <w:r>
-        <w:rPr>
-          <w:sz w:val="24"/>
-          <w:szCs w:val="24"/>
-        </w:rPr>
-        <w:t xml:space="preserve">Al principio tenía pensado hacerlo con </w:t>
-      </w:r>
-      <w:proofErr w:type="gramStart"/>
-      <w:r>
-        <w:rPr>
-          <w:sz w:val="24"/>
-          <w:szCs w:val="24"/>
-        </w:rPr>
-        <w:t>XML</w:t>
-      </w:r>
-      <w:proofErr w:type="gramEnd"/>
-      <w:r>
-        <w:rPr>
-          <w:sz w:val="24"/>
-          <w:szCs w:val="24"/>
-        </w:rPr>
-        <w:t xml:space="preserve"> pero tras buscar en Google cómo hacerlo, llegué a la conclusión de que era demasiado complicado y viejo comparado con JSON. El JSON tiene los nombres de las imágenes.</w:t>
-      </w:r>
-    </w:p>
-    <w:p>
-      <w:pPr>
-        <w:rPr>
-          <w:sz w:val="24"/>
-          <w:szCs w:val="24"/>
-        </w:rPr>
-      </w:pPr>
-    </w:p>
-    <w:p>
-      <w:pPr>
-        <w:rPr>
-          <w:sz w:val="24"/>
-          <w:szCs w:val="24"/>
-        </w:rPr>
-      </w:pPr>
-      <w:r>
-        <w:rPr>
-          <w:sz w:val="24"/>
-          <w:szCs w:val="24"/>
-        </w:rPr>
-        <w:t>Debido a que ahora tengo la fecha de cada evento su campo correspondiente, la web podrá filtrar eventos por fecha. Esto sirve para ver eventos próximos o pasados.</w:t>
-      </w:r>
-      <w:r>
-        <w:rPr>
-          <w:sz w:val="24"/>
-          <w:szCs w:val="24"/>
-        </w:rPr>
-        <w:t xml:space="preserve"> Esto lo hice leyendo la fecha del evento y cambiando su formato a uno específico para poder compararla con otra fecha.</w:t>
-      </w:r>
-      <w:r>
-        <w:rPr>
-          <w:sz w:val="24"/>
-          <w:szCs w:val="24"/>
-        </w:rPr>
-        <w:t xml:space="preserve"> Al llamar el componente de la tarjeta del evento, se pasa la fecha que se quiere filtrar. Si el evento es </w:t>
-      </w:r>
-      <w:proofErr w:type="gramStart"/>
-      <w:r>
-        <w:rPr>
-          <w:sz w:val="24"/>
-          <w:szCs w:val="24"/>
-        </w:rPr>
-        <w:t>próximo</w:t>
-      </w:r>
-      <w:proofErr w:type="gramEnd"/>
-      <w:r>
-        <w:rPr>
-          <w:sz w:val="24"/>
-          <w:szCs w:val="24"/>
-        </w:rPr>
-        <w:t xml:space="preserve"> pero se quieren ver los pasados, el componente no devuelve nada.</w:t>
-      </w:r>
-      <w:r>
-        <w:rPr>
-          <w:sz w:val="24"/>
-          <w:szCs w:val="24"/>
-        </w:rPr>
-        <w:t xml:space="preserve"> Es lo mismo al revés.</w:t>
+          <w:b/>
+          <w:bCs/>
+          <w:sz w:val="28"/>
+          <w:szCs w:val="28"/>
+        </w:rPr>
+      </w:pPr>
+    </w:p>
+    <w:p>
+      <w:pPr>
+        <w:rPr>
+          <w:b/>
+          <w:bCs/>
+          <w:sz w:val="28"/>
+          <w:szCs w:val="28"/>
+        </w:rPr>
+      </w:pPr>
+    </w:p>
+    <w:p>
+      <w:pPr>
+        <w:rPr>
+          <w:b/>
+          <w:bCs/>
+          <w:sz w:val="28"/>
+          <w:szCs w:val="28"/>
+        </w:rPr>
+      </w:pPr>
+    </w:p>
+    <w:p>
+      <w:pPr>
+        <w:rPr>
+          <w:b/>
+          <w:bCs/>
+          <w:sz w:val="28"/>
+          <w:szCs w:val="28"/>
+        </w:rPr>
+      </w:pPr>
+      <w:r>
+        <w:rPr>
+          <w:b/>
+          <w:bCs/>
+          <w:sz w:val="28"/>
+          <w:szCs w:val="28"/>
+        </w:rPr>
+        <w:t>Opción 1:</w:t>
+      </w:r>
+    </w:p>
+    <w:p>
+      <w:pPr>
+        <w:rPr>
+          <w:sz w:val="24"/>
+          <w:szCs w:val="24"/>
+        </w:rPr>
+      </w:pPr>
+      <w:r>
+        <w:rPr>
+          <w:sz w:val="24"/>
+          <w:szCs w:val="24"/>
+        </w:rPr>
+        <w:t>Se inicia el menú de creación de usuario.</w:t>
+      </w:r>
+    </w:p>
+    <w:p>
+      <w:pPr>
+        <w:rPr>
+          <w:sz w:val="24"/>
+          <w:szCs w:val="24"/>
+        </w:rPr>
+      </w:pPr>
+      <w:r>
+        <w:rPr>
+          <w:sz w:val="24"/>
+          <w:szCs w:val="24"/>
+        </w:rPr>
+        <w:t>La información requerida para crear un usuario es:</w:t>
+      </w:r>
+    </w:p>
+    <w:p>
+      <w:pPr>
+        <w:pStyle w:val="Prrafodelista"/>
+        <w:numPr>
+          <w:ilvl w:val="0"/>
+          <w:numId w:val="2"/>
+        </w:numPr>
+        <w:rPr>
+          <w:sz w:val="24"/>
+          <w:szCs w:val="24"/>
+        </w:rPr>
+      </w:pPr>
+      <w:r>
+        <w:rPr>
+          <w:sz w:val="24"/>
+          <w:szCs w:val="24"/>
+        </w:rPr>
+        <w:t>Nombre</w:t>
+      </w:r>
+    </w:p>
+    <w:p>
+      <w:pPr>
+        <w:pStyle w:val="Prrafodelista"/>
+        <w:numPr>
+          <w:ilvl w:val="0"/>
+          <w:numId w:val="2"/>
+        </w:numPr>
+        <w:rPr>
+          <w:sz w:val="24"/>
+          <w:szCs w:val="24"/>
+        </w:rPr>
+      </w:pPr>
+      <w:r>
+        <w:rPr>
+          <w:sz w:val="24"/>
+          <w:szCs w:val="24"/>
+        </w:rPr>
+        <w:t>Email del usuario (único)</w:t>
+      </w:r>
+    </w:p>
+    <w:p>
+      <w:pPr>
+        <w:pStyle w:val="Prrafodelista"/>
+        <w:numPr>
+          <w:ilvl w:val="0"/>
+          <w:numId w:val="2"/>
+        </w:numPr>
+        <w:rPr>
+          <w:sz w:val="24"/>
+          <w:szCs w:val="24"/>
+        </w:rPr>
+      </w:pPr>
+      <w:r>
+        <w:rPr>
+          <w:sz w:val="24"/>
+          <w:szCs w:val="24"/>
+        </w:rPr>
+        <w:t>Contraseña</w:t>
       </w:r>
     </w:p>
     <w:p>
@@ -2597,14 +3003,12 @@
       <w:r>
         <w:rPr>
           <w:noProof/>
-          <w:sz w:val="24"/>
-          <w:szCs w:val="24"/>
         </w:rPr>
         <w:drawing>
-          <wp:inline distT="0" distB="0" distL="0" distR="0" wp14:anchorId="7F6B09F1" wp14:editId="0C4068D4">
-            <wp:extent cx="5400040" cy="2355850"/>
-            <wp:effectExtent l="0" t="0" r="0" b="6350"/>
-            <wp:docPr id="1171708704" name="Imagen 1"/>
+          <wp:inline distT="0" distB="0" distL="0" distR="0" wp14:anchorId="17AB88B4" wp14:editId="07D96244">
+            <wp:extent cx="3589020" cy="1754983"/>
+            <wp:effectExtent l="0" t="0" r="0" b="0"/>
+            <wp:docPr id="1135892817" name="Imagen 1"/>
             <wp:cNvGraphicFramePr>
               <a:graphicFrameLocks xmlns:a="http://schemas.openxmlformats.org/drawingml/2006/main" noChangeAspect="1"/>
             </wp:cNvGraphicFramePr>
@@ -2612,7 +3016,7 @@
               <a:graphicData uri="http://schemas.openxmlformats.org/drawingml/2006/picture">
                 <pic:pic xmlns:pic="http://schemas.openxmlformats.org/drawingml/2006/picture">
                   <pic:nvPicPr>
-                    <pic:cNvPr id="1171708704" name=""/>
+                    <pic:cNvPr id="1135892817" name=""/>
                     <pic:cNvPicPr/>
                   </pic:nvPicPr>
                   <pic:blipFill>
@@ -2624,7 +3028,7 @@
                   <pic:spPr>
                     <a:xfrm>
                       <a:off x="0" y="0"/>
-                      <a:ext cx="5400040" cy="2355850"/>
+                      <a:ext cx="3595202" cy="1758006"/>
                     </a:xfrm>
                     <a:prstGeom prst="rect">
                       <a:avLst/>
@@ -2649,58 +3053,26 @@
           <w:sz w:val="24"/>
           <w:szCs w:val="24"/>
         </w:rPr>
-        <w:br w:type="page"/>
-      </w:r>
-    </w:p>
-    <w:p>
-      <w:pPr>
-        <w:rPr>
-          <w:sz w:val="24"/>
-          <w:szCs w:val="24"/>
-        </w:rPr>
-      </w:pPr>
-      <w:r>
-        <w:rPr>
-          <w:sz w:val="24"/>
-          <w:szCs w:val="24"/>
+        <w:t>En el caso de que se inserte un email ya registrado, el programa lanzará un error diciendo que el usuario ya existe, por lo que no podrá ser creado.</w:t>
+      </w:r>
+    </w:p>
+    <w:p>
+      <w:pPr>
+        <w:rPr>
+          <w:sz w:val="24"/>
+          <w:szCs w:val="24"/>
+        </w:rPr>
+      </w:pPr>
+      <w:r>
+        <w:rPr>
+          <w:noProof/>
         </w:rPr>
         <w:lastRenderedPageBreak/>
-        <w:t>DÍA 9 (9/4/2026):</w:t>
-      </w:r>
-    </w:p>
-    <w:p>
-      <w:pPr>
-        <w:rPr>
-          <w:sz w:val="24"/>
-          <w:szCs w:val="24"/>
-        </w:rPr>
-      </w:pPr>
-      <w:r>
-        <w:rPr>
-          <w:sz w:val="24"/>
-          <w:szCs w:val="24"/>
-        </w:rPr>
-        <w:t>Terminé de crear las tarjetas de evento:</w:t>
-      </w:r>
-    </w:p>
-    <w:p>
-      <w:pPr>
-        <w:rPr>
-          <w:sz w:val="24"/>
-          <w:szCs w:val="24"/>
-        </w:rPr>
-      </w:pPr>
-      <w:r>
-        <w:rPr>
-          <w:noProof/>
-          <w:sz w:val="24"/>
-          <w:szCs w:val="24"/>
-        </w:rPr>
         <w:drawing>
-          <wp:inline distT="0" distB="0" distL="0" distR="0" wp14:anchorId="43A2E79E" wp14:editId="70D6297E">
-            <wp:extent cx="5400040" cy="704850"/>
-            <wp:effectExtent l="0" t="0" r="0" b="0"/>
-            <wp:docPr id="1487067961" name="Imagen 1"/>
+          <wp:inline distT="0" distB="0" distL="0" distR="0" wp14:anchorId="324DBE2F" wp14:editId="702BE903">
+            <wp:extent cx="3291840" cy="1545007"/>
+            <wp:effectExtent l="0" t="0" r="3810" b="0"/>
+            <wp:docPr id="2049914446" name="Imagen 1"/>
             <wp:cNvGraphicFramePr>
               <a:graphicFrameLocks xmlns:a="http://schemas.openxmlformats.org/drawingml/2006/main" noChangeAspect="1"/>
             </wp:cNvGraphicFramePr>
@@ -2708,7 +3080,7 @@
               <a:graphicData uri="http://schemas.openxmlformats.org/drawingml/2006/picture">
                 <pic:pic xmlns:pic="http://schemas.openxmlformats.org/drawingml/2006/picture">
                   <pic:nvPicPr>
-                    <pic:cNvPr id="1487067961" name=""/>
+                    <pic:cNvPr id="2049914446" name=""/>
                     <pic:cNvPicPr/>
                   </pic:nvPicPr>
                   <pic:blipFill>
@@ -2720,7 +3092,7 @@
                   <pic:spPr>
                     <a:xfrm>
                       <a:off x="0" y="0"/>
-                      <a:ext cx="5400040" cy="704850"/>
+                      <a:ext cx="3297203" cy="1547524"/>
                     </a:xfrm>
                     <a:prstGeom prst="rect">
                       <a:avLst/>
@@ -2740,50 +3112,62 @@
           <w:szCs w:val="24"/>
         </w:rPr>
       </w:pPr>
-      <w:r>
-        <w:rPr>
-          <w:sz w:val="24"/>
-          <w:szCs w:val="24"/>
-        </w:rPr>
-        <w:t>Las tarjetas de evento ahora tienen un botón de Ver más. En el futuro servirá para enlazar con la página del evento.</w:t>
-      </w:r>
-    </w:p>
-    <w:p>
-      <w:pPr>
-        <w:rPr>
-          <w:sz w:val="24"/>
-          <w:szCs w:val="24"/>
-        </w:rPr>
-      </w:pPr>
-    </w:p>
-    <w:p>
-      <w:pPr>
-        <w:rPr>
-          <w:sz w:val="24"/>
-          <w:szCs w:val="24"/>
-        </w:rPr>
-      </w:pPr>
-      <w:r>
-        <w:rPr>
-          <w:sz w:val="24"/>
-          <w:szCs w:val="24"/>
-        </w:rPr>
-        <w:t>Terminé de implementar y perfeccionar el sistema de filtrar eventos.</w:t>
-      </w:r>
-    </w:p>
-    <w:p>
-      <w:pPr>
-        <w:rPr>
-          <w:sz w:val="24"/>
-          <w:szCs w:val="24"/>
-        </w:rPr>
-      </w:pPr>
-      <w:r>
-        <w:rPr>
-          <w:sz w:val="24"/>
-          <w:szCs w:val="24"/>
-        </w:rPr>
-        <w:t>También creé la página de Historial de Eventos:</w:t>
+    </w:p>
+    <w:p>
+      <w:pPr>
+        <w:rPr>
+          <w:sz w:val="24"/>
+          <w:szCs w:val="24"/>
+        </w:rPr>
+      </w:pPr>
+    </w:p>
+    <w:p>
+      <w:pPr>
+        <w:rPr>
+          <w:b/>
+          <w:bCs/>
+          <w:sz w:val="28"/>
+          <w:szCs w:val="28"/>
+        </w:rPr>
+      </w:pPr>
+      <w:r>
+        <w:rPr>
+          <w:b/>
+          <w:bCs/>
+          <w:sz w:val="28"/>
+          <w:szCs w:val="28"/>
+        </w:rPr>
+        <w:t>Opción 2:</w:t>
+      </w:r>
+    </w:p>
+    <w:p>
+      <w:pPr>
+        <w:rPr>
+          <w:sz w:val="24"/>
+          <w:szCs w:val="24"/>
+        </w:rPr>
+      </w:pPr>
+      <w:r>
+        <w:rPr>
+          <w:sz w:val="24"/>
+          <w:szCs w:val="24"/>
+        </w:rPr>
+        <w:t>Se inicia el menú de borrado de usuario.</w:t>
+      </w:r>
+    </w:p>
+    <w:p>
+      <w:pPr>
+        <w:rPr>
+          <w:sz w:val="24"/>
+          <w:szCs w:val="24"/>
+        </w:rPr>
+      </w:pPr>
+      <w:r>
+        <w:rPr>
+          <w:sz w:val="24"/>
+          <w:szCs w:val="24"/>
+        </w:rPr>
+        <w:t>La información requerida para eliminar un usuario es su email:</w:t>
       </w:r>
     </w:p>
     <w:p>
@@ -2796,14 +3180,12 @@
       <w:r>
         <w:rPr>
           <w:noProof/>
-          <w:sz w:val="24"/>
-          <w:szCs w:val="24"/>
         </w:rPr>
         <w:drawing>
-          <wp:inline distT="0" distB="0" distL="0" distR="0" wp14:anchorId="20F79CE5" wp14:editId="6435FBDE">
-            <wp:extent cx="5400040" cy="1772285"/>
-            <wp:effectExtent l="0" t="0" r="0" b="0"/>
-            <wp:docPr id="1662333643" name="Imagen 1"/>
+          <wp:inline distT="0" distB="0" distL="0" distR="0" wp14:anchorId="64B392D3" wp14:editId="16B6DB6B">
+            <wp:extent cx="5400040" cy="1065530"/>
+            <wp:effectExtent l="0" t="0" r="0" b="1270"/>
+            <wp:docPr id="597400221" name="Imagen 1"/>
             <wp:cNvGraphicFramePr>
               <a:graphicFrameLocks xmlns:a="http://schemas.openxmlformats.org/drawingml/2006/main" noChangeAspect="1"/>
             </wp:cNvGraphicFramePr>
@@ -2811,7 +3193,7 @@
               <a:graphicData uri="http://schemas.openxmlformats.org/drawingml/2006/picture">
                 <pic:pic xmlns:pic="http://schemas.openxmlformats.org/drawingml/2006/picture">
                   <pic:nvPicPr>
-                    <pic:cNvPr id="1662333643" name=""/>
+                    <pic:cNvPr id="597400221" name=""/>
                     <pic:cNvPicPr/>
                   </pic:nvPicPr>
                   <pic:blipFill>
@@ -2823,7 +3205,7 @@
                   <pic:spPr>
                     <a:xfrm>
                       <a:off x="0" y="0"/>
-                      <a:ext cx="5400040" cy="1772285"/>
+                      <a:ext cx="5400040" cy="1065530"/>
                     </a:xfrm>
                     <a:prstGeom prst="rect">
                       <a:avLst/>
@@ -2843,43 +3225,12 @@
           <w:szCs w:val="24"/>
         </w:rPr>
       </w:pPr>
-    </w:p>
-    <w:p>
-      <w:pPr>
-        <w:rPr>
-          <w:sz w:val="24"/>
-          <w:szCs w:val="24"/>
-        </w:rPr>
-      </w:pPr>
-      <w:r>
-        <w:rPr>
-          <w:sz w:val="24"/>
-          <w:szCs w:val="24"/>
-        </w:rPr>
-        <w:t xml:space="preserve">Creé la página de evento, la cual enseña la información del evento. Usa un sistema de </w:t>
-      </w:r>
-      <w:proofErr w:type="spellStart"/>
-      <w:r>
-        <w:rPr>
-          <w:sz w:val="24"/>
-          <w:szCs w:val="24"/>
-        </w:rPr>
-        <w:t>IDs</w:t>
-      </w:r>
-      <w:proofErr w:type="spellEnd"/>
-      <w:r>
-        <w:rPr>
-          <w:sz w:val="24"/>
-          <w:szCs w:val="24"/>
-        </w:rPr>
-        <w:t xml:space="preserve"> para buscar el evento y su información en el archivo JSON</w:t>
-      </w:r>
-      <w:r>
-        <w:rPr>
-          <w:sz w:val="24"/>
-          <w:szCs w:val="24"/>
-        </w:rPr>
-        <w:t>:</w:t>
+      <w:r>
+        <w:rPr>
+          <w:sz w:val="24"/>
+          <w:szCs w:val="24"/>
+        </w:rPr>
+        <w:t>Si no hay usuarios para eliminar, saltará el siguiente mensaje:</w:t>
       </w:r>
     </w:p>
     <w:p>
@@ -2892,14 +3243,12 @@
       <w:r>
         <w:rPr>
           <w:noProof/>
-          <w:sz w:val="24"/>
-          <w:szCs w:val="24"/>
         </w:rPr>
         <w:drawing>
-          <wp:inline distT="0" distB="0" distL="0" distR="0" wp14:anchorId="69EFD88E" wp14:editId="0DD920A9">
-            <wp:extent cx="5400040" cy="2014220"/>
-            <wp:effectExtent l="0" t="0" r="0" b="5080"/>
-            <wp:docPr id="937861711" name="Imagen 1"/>
+          <wp:inline distT="0" distB="0" distL="0" distR="0" wp14:anchorId="24455237" wp14:editId="126FD011">
+            <wp:extent cx="3657600" cy="933450"/>
+            <wp:effectExtent l="0" t="0" r="0" b="0"/>
+            <wp:docPr id="458587502" name="Imagen 1"/>
             <wp:cNvGraphicFramePr>
               <a:graphicFrameLocks xmlns:a="http://schemas.openxmlformats.org/drawingml/2006/main" noChangeAspect="1"/>
             </wp:cNvGraphicFramePr>
@@ -2907,7 +3256,7 @@
               <a:graphicData uri="http://schemas.openxmlformats.org/drawingml/2006/picture">
                 <pic:pic xmlns:pic="http://schemas.openxmlformats.org/drawingml/2006/picture">
                   <pic:nvPicPr>
-                    <pic:cNvPr id="937861711" name=""/>
+                    <pic:cNvPr id="458587502" name=""/>
                     <pic:cNvPicPr/>
                   </pic:nvPicPr>
                   <pic:blipFill>
@@ -2919,7 +3268,7 @@
                   <pic:spPr>
                     <a:xfrm>
                       <a:off x="0" y="0"/>
-                      <a:ext cx="5400040" cy="2014220"/>
+                      <a:ext cx="3657600" cy="933450"/>
                     </a:xfrm>
                     <a:prstGeom prst="rect">
                       <a:avLst/>
@@ -2944,38 +3293,7 @@
           <w:sz w:val="24"/>
           <w:szCs w:val="24"/>
         </w:rPr>
-        <w:br w:type="page"/>
-      </w:r>
-    </w:p>
-    <w:p>
-      <w:pPr>
-        <w:rPr>
-          <w:sz w:val="24"/>
-          <w:szCs w:val="24"/>
-        </w:rPr>
-      </w:pPr>
-      <w:r>
-        <w:rPr>
-          <w:sz w:val="24"/>
-          <w:szCs w:val="24"/>
-        </w:rPr>
-        <w:lastRenderedPageBreak/>
-        <w:t>DÍA 10 (10/4/2026):</w:t>
-      </w:r>
-    </w:p>
-    <w:p>
-      <w:pPr>
-        <w:rPr>
-          <w:sz w:val="24"/>
-          <w:szCs w:val="24"/>
-        </w:rPr>
-      </w:pPr>
-      <w:r>
-        <w:rPr>
-          <w:sz w:val="24"/>
-          <w:szCs w:val="24"/>
-        </w:rPr>
-        <w:t>Añadí las galerías a la web:</w:t>
+        <w:t>Si se intenta eliminar un usuario que no existe, saltará el siguiente error:</w:t>
       </w:r>
     </w:p>
     <w:p>
@@ -2988,14 +3306,12 @@
       <w:r>
         <w:rPr>
           <w:noProof/>
-          <w:sz w:val="24"/>
-          <w:szCs w:val="24"/>
         </w:rPr>
         <w:drawing>
-          <wp:inline distT="0" distB="0" distL="0" distR="0" wp14:anchorId="2063EFD8" wp14:editId="1E566E2A">
-            <wp:extent cx="5400040" cy="2596515"/>
+          <wp:inline distT="0" distB="0" distL="0" distR="0" wp14:anchorId="5FF77942" wp14:editId="48E259FB">
+            <wp:extent cx="5400040" cy="1069340"/>
             <wp:effectExtent l="0" t="0" r="0" b="0"/>
-            <wp:docPr id="2038691581" name="Imagen 1"/>
+            <wp:docPr id="1722643148" name="Imagen 1"/>
             <wp:cNvGraphicFramePr>
               <a:graphicFrameLocks xmlns:a="http://schemas.openxmlformats.org/drawingml/2006/main" noChangeAspect="1"/>
             </wp:cNvGraphicFramePr>
@@ -3003,7 +3319,7 @@
               <a:graphicData uri="http://schemas.openxmlformats.org/drawingml/2006/picture">
                 <pic:pic xmlns:pic="http://schemas.openxmlformats.org/drawingml/2006/picture">
                   <pic:nvPicPr>
-                    <pic:cNvPr id="2038691581" name=""/>
+                    <pic:cNvPr id="1722643148" name=""/>
                     <pic:cNvPicPr/>
                   </pic:nvPicPr>
                   <pic:blipFill>
@@ -3015,7 +3331,7 @@
                   <pic:spPr>
                     <a:xfrm>
                       <a:off x="0" y="0"/>
-                      <a:ext cx="5400040" cy="2596515"/>
+                      <a:ext cx="5400040" cy="1069340"/>
                     </a:xfrm>
                     <a:prstGeom prst="rect">
                       <a:avLst/>
@@ -3043,12 +3359,923 @@
           <w:szCs w:val="24"/>
         </w:rPr>
       </w:pPr>
-      <w:r>
-        <w:rPr>
-          <w:sz w:val="24"/>
-          <w:szCs w:val="24"/>
-        </w:rPr>
-        <w:t>También añadí nuevas imágenes a la web.</w:t>
+    </w:p>
+    <w:p>
+      <w:pPr>
+        <w:rPr>
+          <w:sz w:val="24"/>
+          <w:szCs w:val="24"/>
+        </w:rPr>
+      </w:pPr>
+      <w:r>
+        <w:rPr>
+          <w:sz w:val="24"/>
+          <w:szCs w:val="24"/>
+        </w:rPr>
+        <w:br w:type="page"/>
+      </w:r>
+    </w:p>
+    <w:p>
+      <w:pPr>
+        <w:rPr>
+          <w:b/>
+          <w:bCs/>
+          <w:sz w:val="28"/>
+          <w:szCs w:val="28"/>
+        </w:rPr>
+      </w:pPr>
+      <w:r>
+        <w:rPr>
+          <w:b/>
+          <w:bCs/>
+          <w:sz w:val="28"/>
+          <w:szCs w:val="28"/>
+        </w:rPr>
+        <w:lastRenderedPageBreak/>
+        <w:t>Opción 3:</w:t>
+      </w:r>
+    </w:p>
+    <w:p>
+      <w:pPr>
+        <w:rPr>
+          <w:sz w:val="24"/>
+          <w:szCs w:val="24"/>
+        </w:rPr>
+      </w:pPr>
+      <w:r>
+        <w:rPr>
+          <w:sz w:val="24"/>
+          <w:szCs w:val="24"/>
+        </w:rPr>
+        <w:t xml:space="preserve">Se inicia el menú de </w:t>
+      </w:r>
+      <w:r>
+        <w:rPr>
+          <w:sz w:val="24"/>
+          <w:szCs w:val="24"/>
+        </w:rPr>
+        <w:t>creación de evento</w:t>
+      </w:r>
+      <w:r>
+        <w:rPr>
+          <w:sz w:val="24"/>
+          <w:szCs w:val="24"/>
+        </w:rPr>
+        <w:t>.</w:t>
+      </w:r>
+    </w:p>
+    <w:p>
+      <w:pPr>
+        <w:rPr>
+          <w:sz w:val="24"/>
+          <w:szCs w:val="24"/>
+        </w:rPr>
+      </w:pPr>
+      <w:r>
+        <w:rPr>
+          <w:sz w:val="24"/>
+          <w:szCs w:val="24"/>
+        </w:rPr>
+        <w:t>La información requerida para crear un evento es:</w:t>
+      </w:r>
+    </w:p>
+    <w:p>
+      <w:pPr>
+        <w:pStyle w:val="Prrafodelista"/>
+        <w:numPr>
+          <w:ilvl w:val="0"/>
+          <w:numId w:val="2"/>
+        </w:numPr>
+        <w:rPr>
+          <w:sz w:val="24"/>
+          <w:szCs w:val="24"/>
+        </w:rPr>
+      </w:pPr>
+      <w:r>
+        <w:rPr>
+          <w:sz w:val="24"/>
+          <w:szCs w:val="24"/>
+        </w:rPr>
+        <w:t>Fecha</w:t>
+      </w:r>
+    </w:p>
+    <w:p>
+      <w:pPr>
+        <w:pStyle w:val="Prrafodelista"/>
+        <w:numPr>
+          <w:ilvl w:val="0"/>
+          <w:numId w:val="2"/>
+        </w:numPr>
+        <w:rPr>
+          <w:sz w:val="24"/>
+          <w:szCs w:val="24"/>
+        </w:rPr>
+      </w:pPr>
+      <w:r>
+        <w:rPr>
+          <w:sz w:val="24"/>
+          <w:szCs w:val="24"/>
+        </w:rPr>
+        <w:t>Título</w:t>
+      </w:r>
+    </w:p>
+    <w:p>
+      <w:pPr>
+        <w:pStyle w:val="Prrafodelista"/>
+        <w:numPr>
+          <w:ilvl w:val="0"/>
+          <w:numId w:val="2"/>
+        </w:numPr>
+        <w:rPr>
+          <w:sz w:val="24"/>
+          <w:szCs w:val="24"/>
+        </w:rPr>
+      </w:pPr>
+      <w:r>
+        <w:rPr>
+          <w:sz w:val="24"/>
+          <w:szCs w:val="24"/>
+        </w:rPr>
+        <w:t>Ubicación</w:t>
+      </w:r>
+    </w:p>
+    <w:p>
+      <w:pPr>
+        <w:pStyle w:val="Prrafodelista"/>
+        <w:numPr>
+          <w:ilvl w:val="0"/>
+          <w:numId w:val="2"/>
+        </w:numPr>
+        <w:rPr>
+          <w:sz w:val="24"/>
+          <w:szCs w:val="24"/>
+        </w:rPr>
+      </w:pPr>
+      <w:r>
+        <w:rPr>
+          <w:sz w:val="24"/>
+          <w:szCs w:val="24"/>
+        </w:rPr>
+        <w:t>Descripción</w:t>
+      </w:r>
+    </w:p>
+    <w:p>
+      <w:pPr>
+        <w:rPr>
+          <w:sz w:val="24"/>
+          <w:szCs w:val="24"/>
+        </w:rPr>
+      </w:pPr>
+      <w:r>
+        <w:rPr>
+          <w:sz w:val="24"/>
+          <w:szCs w:val="24"/>
+        </w:rPr>
+        <w:t>Adicionalmente, se crea automáticamente un ID único para cada evento.</w:t>
+      </w:r>
+    </w:p>
+    <w:p>
+      <w:pPr>
+        <w:rPr>
+          <w:sz w:val="24"/>
+          <w:szCs w:val="24"/>
+        </w:rPr>
+      </w:pPr>
+      <w:r>
+        <w:rPr>
+          <w:noProof/>
+        </w:rPr>
+        <w:drawing>
+          <wp:inline distT="0" distB="0" distL="0" distR="0" wp14:anchorId="7D78A2A9" wp14:editId="1805317F">
+            <wp:extent cx="4486275" cy="2752725"/>
+            <wp:effectExtent l="0" t="0" r="9525" b="9525"/>
+            <wp:docPr id="994480538" name="Imagen 1"/>
+            <wp:cNvGraphicFramePr>
+              <a:graphicFrameLocks xmlns:a="http://schemas.openxmlformats.org/drawingml/2006/main" noChangeAspect="1"/>
+            </wp:cNvGraphicFramePr>
+            <a:graphic xmlns:a="http://schemas.openxmlformats.org/drawingml/2006/main">
+              <a:graphicData uri="http://schemas.openxmlformats.org/drawingml/2006/picture">
+                <pic:pic xmlns:pic="http://schemas.openxmlformats.org/drawingml/2006/picture">
+                  <pic:nvPicPr>
+                    <pic:cNvPr id="994480538" name=""/>
+                    <pic:cNvPicPr/>
+                  </pic:nvPicPr>
+                  <pic:blipFill>
+                    <a:blip r:embed="rId30"/>
+                    <a:stretch>
+                      <a:fillRect/>
+                    </a:stretch>
+                  </pic:blipFill>
+                  <pic:spPr>
+                    <a:xfrm>
+                      <a:off x="0" y="0"/>
+                      <a:ext cx="4486275" cy="2752725"/>
+                    </a:xfrm>
+                    <a:prstGeom prst="rect">
+                      <a:avLst/>
+                    </a:prstGeom>
+                  </pic:spPr>
+                </pic:pic>
+              </a:graphicData>
+            </a:graphic>
+          </wp:inline>
+        </w:drawing>
+      </w:r>
+    </w:p>
+    <w:p>
+      <w:pPr>
+        <w:rPr>
+          <w:sz w:val="24"/>
+          <w:szCs w:val="24"/>
+        </w:rPr>
+      </w:pPr>
+    </w:p>
+    <w:p>
+      <w:pPr>
+        <w:rPr>
+          <w:sz w:val="24"/>
+          <w:szCs w:val="24"/>
+        </w:rPr>
+      </w:pPr>
+    </w:p>
+    <w:p>
+      <w:pPr>
+        <w:rPr>
+          <w:b/>
+          <w:bCs/>
+          <w:sz w:val="28"/>
+          <w:szCs w:val="28"/>
+        </w:rPr>
+      </w:pPr>
+      <w:r>
+        <w:rPr>
+          <w:b/>
+          <w:bCs/>
+          <w:sz w:val="28"/>
+          <w:szCs w:val="28"/>
+        </w:rPr>
+        <w:t>Opción 4:</w:t>
+      </w:r>
+    </w:p>
+    <w:p>
+      <w:pPr>
+        <w:rPr>
+          <w:sz w:val="24"/>
+          <w:szCs w:val="24"/>
+        </w:rPr>
+      </w:pPr>
+      <w:r>
+        <w:rPr>
+          <w:sz w:val="24"/>
+          <w:szCs w:val="24"/>
+        </w:rPr>
+        <w:t xml:space="preserve">Se inicia el menú de </w:t>
+      </w:r>
+      <w:r>
+        <w:rPr>
+          <w:sz w:val="24"/>
+          <w:szCs w:val="24"/>
+        </w:rPr>
+        <w:t>borrado</w:t>
+      </w:r>
+      <w:r>
+        <w:rPr>
+          <w:sz w:val="24"/>
+          <w:szCs w:val="24"/>
+        </w:rPr>
+        <w:t xml:space="preserve"> de evento.</w:t>
+      </w:r>
+    </w:p>
+    <w:p>
+      <w:pPr>
+        <w:rPr>
+          <w:sz w:val="24"/>
+          <w:szCs w:val="24"/>
+        </w:rPr>
+      </w:pPr>
+      <w:r>
+        <w:rPr>
+          <w:sz w:val="24"/>
+          <w:szCs w:val="24"/>
+        </w:rPr>
+        <w:t>Se muestra una tabla con los eventos disponibles , mostrando sus ID y título</w:t>
+      </w:r>
+      <w:r>
+        <w:rPr>
+          <w:sz w:val="24"/>
+          <w:szCs w:val="24"/>
+        </w:rPr>
+        <w:t>.</w:t>
+      </w:r>
+    </w:p>
+    <w:p>
+      <w:pPr>
+        <w:rPr>
+          <w:sz w:val="24"/>
+          <w:szCs w:val="24"/>
+        </w:rPr>
+      </w:pPr>
+      <w:r>
+        <w:rPr>
+          <w:sz w:val="24"/>
+          <w:szCs w:val="24"/>
+        </w:rPr>
+        <w:t>Solamente hace falta introducir el ID del evento que se quiere eliminar.</w:t>
+      </w:r>
+    </w:p>
+    <w:p>
+      <w:pPr>
+        <w:rPr>
+          <w:sz w:val="24"/>
+          <w:szCs w:val="24"/>
+        </w:rPr>
+      </w:pPr>
+      <w:r>
+        <w:rPr>
+          <w:noProof/>
+        </w:rPr>
+        <w:drawing>
+          <wp:inline distT="0" distB="0" distL="0" distR="0" wp14:anchorId="4D194F94" wp14:editId="6481485B">
+            <wp:extent cx="5400040" cy="1558290"/>
+            <wp:effectExtent l="0" t="0" r="0" b="3810"/>
+            <wp:docPr id="358596131" name="Imagen 1"/>
+            <wp:cNvGraphicFramePr>
+              <a:graphicFrameLocks xmlns:a="http://schemas.openxmlformats.org/drawingml/2006/main" noChangeAspect="1"/>
+            </wp:cNvGraphicFramePr>
+            <a:graphic xmlns:a="http://schemas.openxmlformats.org/drawingml/2006/main">
+              <a:graphicData uri="http://schemas.openxmlformats.org/drawingml/2006/picture">
+                <pic:pic xmlns:pic="http://schemas.openxmlformats.org/drawingml/2006/picture">
+                  <pic:nvPicPr>
+                    <pic:cNvPr id="358596131" name=""/>
+                    <pic:cNvPicPr/>
+                  </pic:nvPicPr>
+                  <pic:blipFill>
+                    <a:blip r:embed="rId31"/>
+                    <a:stretch>
+                      <a:fillRect/>
+                    </a:stretch>
+                  </pic:blipFill>
+                  <pic:spPr>
+                    <a:xfrm>
+                      <a:off x="0" y="0"/>
+                      <a:ext cx="5400040" cy="1558290"/>
+                    </a:xfrm>
+                    <a:prstGeom prst="rect">
+                      <a:avLst/>
+                    </a:prstGeom>
+                  </pic:spPr>
+                </pic:pic>
+              </a:graphicData>
+            </a:graphic>
+          </wp:inline>
+        </w:drawing>
+      </w:r>
+    </w:p>
+    <w:p>
+      <w:pPr>
+        <w:rPr>
+          <w:sz w:val="24"/>
+          <w:szCs w:val="24"/>
+        </w:rPr>
+      </w:pPr>
+    </w:p>
+    <w:p>
+      <w:pPr>
+        <w:rPr>
+          <w:sz w:val="24"/>
+          <w:szCs w:val="24"/>
+        </w:rPr>
+      </w:pPr>
+      <w:r>
+        <w:rPr>
+          <w:sz w:val="24"/>
+          <w:szCs w:val="24"/>
+        </w:rPr>
+        <w:lastRenderedPageBreak/>
+        <w:t>Si no hay eventos disponibles para eliminar, se mostrará el siguiente mensaje:</w:t>
+      </w:r>
+    </w:p>
+    <w:p>
+      <w:pPr>
+        <w:rPr>
+          <w:sz w:val="24"/>
+          <w:szCs w:val="24"/>
+        </w:rPr>
+      </w:pPr>
+      <w:r>
+        <w:rPr>
+          <w:noProof/>
+        </w:rPr>
+        <w:drawing>
+          <wp:inline distT="0" distB="0" distL="0" distR="0" wp14:anchorId="58665548" wp14:editId="68E296D3">
+            <wp:extent cx="3714750" cy="676275"/>
+            <wp:effectExtent l="0" t="0" r="0" b="9525"/>
+            <wp:docPr id="1932251765" name="Imagen 1"/>
+            <wp:cNvGraphicFramePr>
+              <a:graphicFrameLocks xmlns:a="http://schemas.openxmlformats.org/drawingml/2006/main" noChangeAspect="1"/>
+            </wp:cNvGraphicFramePr>
+            <a:graphic xmlns:a="http://schemas.openxmlformats.org/drawingml/2006/main">
+              <a:graphicData uri="http://schemas.openxmlformats.org/drawingml/2006/picture">
+                <pic:pic xmlns:pic="http://schemas.openxmlformats.org/drawingml/2006/picture">
+                  <pic:nvPicPr>
+                    <pic:cNvPr id="1932251765" name=""/>
+                    <pic:cNvPicPr/>
+                  </pic:nvPicPr>
+                  <pic:blipFill>
+                    <a:blip r:embed="rId32"/>
+                    <a:stretch>
+                      <a:fillRect/>
+                    </a:stretch>
+                  </pic:blipFill>
+                  <pic:spPr>
+                    <a:xfrm>
+                      <a:off x="0" y="0"/>
+                      <a:ext cx="3714750" cy="676275"/>
+                    </a:xfrm>
+                    <a:prstGeom prst="rect">
+                      <a:avLst/>
+                    </a:prstGeom>
+                  </pic:spPr>
+                </pic:pic>
+              </a:graphicData>
+            </a:graphic>
+          </wp:inline>
+        </w:drawing>
+      </w:r>
+    </w:p>
+    <w:p>
+      <w:pPr>
+        <w:rPr>
+          <w:sz w:val="24"/>
+          <w:szCs w:val="24"/>
+        </w:rPr>
+      </w:pPr>
+      <w:r>
+        <w:rPr>
+          <w:sz w:val="24"/>
+          <w:szCs w:val="24"/>
+        </w:rPr>
+        <w:t>Asimismo, si se intenta eliminar un evento que no existe, el siguiente mensaje será mostrado:</w:t>
+      </w:r>
+    </w:p>
+    <w:p>
+      <w:pPr>
+        <w:rPr>
+          <w:sz w:val="24"/>
+          <w:szCs w:val="24"/>
+        </w:rPr>
+      </w:pPr>
+      <w:r>
+        <w:rPr>
+          <w:noProof/>
+        </w:rPr>
+        <w:drawing>
+          <wp:inline distT="0" distB="0" distL="0" distR="0" wp14:anchorId="3BE70D47" wp14:editId="5B01BD71">
+            <wp:extent cx="4826000" cy="1424419"/>
+            <wp:effectExtent l="0" t="0" r="0" b="4445"/>
+            <wp:docPr id="1349619701" name="Imagen 1"/>
+            <wp:cNvGraphicFramePr>
+              <a:graphicFrameLocks xmlns:a="http://schemas.openxmlformats.org/drawingml/2006/main" noChangeAspect="1"/>
+            </wp:cNvGraphicFramePr>
+            <a:graphic xmlns:a="http://schemas.openxmlformats.org/drawingml/2006/main">
+              <a:graphicData uri="http://schemas.openxmlformats.org/drawingml/2006/picture">
+                <pic:pic xmlns:pic="http://schemas.openxmlformats.org/drawingml/2006/picture">
+                  <pic:nvPicPr>
+                    <pic:cNvPr id="1349619701" name=""/>
+                    <pic:cNvPicPr/>
+                  </pic:nvPicPr>
+                  <pic:blipFill>
+                    <a:blip r:embed="rId33"/>
+                    <a:stretch>
+                      <a:fillRect/>
+                    </a:stretch>
+                  </pic:blipFill>
+                  <pic:spPr>
+                    <a:xfrm>
+                      <a:off x="0" y="0"/>
+                      <a:ext cx="4835430" cy="1427202"/>
+                    </a:xfrm>
+                    <a:prstGeom prst="rect">
+                      <a:avLst/>
+                    </a:prstGeom>
+                  </pic:spPr>
+                </pic:pic>
+              </a:graphicData>
+            </a:graphic>
+          </wp:inline>
+        </w:drawing>
+      </w:r>
+    </w:p>
+    <w:p>
+      <w:pPr>
+        <w:rPr>
+          <w:b/>
+          <w:bCs/>
+          <w:sz w:val="28"/>
+          <w:szCs w:val="28"/>
+        </w:rPr>
+      </w:pPr>
+      <w:r>
+        <w:rPr>
+          <w:b/>
+          <w:bCs/>
+          <w:sz w:val="28"/>
+          <w:szCs w:val="28"/>
+        </w:rPr>
+        <w:t>Opción 5:</w:t>
+      </w:r>
+    </w:p>
+    <w:p>
+      <w:pPr>
+        <w:rPr>
+          <w:sz w:val="24"/>
+          <w:szCs w:val="24"/>
+        </w:rPr>
+      </w:pPr>
+      <w:r>
+        <w:rPr>
+          <w:sz w:val="24"/>
+          <w:szCs w:val="24"/>
+        </w:rPr>
+        <w:t>Se inicia el menú de creación de galerías</w:t>
+      </w:r>
+    </w:p>
+    <w:p>
+      <w:pPr>
+        <w:rPr>
+          <w:sz w:val="24"/>
+          <w:szCs w:val="24"/>
+        </w:rPr>
+      </w:pPr>
+      <w:r>
+        <w:rPr>
+          <w:sz w:val="24"/>
+          <w:szCs w:val="24"/>
+        </w:rPr>
+        <w:t xml:space="preserve">Para crear una galería hace falta como mínimo un evento disponible. </w:t>
+      </w:r>
+      <w:r>
+        <w:rPr>
+          <w:sz w:val="24"/>
+          <w:szCs w:val="24"/>
+        </w:rPr>
+        <w:t>Tras elegir el evento donde se quiere crear la galería, se deberá introducir el título de dicha galería.</w:t>
+      </w:r>
+    </w:p>
+    <w:p>
+      <w:pPr>
+        <w:rPr>
+          <w:sz w:val="24"/>
+          <w:szCs w:val="24"/>
+        </w:rPr>
+      </w:pPr>
+      <w:r>
+        <w:rPr>
+          <w:noProof/>
+        </w:rPr>
+        <w:drawing>
+          <wp:inline distT="0" distB="0" distL="0" distR="0" wp14:anchorId="651D669F" wp14:editId="78435372">
+            <wp:extent cx="5400040" cy="2617470"/>
+            <wp:effectExtent l="0" t="0" r="0" b="0"/>
+            <wp:docPr id="1751370057" name="Imagen 1"/>
+            <wp:cNvGraphicFramePr>
+              <a:graphicFrameLocks xmlns:a="http://schemas.openxmlformats.org/drawingml/2006/main" noChangeAspect="1"/>
+            </wp:cNvGraphicFramePr>
+            <a:graphic xmlns:a="http://schemas.openxmlformats.org/drawingml/2006/main">
+              <a:graphicData uri="http://schemas.openxmlformats.org/drawingml/2006/picture">
+                <pic:pic xmlns:pic="http://schemas.openxmlformats.org/drawingml/2006/picture">
+                  <pic:nvPicPr>
+                    <pic:cNvPr id="1751370057" name=""/>
+                    <pic:cNvPicPr/>
+                  </pic:nvPicPr>
+                  <pic:blipFill>
+                    <a:blip r:embed="rId34"/>
+                    <a:stretch>
+                      <a:fillRect/>
+                    </a:stretch>
+                  </pic:blipFill>
+                  <pic:spPr>
+                    <a:xfrm>
+                      <a:off x="0" y="0"/>
+                      <a:ext cx="5400040" cy="2617470"/>
+                    </a:xfrm>
+                    <a:prstGeom prst="rect">
+                      <a:avLst/>
+                    </a:prstGeom>
+                  </pic:spPr>
+                </pic:pic>
+              </a:graphicData>
+            </a:graphic>
+          </wp:inline>
+        </w:drawing>
+      </w:r>
+    </w:p>
+    <w:p>
+      <w:pPr>
+        <w:rPr>
+          <w:sz w:val="24"/>
+          <w:szCs w:val="24"/>
+        </w:rPr>
+      </w:pPr>
+    </w:p>
+    <w:p>
+      <w:pPr>
+        <w:rPr>
+          <w:sz w:val="24"/>
+          <w:szCs w:val="24"/>
+        </w:rPr>
+      </w:pPr>
+      <w:r>
+        <w:rPr>
+          <w:sz w:val="24"/>
+          <w:szCs w:val="24"/>
+        </w:rPr>
+        <w:t>En el caso de que no haya eventos disponibles, se mostrará el siguiente mensaje:</w:t>
+      </w:r>
+    </w:p>
+    <w:p>
+      <w:pPr>
+        <w:rPr>
+          <w:sz w:val="24"/>
+          <w:szCs w:val="24"/>
+        </w:rPr>
+      </w:pPr>
+      <w:r>
+        <w:rPr>
+          <w:noProof/>
+        </w:rPr>
+        <w:drawing>
+          <wp:inline distT="0" distB="0" distL="0" distR="0" wp14:anchorId="26787093" wp14:editId="75838759">
+            <wp:extent cx="4762500" cy="962025"/>
+            <wp:effectExtent l="0" t="0" r="0" b="9525"/>
+            <wp:docPr id="687857313" name="Imagen 1"/>
+            <wp:cNvGraphicFramePr>
+              <a:graphicFrameLocks xmlns:a="http://schemas.openxmlformats.org/drawingml/2006/main" noChangeAspect="1"/>
+            </wp:cNvGraphicFramePr>
+            <a:graphic xmlns:a="http://schemas.openxmlformats.org/drawingml/2006/main">
+              <a:graphicData uri="http://schemas.openxmlformats.org/drawingml/2006/picture">
+                <pic:pic xmlns:pic="http://schemas.openxmlformats.org/drawingml/2006/picture">
+                  <pic:nvPicPr>
+                    <pic:cNvPr id="687857313" name=""/>
+                    <pic:cNvPicPr/>
+                  </pic:nvPicPr>
+                  <pic:blipFill>
+                    <a:blip r:embed="rId35"/>
+                    <a:stretch>
+                      <a:fillRect/>
+                    </a:stretch>
+                  </pic:blipFill>
+                  <pic:spPr>
+                    <a:xfrm>
+                      <a:off x="0" y="0"/>
+                      <a:ext cx="4762500" cy="962025"/>
+                    </a:xfrm>
+                    <a:prstGeom prst="rect">
+                      <a:avLst/>
+                    </a:prstGeom>
+                  </pic:spPr>
+                </pic:pic>
+              </a:graphicData>
+            </a:graphic>
+          </wp:inline>
+        </w:drawing>
+      </w:r>
+    </w:p>
+    <w:p>
+      <w:pPr>
+        <w:rPr>
+          <w:sz w:val="24"/>
+          <w:szCs w:val="24"/>
+        </w:rPr>
+      </w:pPr>
+      <w:r>
+        <w:rPr>
+          <w:sz w:val="24"/>
+          <w:szCs w:val="24"/>
+        </w:rPr>
+        <w:lastRenderedPageBreak/>
+        <w:t>En el caso de que el evento seleccionado no exista, se mostrará el siguiente mensaje:</w:t>
+      </w:r>
+    </w:p>
+    <w:p>
+      <w:pPr>
+        <w:rPr>
+          <w:sz w:val="24"/>
+          <w:szCs w:val="24"/>
+        </w:rPr>
+      </w:pPr>
+      <w:r>
+        <w:rPr>
+          <w:noProof/>
+        </w:rPr>
+        <w:drawing>
+          <wp:inline distT="0" distB="0" distL="0" distR="0" wp14:anchorId="703A17C6" wp14:editId="07A31F45">
+            <wp:extent cx="5400040" cy="2224405"/>
+            <wp:effectExtent l="0" t="0" r="0" b="4445"/>
+            <wp:docPr id="834235790" name="Imagen 1"/>
+            <wp:cNvGraphicFramePr>
+              <a:graphicFrameLocks xmlns:a="http://schemas.openxmlformats.org/drawingml/2006/main" noChangeAspect="1"/>
+            </wp:cNvGraphicFramePr>
+            <a:graphic xmlns:a="http://schemas.openxmlformats.org/drawingml/2006/main">
+              <a:graphicData uri="http://schemas.openxmlformats.org/drawingml/2006/picture">
+                <pic:pic xmlns:pic="http://schemas.openxmlformats.org/drawingml/2006/picture">
+                  <pic:nvPicPr>
+                    <pic:cNvPr id="834235790" name=""/>
+                    <pic:cNvPicPr/>
+                  </pic:nvPicPr>
+                  <pic:blipFill>
+                    <a:blip r:embed="rId36"/>
+                    <a:stretch>
+                      <a:fillRect/>
+                    </a:stretch>
+                  </pic:blipFill>
+                  <pic:spPr>
+                    <a:xfrm>
+                      <a:off x="0" y="0"/>
+                      <a:ext cx="5400040" cy="2224405"/>
+                    </a:xfrm>
+                    <a:prstGeom prst="rect">
+                      <a:avLst/>
+                    </a:prstGeom>
+                  </pic:spPr>
+                </pic:pic>
+              </a:graphicData>
+            </a:graphic>
+          </wp:inline>
+        </w:drawing>
+      </w:r>
+    </w:p>
+    <w:p>
+      <w:pPr>
+        <w:rPr>
+          <w:sz w:val="24"/>
+          <w:szCs w:val="24"/>
+        </w:rPr>
+      </w:pPr>
+    </w:p>
+    <w:p>
+      <w:pPr>
+        <w:rPr>
+          <w:sz w:val="24"/>
+          <w:szCs w:val="24"/>
+        </w:rPr>
+      </w:pPr>
+    </w:p>
+    <w:p>
+      <w:pPr>
+        <w:rPr>
+          <w:sz w:val="24"/>
+          <w:szCs w:val="24"/>
+        </w:rPr>
+      </w:pPr>
+    </w:p>
+    <w:p>
+      <w:pPr>
+        <w:rPr>
+          <w:sz w:val="24"/>
+          <w:szCs w:val="24"/>
+        </w:rPr>
+      </w:pPr>
+    </w:p>
+    <w:p>
+      <w:pPr>
+        <w:rPr>
+          <w:sz w:val="24"/>
+          <w:szCs w:val="24"/>
+        </w:rPr>
+      </w:pPr>
+      <w:r>
+        <w:rPr>
+          <w:b/>
+          <w:bCs/>
+          <w:sz w:val="28"/>
+          <w:szCs w:val="28"/>
+        </w:rPr>
+        <w:t xml:space="preserve">Opción </w:t>
+      </w:r>
+      <w:r>
+        <w:rPr>
+          <w:b/>
+          <w:bCs/>
+          <w:sz w:val="28"/>
+          <w:szCs w:val="28"/>
+        </w:rPr>
+        <w:t>6</w:t>
+      </w:r>
+      <w:r>
+        <w:rPr>
+          <w:b/>
+          <w:bCs/>
+          <w:sz w:val="28"/>
+          <w:szCs w:val="28"/>
+        </w:rPr>
+        <w:t>:</w:t>
+      </w:r>
+    </w:p>
+    <w:p>
+      <w:pPr>
+        <w:rPr>
+          <w:sz w:val="24"/>
+          <w:szCs w:val="24"/>
+        </w:rPr>
+      </w:pPr>
+      <w:r>
+        <w:rPr>
+          <w:sz w:val="24"/>
+          <w:szCs w:val="24"/>
+        </w:rPr>
+        <w:t xml:space="preserve">Se inicia el menú de </w:t>
+      </w:r>
+      <w:r>
+        <w:rPr>
+          <w:sz w:val="24"/>
+          <w:szCs w:val="24"/>
+        </w:rPr>
+        <w:t>borrado</w:t>
+      </w:r>
+      <w:r>
+        <w:rPr>
+          <w:sz w:val="24"/>
+          <w:szCs w:val="24"/>
+        </w:rPr>
+        <w:t xml:space="preserve"> de galerías</w:t>
+      </w:r>
+      <w:r>
+        <w:rPr>
+          <w:sz w:val="24"/>
+          <w:szCs w:val="24"/>
+        </w:rPr>
+        <w:t>.</w:t>
+      </w:r>
+    </w:p>
+    <w:p>
+      <w:pPr>
+        <w:rPr>
+          <w:sz w:val="24"/>
+          <w:szCs w:val="24"/>
+        </w:rPr>
+      </w:pPr>
+      <w:r>
+        <w:rPr>
+          <w:sz w:val="24"/>
+          <w:szCs w:val="24"/>
+        </w:rPr>
+        <w:t>Tras abrir el menú, se mostrará una tabla con los eventos disponibles. Tras seleccionar el evento, se mostrarán las galerías que tiene.</w:t>
+      </w:r>
+      <w:r>
+        <w:rPr>
+          <w:sz w:val="24"/>
+          <w:szCs w:val="24"/>
+        </w:rPr>
+        <w:t xml:space="preserve"> Si se selecciona una galería esta será borrada.</w:t>
+      </w:r>
+    </w:p>
+    <w:p>
+      <w:pPr>
+        <w:rPr>
+          <w:sz w:val="24"/>
+          <w:szCs w:val="24"/>
+        </w:rPr>
+      </w:pPr>
+      <w:r>
+        <w:rPr>
+          <w:noProof/>
+        </w:rPr>
+        <w:drawing>
+          <wp:inline distT="0" distB="0" distL="0" distR="0" wp14:anchorId="64476E28" wp14:editId="556B43F7">
+            <wp:extent cx="5400040" cy="2949575"/>
+            <wp:effectExtent l="0" t="0" r="0" b="3175"/>
+            <wp:docPr id="686857859" name="Imagen 1"/>
+            <wp:cNvGraphicFramePr>
+              <a:graphicFrameLocks xmlns:a="http://schemas.openxmlformats.org/drawingml/2006/main" noChangeAspect="1"/>
+            </wp:cNvGraphicFramePr>
+            <a:graphic xmlns:a="http://schemas.openxmlformats.org/drawingml/2006/main">
+              <a:graphicData uri="http://schemas.openxmlformats.org/drawingml/2006/picture">
+                <pic:pic xmlns:pic="http://schemas.openxmlformats.org/drawingml/2006/picture">
+                  <pic:nvPicPr>
+                    <pic:cNvPr id="686857859" name=""/>
+                    <pic:cNvPicPr/>
+                  </pic:nvPicPr>
+                  <pic:blipFill>
+                    <a:blip r:embed="rId37"/>
+                    <a:stretch>
+                      <a:fillRect/>
+                    </a:stretch>
+                  </pic:blipFill>
+                  <pic:spPr>
+                    <a:xfrm>
+                      <a:off x="0" y="0"/>
+                      <a:ext cx="5400040" cy="2949575"/>
+                    </a:xfrm>
+                    <a:prstGeom prst="rect">
+                      <a:avLst/>
+                    </a:prstGeom>
+                  </pic:spPr>
+                </pic:pic>
+              </a:graphicData>
+            </a:graphic>
+          </wp:inline>
+        </w:drawing>
       </w:r>
     </w:p>
     <w:sectPr>
@@ -3899,7 +5126,6 @@
   <w:style w:type="character" w:default="1" w:styleId="Fuentedeprrafopredeter">
     <w:name w:val="Default Paragraph Font"/>
     <w:uiPriority w:val="1"/>
-    <w:semiHidden/>
     <w:unhideWhenUsed/>
   </w:style>
   <w:style w:type="table" w:default="1" w:styleId="Tablanormal">

</xml_diff>

<commit_message>
Añadidos colores a los textos de la terminal de java. Informe avanzado
</commit_message>
<xml_diff>
--- a/documentacion/Informe.docx
+++ b/documentacion/Informe.docx
@@ -157,12 +157,37 @@
           <w:szCs w:val="24"/>
         </w:rPr>
       </w:pPr>
-      <w:r>
-        <w:rPr>
-          <w:sz w:val="24"/>
-          <w:szCs w:val="24"/>
-        </w:rPr>
-        <w:t>Obicación: Estadio el Molinón, Gijón</w:t>
+      <w:proofErr w:type="spellStart"/>
+      <w:r>
+        <w:rPr>
+          <w:sz w:val="24"/>
+          <w:szCs w:val="24"/>
+        </w:rPr>
+        <w:t>Obicación</w:t>
+      </w:r>
+      <w:proofErr w:type="spellEnd"/>
+      <w:r>
+        <w:rPr>
+          <w:sz w:val="24"/>
+          <w:szCs w:val="24"/>
+        </w:rPr>
+        <w:t xml:space="preserve">: Estadio el </w:t>
+      </w:r>
+      <w:proofErr w:type="spellStart"/>
+      <w:r>
+        <w:rPr>
+          <w:sz w:val="24"/>
+          <w:szCs w:val="24"/>
+        </w:rPr>
+        <w:t>Molinón</w:t>
+      </w:r>
+      <w:proofErr w:type="spellEnd"/>
+      <w:r>
+        <w:rPr>
+          <w:sz w:val="24"/>
+          <w:szCs w:val="24"/>
+        </w:rPr>
+        <w:t>, Gijón</w:t>
       </w:r>
     </w:p>
     <w:p>
@@ -237,12 +262,21 @@
           <w:szCs w:val="24"/>
         </w:rPr>
       </w:pPr>
-      <w:r>
-        <w:rPr>
-          <w:sz w:val="24"/>
-          <w:szCs w:val="24"/>
-        </w:rPr>
-        <w:t>Boombastic Asturias 2026</w:t>
+      <w:proofErr w:type="spellStart"/>
+      <w:r>
+        <w:rPr>
+          <w:sz w:val="24"/>
+          <w:szCs w:val="24"/>
+        </w:rPr>
+        <w:t>Boombastic</w:t>
+      </w:r>
+      <w:proofErr w:type="spellEnd"/>
+      <w:r>
+        <w:rPr>
+          <w:sz w:val="24"/>
+          <w:szCs w:val="24"/>
+        </w:rPr>
+        <w:t xml:space="preserve"> Asturias 2026</w:t>
       </w:r>
     </w:p>
     <w:p>
@@ -630,6 +664,7 @@
     </w:p>
     <w:p>
       <w:pPr>
+        <w:jc w:val="center"/>
         <w:rPr>
           <w:b/>
           <w:bCs/>
@@ -637,12 +672,1188 @@
           <w:szCs w:val="40"/>
         </w:rPr>
       </w:pPr>
-      <w:r>
+    </w:p>
+    <w:p>
+      <w:pPr>
+        <w:rPr>
+          <w:sz w:val="24"/>
+          <w:szCs w:val="24"/>
+        </w:rPr>
+      </w:pPr>
+      <w:r>
+        <w:rPr>
+          <w:sz w:val="24"/>
+          <w:szCs w:val="24"/>
+        </w:rPr>
+        <w:t xml:space="preserve">El apartado de lenguaje de marcas (la web) se creó usando </w:t>
+      </w:r>
+      <w:proofErr w:type="spellStart"/>
+      <w:r>
+        <w:rPr>
+          <w:sz w:val="24"/>
+          <w:szCs w:val="24"/>
+        </w:rPr>
+        <w:t>React</w:t>
+      </w:r>
+      <w:proofErr w:type="spellEnd"/>
+      <w:r>
+        <w:rPr>
+          <w:sz w:val="24"/>
+          <w:szCs w:val="24"/>
+        </w:rPr>
+        <w:t xml:space="preserve"> y por tanto debe ejecutarse en un servidor local de Node.js. Es necesario tener Node.js instalado en el equipo.</w:t>
+      </w:r>
+    </w:p>
+    <w:p>
+      <w:pPr>
+        <w:rPr>
+          <w:sz w:val="24"/>
+          <w:szCs w:val="24"/>
+        </w:rPr>
+      </w:pPr>
+      <w:r>
+        <w:rPr>
+          <w:sz w:val="24"/>
+          <w:szCs w:val="24"/>
+        </w:rPr>
+        <w:t xml:space="preserve">Para consultar si tiene Node.js instalado, ejecute el </w:t>
+      </w:r>
+      <w:proofErr w:type="spellStart"/>
+      <w:r>
+        <w:rPr>
+          <w:sz w:val="24"/>
+          <w:szCs w:val="24"/>
+        </w:rPr>
+        <w:t>sigiuente</w:t>
+      </w:r>
+      <w:proofErr w:type="spellEnd"/>
+      <w:r>
+        <w:rPr>
+          <w:sz w:val="24"/>
+          <w:szCs w:val="24"/>
+        </w:rPr>
+        <w:t xml:space="preserve"> comando en </w:t>
+      </w:r>
+      <w:proofErr w:type="spellStart"/>
+      <w:r>
+        <w:rPr>
+          <w:sz w:val="24"/>
+          <w:szCs w:val="24"/>
+        </w:rPr>
+        <w:t>command</w:t>
+      </w:r>
+      <w:proofErr w:type="spellEnd"/>
+      <w:r>
+        <w:rPr>
+          <w:sz w:val="24"/>
+          <w:szCs w:val="24"/>
+        </w:rPr>
+        <w:t xml:space="preserve"> </w:t>
+      </w:r>
+      <w:proofErr w:type="spellStart"/>
+      <w:r>
+        <w:rPr>
+          <w:sz w:val="24"/>
+          <w:szCs w:val="24"/>
+        </w:rPr>
+        <w:t>prompt</w:t>
+      </w:r>
+      <w:proofErr w:type="spellEnd"/>
+      <w:r>
+        <w:rPr>
+          <w:sz w:val="24"/>
+          <w:szCs w:val="24"/>
+        </w:rPr>
+        <w:t>:</w:t>
+      </w:r>
+      <w:r>
+        <w:rPr>
+          <w:sz w:val="24"/>
+          <w:szCs w:val="24"/>
+        </w:rPr>
+        <w:t xml:space="preserve"> </w:t>
+      </w:r>
+      <w:proofErr w:type="spellStart"/>
+      <w:r>
+        <w:rPr>
+          <w:rStyle w:val="codigoCar"/>
+          <w:rFonts w:ascii="Consolas" w:hAnsi="Consolas"/>
+          <w:b w:val="0"/>
+          <w:bCs/>
+          <w:highlight w:val="lightGray"/>
+        </w:rPr>
+        <w:t>node</w:t>
+      </w:r>
+      <w:proofErr w:type="spellEnd"/>
+      <w:r>
+        <w:rPr>
+          <w:rStyle w:val="codigoCar"/>
+          <w:rFonts w:ascii="Consolas" w:hAnsi="Consolas"/>
+          <w:b w:val="0"/>
+          <w:bCs/>
+          <w:highlight w:val="lightGray"/>
+        </w:rPr>
+        <w:t xml:space="preserve"> -v</w:t>
+      </w:r>
+    </w:p>
+    <w:p>
+      <w:pPr>
+        <w:rPr>
+          <w:b/>
+          <w:bCs/>
+          <w:sz w:val="32"/>
+          <w:szCs w:val="32"/>
+        </w:rPr>
+      </w:pPr>
+      <w:r>
+        <w:rPr>
+          <w:b/>
+          <w:bCs/>
+          <w:sz w:val="32"/>
+          <w:szCs w:val="32"/>
+        </w:rPr>
+        <w:t>INSTALACIÓN Y USO:</w:t>
+      </w:r>
+    </w:p>
+    <w:p>
+      <w:pPr>
+        <w:rPr>
+          <w:sz w:val="24"/>
+          <w:szCs w:val="24"/>
+        </w:rPr>
+      </w:pPr>
+      <w:r>
+        <w:rPr>
+          <w:sz w:val="24"/>
+          <w:szCs w:val="24"/>
+        </w:rPr>
+        <w:t xml:space="preserve">1. Descargar </w:t>
+      </w:r>
+      <w:proofErr w:type="spellStart"/>
+      <w:r>
+        <w:rPr>
+          <w:sz w:val="24"/>
+          <w:szCs w:val="24"/>
+        </w:rPr>
+        <w:t>el</w:t>
+      </w:r>
+      <w:proofErr w:type="spellEnd"/>
+      <w:r>
+        <w:rPr>
+          <w:sz w:val="24"/>
+          <w:szCs w:val="24"/>
+        </w:rPr>
+        <w:t xml:space="preserve"> .zip del repositorio.</w:t>
+      </w:r>
+    </w:p>
+    <w:p>
+      <w:pPr>
+        <w:rPr>
+          <w:sz w:val="24"/>
+          <w:szCs w:val="24"/>
+        </w:rPr>
+      </w:pPr>
+      <w:r>
+        <w:rPr>
+          <w:sz w:val="24"/>
+          <w:szCs w:val="24"/>
+        </w:rPr>
+        <w:t>2. Extraer el zip.</w:t>
+      </w:r>
+    </w:p>
+    <w:p>
+      <w:pPr>
+        <w:rPr>
+          <w:sz w:val="24"/>
+          <w:szCs w:val="24"/>
+        </w:rPr>
+      </w:pPr>
+      <w:r>
+        <w:rPr>
+          <w:sz w:val="24"/>
+          <w:szCs w:val="24"/>
+        </w:rPr>
+        <w:t xml:space="preserve">3. Desde un </w:t>
+      </w:r>
+      <w:proofErr w:type="spellStart"/>
+      <w:r>
+        <w:rPr>
+          <w:sz w:val="24"/>
+          <w:szCs w:val="24"/>
+        </w:rPr>
+        <w:t>command</w:t>
+      </w:r>
+      <w:proofErr w:type="spellEnd"/>
+      <w:r>
+        <w:rPr>
+          <w:sz w:val="24"/>
+          <w:szCs w:val="24"/>
+        </w:rPr>
+        <w:t xml:space="preserve"> </w:t>
+      </w:r>
+      <w:proofErr w:type="spellStart"/>
+      <w:r>
+        <w:rPr>
+          <w:sz w:val="24"/>
+          <w:szCs w:val="24"/>
+        </w:rPr>
+        <w:t>prompt</w:t>
+      </w:r>
+      <w:proofErr w:type="spellEnd"/>
+      <w:r>
+        <w:rPr>
+          <w:sz w:val="24"/>
+          <w:szCs w:val="24"/>
+        </w:rPr>
+        <w:t xml:space="preserve"> (recomendado el de </w:t>
+      </w:r>
+      <w:proofErr w:type="spellStart"/>
+      <w:r>
+        <w:rPr>
+          <w:sz w:val="24"/>
+          <w:szCs w:val="24"/>
+        </w:rPr>
+        <w:t>vscode</w:t>
+      </w:r>
+      <w:proofErr w:type="spellEnd"/>
+      <w:r>
+        <w:rPr>
+          <w:sz w:val="24"/>
+          <w:szCs w:val="24"/>
+        </w:rPr>
+        <w:t>), ubicarse en el directorio "web2.0".</w:t>
+      </w:r>
+    </w:p>
+    <w:p>
+      <w:pPr>
+        <w:rPr>
+          <w:sz w:val="24"/>
+          <w:szCs w:val="24"/>
+        </w:rPr>
+      </w:pPr>
+      <w:r>
+        <w:rPr>
+          <w:noProof/>
+        </w:rPr>
+        <w:drawing>
+          <wp:inline distT="0" distB="0" distL="0" distR="0" wp14:anchorId="4DBAEFF9" wp14:editId="66BCCA36">
+            <wp:extent cx="4831080" cy="1227653"/>
+            <wp:effectExtent l="0" t="0" r="7620" b="0"/>
+            <wp:docPr id="1720984851" name="Imagen 7"/>
+            <wp:cNvGraphicFramePr>
+              <a:graphicFrameLocks xmlns:a="http://schemas.openxmlformats.org/drawingml/2006/main" noChangeAspect="1"/>
+            </wp:cNvGraphicFramePr>
+            <a:graphic xmlns:a="http://schemas.openxmlformats.org/drawingml/2006/main">
+              <a:graphicData uri="http://schemas.openxmlformats.org/drawingml/2006/picture">
+                <pic:pic xmlns:pic="http://schemas.openxmlformats.org/drawingml/2006/picture">
+                  <pic:nvPicPr>
+                    <pic:cNvPr id="0" name="Picture 13"/>
+                    <pic:cNvPicPr>
+                      <a:picLocks noChangeAspect="1" noChangeArrowheads="1"/>
+                    </pic:cNvPicPr>
+                  </pic:nvPicPr>
+                  <pic:blipFill>
+                    <a:blip r:embed="rId5">
+                      <a:extLst>
+                        <a:ext uri="{28A0092B-C50C-407E-A947-70E740481C1C}">
+                          <a14:useLocalDpi xmlns:a14="http://schemas.microsoft.com/office/drawing/2010/main" val="0"/>
+                        </a:ext>
+                      </a:extLst>
+                    </a:blip>
+                    <a:srcRect/>
+                    <a:stretch>
+                      <a:fillRect/>
+                    </a:stretch>
+                  </pic:blipFill>
+                  <pic:spPr bwMode="auto">
+                    <a:xfrm>
+                      <a:off x="0" y="0"/>
+                      <a:ext cx="4836901" cy="1229132"/>
+                    </a:xfrm>
+                    <a:prstGeom prst="rect">
+                      <a:avLst/>
+                    </a:prstGeom>
+                    <a:noFill/>
+                    <a:ln>
+                      <a:noFill/>
+                    </a:ln>
+                  </pic:spPr>
+                </pic:pic>
+              </a:graphicData>
+            </a:graphic>
+          </wp:inline>
+        </w:drawing>
+      </w:r>
+    </w:p>
+    <w:p>
+      <w:pPr>
+        <w:rPr>
+          <w:sz w:val="24"/>
+          <w:szCs w:val="24"/>
+        </w:rPr>
+      </w:pPr>
+      <w:r>
+        <w:rPr>
+          <w:sz w:val="24"/>
+          <w:szCs w:val="24"/>
+        </w:rPr>
+        <w:t>4. Ejecutar el siguiente comando:</w:t>
+      </w:r>
+    </w:p>
+    <w:p>
+      <w:pPr>
+        <w:pStyle w:val="codigo"/>
+        <w:rPr>
+          <w:rFonts w:ascii="Consolas" w:hAnsi="Consolas"/>
+        </w:rPr>
+      </w:pPr>
+      <w:proofErr w:type="spellStart"/>
+      <w:r>
+        <w:rPr>
+          <w:rFonts w:ascii="Consolas" w:hAnsi="Consolas"/>
+          <w:highlight w:val="lightGray"/>
+        </w:rPr>
+        <w:t>npm</w:t>
+      </w:r>
+      <w:proofErr w:type="spellEnd"/>
+      <w:r>
+        <w:rPr>
+          <w:rFonts w:ascii="Consolas" w:hAnsi="Consolas"/>
+          <w:highlight w:val="lightGray"/>
+        </w:rPr>
+        <w:t xml:space="preserve"> run </w:t>
+      </w:r>
+      <w:proofErr w:type="spellStart"/>
+      <w:r>
+        <w:rPr>
+          <w:rFonts w:ascii="Consolas" w:hAnsi="Consolas"/>
+          <w:highlight w:val="lightGray"/>
+        </w:rPr>
+        <w:t>dev</w:t>
+      </w:r>
+      <w:proofErr w:type="spellEnd"/>
+    </w:p>
+    <w:p>
+      <w:pPr>
+        <w:rPr>
+          <w:sz w:val="24"/>
+          <w:szCs w:val="24"/>
+        </w:rPr>
+      </w:pPr>
+      <w:r>
+        <w:rPr>
+          <w:sz w:val="24"/>
+          <w:szCs w:val="24"/>
+        </w:rPr>
+        <w:t xml:space="preserve">5. Hacer </w:t>
+      </w:r>
+      <w:proofErr w:type="spellStart"/>
+      <w:r>
+        <w:rPr>
+          <w:sz w:val="24"/>
+          <w:szCs w:val="24"/>
+        </w:rPr>
+        <w:t>click</w:t>
+      </w:r>
+      <w:proofErr w:type="spellEnd"/>
+      <w:r>
+        <w:rPr>
+          <w:sz w:val="24"/>
+          <w:szCs w:val="24"/>
+        </w:rPr>
+        <w:t xml:space="preserve"> en el enlace que aparece en el </w:t>
+      </w:r>
+      <w:proofErr w:type="spellStart"/>
+      <w:r>
+        <w:rPr>
+          <w:sz w:val="24"/>
+          <w:szCs w:val="24"/>
+        </w:rPr>
+        <w:t>cmd</w:t>
+      </w:r>
+      <w:proofErr w:type="spellEnd"/>
+      <w:r>
+        <w:rPr>
+          <w:sz w:val="24"/>
+          <w:szCs w:val="24"/>
+        </w:rPr>
+        <w:t xml:space="preserve">. Si no deja hacer </w:t>
+      </w:r>
+      <w:proofErr w:type="spellStart"/>
+      <w:r>
+        <w:rPr>
+          <w:sz w:val="24"/>
+          <w:szCs w:val="24"/>
+        </w:rPr>
+        <w:t>click</w:t>
+      </w:r>
+      <w:proofErr w:type="spellEnd"/>
+      <w:r>
+        <w:rPr>
+          <w:sz w:val="24"/>
+          <w:szCs w:val="24"/>
+        </w:rPr>
+        <w:t>, puede copiar y pegar el enlace en su navegador.</w:t>
+      </w:r>
+    </w:p>
+    <w:p>
+      <w:pPr>
+        <w:rPr>
+          <w:sz w:val="24"/>
+          <w:szCs w:val="24"/>
+        </w:rPr>
+      </w:pPr>
+      <w:r>
+        <w:rPr>
+          <w:noProof/>
+        </w:rPr>
+        <w:drawing>
+          <wp:inline distT="0" distB="0" distL="0" distR="0" wp14:anchorId="2F7AD7DA" wp14:editId="21CE1DB4">
+            <wp:extent cx="2659380" cy="1109505"/>
+            <wp:effectExtent l="0" t="0" r="7620" b="0"/>
+            <wp:docPr id="13514111" name="Imagen 1"/>
+            <wp:cNvGraphicFramePr>
+              <a:graphicFrameLocks xmlns:a="http://schemas.openxmlformats.org/drawingml/2006/main" noChangeAspect="1"/>
+            </wp:cNvGraphicFramePr>
+            <a:graphic xmlns:a="http://schemas.openxmlformats.org/drawingml/2006/main">
+              <a:graphicData uri="http://schemas.openxmlformats.org/drawingml/2006/picture">
+                <pic:pic xmlns:pic="http://schemas.openxmlformats.org/drawingml/2006/picture">
+                  <pic:nvPicPr>
+                    <pic:cNvPr id="13514111" name=""/>
+                    <pic:cNvPicPr/>
+                  </pic:nvPicPr>
+                  <pic:blipFill>
+                    <a:blip r:embed="rId6"/>
+                    <a:stretch>
+                      <a:fillRect/>
+                    </a:stretch>
+                  </pic:blipFill>
+                  <pic:spPr>
+                    <a:xfrm>
+                      <a:off x="0" y="0"/>
+                      <a:ext cx="2670350" cy="1114082"/>
+                    </a:xfrm>
+                    <a:prstGeom prst="rect">
+                      <a:avLst/>
+                    </a:prstGeom>
+                  </pic:spPr>
+                </pic:pic>
+              </a:graphicData>
+            </a:graphic>
+          </wp:inline>
+        </w:drawing>
+      </w:r>
+    </w:p>
+    <w:p>
+      <w:pPr>
+        <w:rPr>
+          <w:b/>
+          <w:bCs/>
+          <w:sz w:val="32"/>
+          <w:szCs w:val="32"/>
+        </w:rPr>
+      </w:pPr>
+      <w:r>
+        <w:rPr>
+          <w:b/>
+          <w:bCs/>
+          <w:sz w:val="32"/>
+          <w:szCs w:val="32"/>
+        </w:rPr>
+        <w:br w:type="page"/>
+      </w:r>
+    </w:p>
+    <w:p>
+      <w:pPr>
+        <w:rPr>
+          <w:b/>
+          <w:bCs/>
+          <w:sz w:val="32"/>
+          <w:szCs w:val="32"/>
+        </w:rPr>
+      </w:pPr>
+      <w:r>
+        <w:rPr>
+          <w:b/>
+          <w:bCs/>
+          <w:sz w:val="32"/>
+          <w:szCs w:val="32"/>
+        </w:rPr>
+        <w:lastRenderedPageBreak/>
+        <w:t>FUNCIONAMIENTO DE LA WEB:</w:t>
+      </w:r>
+    </w:p>
+    <w:p>
+      <w:pPr>
         <w:rPr>
           <w:b/>
           <w:bCs/>
           <w:sz w:val="40"/>
           <w:szCs w:val="40"/>
+        </w:rPr>
+      </w:pPr>
+      <w:r>
+        <w:rPr>
+          <w:b/>
+          <w:bCs/>
+          <w:sz w:val="28"/>
+          <w:szCs w:val="28"/>
+        </w:rPr>
+        <w:t>Archivo JSON</w:t>
+      </w:r>
+    </w:p>
+    <w:p>
+      <w:pPr>
+        <w:rPr>
+          <w:sz w:val="24"/>
+          <w:szCs w:val="24"/>
+        </w:rPr>
+      </w:pPr>
+      <w:r>
+        <w:rPr>
+          <w:sz w:val="24"/>
+          <w:szCs w:val="24"/>
+        </w:rPr>
+        <w:t xml:space="preserve">Los eventos disponibles, lo cuales corresponden a los del apartado de bases de datos, </w:t>
+      </w:r>
+    </w:p>
+    <w:p>
+      <w:pPr>
+        <w:rPr>
+          <w:sz w:val="24"/>
+          <w:szCs w:val="24"/>
+        </w:rPr>
+      </w:pPr>
+      <w:r>
+        <w:rPr>
+          <w:sz w:val="24"/>
+          <w:szCs w:val="24"/>
+        </w:rPr>
+        <w:t xml:space="preserve">son registrados en un archivo JSON para evitar redundancia de componentes (no tener que crear un archivo </w:t>
+      </w:r>
+      <w:proofErr w:type="spellStart"/>
+      <w:r>
+        <w:rPr>
+          <w:sz w:val="24"/>
+          <w:szCs w:val="24"/>
+        </w:rPr>
+        <w:t>html</w:t>
+      </w:r>
+      <w:proofErr w:type="spellEnd"/>
+      <w:r>
+        <w:rPr>
+          <w:sz w:val="24"/>
+          <w:szCs w:val="24"/>
+        </w:rPr>
+        <w:t xml:space="preserve"> para cada evento).</w:t>
+      </w:r>
+    </w:p>
+    <w:p>
+      <w:pPr>
+        <w:rPr>
+          <w:sz w:val="24"/>
+          <w:szCs w:val="24"/>
+        </w:rPr>
+      </w:pPr>
+      <w:proofErr w:type="spellStart"/>
+      <w:r>
+        <w:rPr>
+          <w:sz w:val="24"/>
+          <w:szCs w:val="24"/>
+        </w:rPr>
+        <w:t>dqqq</w:t>
+      </w:r>
+      <w:proofErr w:type="spellEnd"/>
+    </w:p>
+    <w:p>
+      <w:pPr>
+        <w:rPr>
+          <w:sz w:val="24"/>
+          <w:szCs w:val="24"/>
+        </w:rPr>
+      </w:pPr>
+      <w:r>
+        <w:rPr>
+          <w:sz w:val="24"/>
+          <w:szCs w:val="24"/>
+        </w:rPr>
+        <w:t>El JSON está compuesto por objectos, cada uno representando un evento. Cada evento tiene las siguientes propiedades:</w:t>
+      </w:r>
+      <w:r>
+        <w:rPr>
+          <w:sz w:val="24"/>
+          <w:szCs w:val="24"/>
+        </w:rPr>
+        <w:t xml:space="preserve"> </w:t>
+      </w:r>
+    </w:p>
+    <w:p>
+      <w:pPr>
+        <w:rPr>
+          <w:sz w:val="24"/>
+          <w:szCs w:val="24"/>
+        </w:rPr>
+      </w:pPr>
+      <w:r>
+        <w:rPr>
+          <w:noProof/>
+        </w:rPr>
+        <w:drawing>
+          <wp:inline distT="0" distB="0" distL="0" distR="0" wp14:anchorId="37AC3DA4" wp14:editId="48623456">
+            <wp:extent cx="5400040" cy="1916430"/>
+            <wp:effectExtent l="0" t="0" r="0" b="7620"/>
+            <wp:docPr id="1125118928" name="Imagen 1"/>
+            <wp:cNvGraphicFramePr>
+              <a:graphicFrameLocks xmlns:a="http://schemas.openxmlformats.org/drawingml/2006/main" noChangeAspect="1"/>
+            </wp:cNvGraphicFramePr>
+            <a:graphic xmlns:a="http://schemas.openxmlformats.org/drawingml/2006/main">
+              <a:graphicData uri="http://schemas.openxmlformats.org/drawingml/2006/picture">
+                <pic:pic xmlns:pic="http://schemas.openxmlformats.org/drawingml/2006/picture">
+                  <pic:nvPicPr>
+                    <pic:cNvPr id="0" name="Picture 1"/>
+                    <pic:cNvPicPr>
+                      <a:picLocks noChangeAspect="1" noChangeArrowheads="1"/>
+                    </pic:cNvPicPr>
+                  </pic:nvPicPr>
+                  <pic:blipFill>
+                    <a:blip r:embed="rId7" cstate="print">
+                      <a:extLst>
+                        <a:ext uri="{28A0092B-C50C-407E-A947-70E740481C1C}">
+                          <a14:useLocalDpi xmlns:a14="http://schemas.microsoft.com/office/drawing/2010/main" val="0"/>
+                        </a:ext>
+                      </a:extLst>
+                    </a:blip>
+                    <a:srcRect/>
+                    <a:stretch>
+                      <a:fillRect/>
+                    </a:stretch>
+                  </pic:blipFill>
+                  <pic:spPr bwMode="auto">
+                    <a:xfrm>
+                      <a:off x="0" y="0"/>
+                      <a:ext cx="5400040" cy="1916430"/>
+                    </a:xfrm>
+                    <a:prstGeom prst="rect">
+                      <a:avLst/>
+                    </a:prstGeom>
+                    <a:noFill/>
+                    <a:ln>
+                      <a:noFill/>
+                    </a:ln>
+                  </pic:spPr>
+                </pic:pic>
+              </a:graphicData>
+            </a:graphic>
+          </wp:inline>
+        </w:drawing>
+      </w:r>
+    </w:p>
+    <w:p>
+      <w:pPr>
+        <w:rPr>
+          <w:sz w:val="24"/>
+          <w:szCs w:val="24"/>
+        </w:rPr>
+      </w:pPr>
+      <w:r>
+        <w:rPr>
+          <w:sz w:val="24"/>
+          <w:szCs w:val="24"/>
+        </w:rPr>
+        <w:t>La propiedad "galería" puede ser en algunos caso</w:t>
+      </w:r>
+      <w:r>
+        <w:rPr>
+          <w:sz w:val="24"/>
+          <w:szCs w:val="24"/>
+        </w:rPr>
+        <w:t>s</w:t>
+      </w:r>
+      <w:r>
+        <w:rPr>
+          <w:sz w:val="24"/>
+          <w:szCs w:val="24"/>
+        </w:rPr>
+        <w:t xml:space="preserve"> "</w:t>
+      </w:r>
+      <w:proofErr w:type="spellStart"/>
+      <w:r>
+        <w:rPr>
+          <w:sz w:val="24"/>
+          <w:szCs w:val="24"/>
+        </w:rPr>
+        <w:t>null</w:t>
+      </w:r>
+      <w:proofErr w:type="spellEnd"/>
+      <w:r>
+        <w:rPr>
+          <w:sz w:val="24"/>
+          <w:szCs w:val="24"/>
+        </w:rPr>
+        <w:t>" si el evento aún no tiene una. Lo mismo se aplica al poster, en cuyo caso se usará una imagen temporal.</w:t>
+      </w:r>
+    </w:p>
+    <w:p>
+      <w:pPr>
+        <w:rPr>
+          <w:sz w:val="24"/>
+          <w:szCs w:val="24"/>
+        </w:rPr>
+      </w:pPr>
+    </w:p>
+    <w:p>
+      <w:pPr>
+        <w:rPr>
+          <w:sz w:val="24"/>
+          <w:szCs w:val="24"/>
+        </w:rPr>
+      </w:pPr>
+    </w:p>
+    <w:p>
+      <w:pPr>
+        <w:rPr>
+          <w:b/>
+          <w:bCs/>
+          <w:sz w:val="28"/>
+          <w:szCs w:val="28"/>
+        </w:rPr>
+      </w:pPr>
+      <w:r>
+        <w:rPr>
+          <w:b/>
+          <w:bCs/>
+          <w:sz w:val="28"/>
+          <w:szCs w:val="28"/>
+        </w:rPr>
+        <w:t>Sistema de eventos</w:t>
+      </w:r>
+    </w:p>
+    <w:p>
+      <w:pPr>
+        <w:rPr>
+          <w:sz w:val="24"/>
+          <w:szCs w:val="24"/>
+        </w:rPr>
+      </w:pPr>
+      <w:r>
+        <w:rPr>
+          <w:sz w:val="24"/>
+          <w:szCs w:val="24"/>
+        </w:rPr>
+        <w:t xml:space="preserve">Al entrar a cualquier página de la web que muestre eventos, la web hace un bucle iterando por cada evento en el JSON. La función le </w:t>
+      </w:r>
+    </w:p>
+    <w:p>
+      <w:pPr>
+        <w:rPr>
+          <w:sz w:val="24"/>
+          <w:szCs w:val="24"/>
+        </w:rPr>
+      </w:pPr>
+      <w:r>
+        <w:rPr>
+          <w:sz w:val="24"/>
+          <w:szCs w:val="24"/>
+        </w:rPr>
+        <w:t>pasa el evento junto a sus atributos al componente necesario para que él muestre la información del evento.</w:t>
+      </w:r>
+    </w:p>
+    <w:p>
+      <w:pPr>
+        <w:rPr>
+          <w:b/>
+          <w:bCs/>
+          <w:sz w:val="24"/>
+          <w:szCs w:val="24"/>
+        </w:rPr>
+      </w:pPr>
+      <w:r>
+        <w:rPr>
+          <w:b/>
+          <w:bCs/>
+          <w:sz w:val="24"/>
+          <w:szCs w:val="24"/>
+        </w:rPr>
+        <w:t>Ejemplo:</w:t>
+      </w:r>
+    </w:p>
+    <w:p>
+      <w:pPr>
+        <w:rPr>
+          <w:sz w:val="24"/>
+          <w:szCs w:val="24"/>
+        </w:rPr>
+      </w:pPr>
+      <w:r>
+        <w:rPr>
+          <w:sz w:val="24"/>
+          <w:szCs w:val="24"/>
+        </w:rPr>
+        <w:t>Para las tarjetas de evento, la web lee los eventos uno por uno y llama al componente "</w:t>
+      </w:r>
+      <w:proofErr w:type="spellStart"/>
+      <w:r>
+        <w:rPr>
+          <w:sz w:val="24"/>
+          <w:szCs w:val="24"/>
+        </w:rPr>
+        <w:t>TarjetaEvento</w:t>
+      </w:r>
+      <w:proofErr w:type="spellEnd"/>
+      <w:r>
+        <w:rPr>
+          <w:sz w:val="24"/>
+          <w:szCs w:val="24"/>
+        </w:rPr>
+        <w:t xml:space="preserve">" uno por uno, pasándole 3 </w:t>
+      </w:r>
+      <w:proofErr w:type="spellStart"/>
+      <w:r>
+        <w:rPr>
+          <w:sz w:val="24"/>
+          <w:szCs w:val="24"/>
+        </w:rPr>
+        <w:t>parámentros</w:t>
+      </w:r>
+      <w:proofErr w:type="spellEnd"/>
+      <w:r>
+        <w:rPr>
+          <w:sz w:val="24"/>
+          <w:szCs w:val="24"/>
+        </w:rPr>
+        <w:t>, uno de ellos siendo el objeto evento.</w:t>
+      </w:r>
+    </w:p>
+    <w:p>
+      <w:pPr>
+        <w:rPr>
+          <w:sz w:val="24"/>
+          <w:szCs w:val="24"/>
+        </w:rPr>
+      </w:pPr>
+      <w:r>
+        <w:rPr>
+          <w:noProof/>
+        </w:rPr>
+        <w:lastRenderedPageBreak/>
+        <w:drawing>
+          <wp:inline distT="0" distB="0" distL="0" distR="0" wp14:anchorId="35A94AEB" wp14:editId="5CC642C6">
+            <wp:extent cx="5400040" cy="1188085"/>
+            <wp:effectExtent l="0" t="0" r="0" b="0"/>
+            <wp:docPr id="2100922790" name="Imagen 2"/>
+            <wp:cNvGraphicFramePr>
+              <a:graphicFrameLocks xmlns:a="http://schemas.openxmlformats.org/drawingml/2006/main" noChangeAspect="1"/>
+            </wp:cNvGraphicFramePr>
+            <a:graphic xmlns:a="http://schemas.openxmlformats.org/drawingml/2006/main">
+              <a:graphicData uri="http://schemas.openxmlformats.org/drawingml/2006/picture">
+                <pic:pic xmlns:pic="http://schemas.openxmlformats.org/drawingml/2006/picture">
+                  <pic:nvPicPr>
+                    <pic:cNvPr id="0" name="Picture 3"/>
+                    <pic:cNvPicPr>
+                      <a:picLocks noChangeAspect="1" noChangeArrowheads="1"/>
+                    </pic:cNvPicPr>
+                  </pic:nvPicPr>
+                  <pic:blipFill>
+                    <a:blip r:embed="rId8">
+                      <a:extLst>
+                        <a:ext uri="{28A0092B-C50C-407E-A947-70E740481C1C}">
+                          <a14:useLocalDpi xmlns:a14="http://schemas.microsoft.com/office/drawing/2010/main" val="0"/>
+                        </a:ext>
+                      </a:extLst>
+                    </a:blip>
+                    <a:srcRect/>
+                    <a:stretch>
+                      <a:fillRect/>
+                    </a:stretch>
+                  </pic:blipFill>
+                  <pic:spPr bwMode="auto">
+                    <a:xfrm>
+                      <a:off x="0" y="0"/>
+                      <a:ext cx="5400040" cy="1188085"/>
+                    </a:xfrm>
+                    <a:prstGeom prst="rect">
+                      <a:avLst/>
+                    </a:prstGeom>
+                    <a:noFill/>
+                    <a:ln>
+                      <a:noFill/>
+                    </a:ln>
+                  </pic:spPr>
+                </pic:pic>
+              </a:graphicData>
+            </a:graphic>
+          </wp:inline>
+        </w:drawing>
+      </w:r>
+    </w:p>
+    <w:p>
+      <w:pPr>
+        <w:rPr>
+          <w:sz w:val="24"/>
+          <w:szCs w:val="24"/>
+        </w:rPr>
+      </w:pPr>
+    </w:p>
+    <w:p>
+      <w:pPr>
+        <w:rPr>
+          <w:sz w:val="24"/>
+          <w:szCs w:val="24"/>
+        </w:rPr>
+      </w:pPr>
+      <w:r>
+        <w:rPr>
+          <w:sz w:val="24"/>
+          <w:szCs w:val="24"/>
+        </w:rPr>
+        <w:t>El componente recibe el parámetro del evento. Este es un objeto que contiene todas las propiedades disponibles del archivo JSON.</w:t>
+      </w:r>
+    </w:p>
+    <w:p>
+      <w:pPr>
+        <w:rPr>
+          <w:sz w:val="24"/>
+          <w:szCs w:val="24"/>
+        </w:rPr>
+      </w:pPr>
+    </w:p>
+    <w:p>
+      <w:pPr>
+        <w:rPr>
+          <w:sz w:val="24"/>
+          <w:szCs w:val="24"/>
+        </w:rPr>
+      </w:pPr>
+      <w:r>
+        <w:rPr>
+          <w:noProof/>
+        </w:rPr>
+        <w:drawing>
+          <wp:inline distT="0" distB="0" distL="0" distR="0" wp14:anchorId="014C3B6D" wp14:editId="3672E794">
+            <wp:extent cx="5400040" cy="2065655"/>
+            <wp:effectExtent l="0" t="0" r="0" b="0"/>
+            <wp:docPr id="1821971236" name="Imagen 3"/>
+            <wp:cNvGraphicFramePr>
+              <a:graphicFrameLocks xmlns:a="http://schemas.openxmlformats.org/drawingml/2006/main" noChangeAspect="1"/>
+            </wp:cNvGraphicFramePr>
+            <a:graphic xmlns:a="http://schemas.openxmlformats.org/drawingml/2006/main">
+              <a:graphicData uri="http://schemas.openxmlformats.org/drawingml/2006/picture">
+                <pic:pic xmlns:pic="http://schemas.openxmlformats.org/drawingml/2006/picture">
+                  <pic:nvPicPr>
+                    <pic:cNvPr id="0" name="Picture 5"/>
+                    <pic:cNvPicPr>
+                      <a:picLocks noChangeAspect="1" noChangeArrowheads="1"/>
+                    </pic:cNvPicPr>
+                  </pic:nvPicPr>
+                  <pic:blipFill>
+                    <a:blip r:embed="rId9">
+                      <a:extLst>
+                        <a:ext uri="{28A0092B-C50C-407E-A947-70E740481C1C}">
+                          <a14:useLocalDpi xmlns:a14="http://schemas.microsoft.com/office/drawing/2010/main" val="0"/>
+                        </a:ext>
+                      </a:extLst>
+                    </a:blip>
+                    <a:srcRect/>
+                    <a:stretch>
+                      <a:fillRect/>
+                    </a:stretch>
+                  </pic:blipFill>
+                  <pic:spPr bwMode="auto">
+                    <a:xfrm>
+                      <a:off x="0" y="0"/>
+                      <a:ext cx="5400040" cy="2065655"/>
+                    </a:xfrm>
+                    <a:prstGeom prst="rect">
+                      <a:avLst/>
+                    </a:prstGeom>
+                    <a:noFill/>
+                    <a:ln>
+                      <a:noFill/>
+                    </a:ln>
+                  </pic:spPr>
+                </pic:pic>
+              </a:graphicData>
+            </a:graphic>
+          </wp:inline>
+        </w:drawing>
+      </w:r>
+    </w:p>
+    <w:p>
+      <w:pPr>
+        <w:rPr>
+          <w:sz w:val="24"/>
+          <w:szCs w:val="24"/>
+        </w:rPr>
+      </w:pPr>
+    </w:p>
+    <w:p>
+      <w:pPr>
+        <w:rPr>
+          <w:b/>
+          <w:bCs/>
+          <w:sz w:val="28"/>
+          <w:szCs w:val="28"/>
+        </w:rPr>
+      </w:pPr>
+      <w:r>
+        <w:rPr>
+          <w:b/>
+          <w:bCs/>
+          <w:sz w:val="28"/>
+          <w:szCs w:val="28"/>
+        </w:rPr>
+        <w:t>Colores dinámicos</w:t>
+      </w:r>
+    </w:p>
+    <w:p>
+      <w:pPr>
+        <w:rPr>
+          <w:sz w:val="24"/>
+          <w:szCs w:val="24"/>
+        </w:rPr>
+      </w:pPr>
+      <w:r>
+        <w:rPr>
+          <w:sz w:val="24"/>
+          <w:szCs w:val="24"/>
+        </w:rPr>
+        <w:t>Para mostrar el color característico del evento (el cual depende de la categoría), la web lee la propiedad de "categoría" en el evento, y</w:t>
+      </w:r>
+    </w:p>
+    <w:p>
+      <w:pPr>
+        <w:rPr>
+          <w:sz w:val="24"/>
+          <w:szCs w:val="24"/>
+        </w:rPr>
+      </w:pPr>
+      <w:r>
+        <w:rPr>
+          <w:sz w:val="24"/>
+          <w:szCs w:val="24"/>
+        </w:rPr>
+        <w:t xml:space="preserve">dependiendo de </w:t>
+      </w:r>
+      <w:proofErr w:type="spellStart"/>
+      <w:r>
+        <w:rPr>
+          <w:sz w:val="24"/>
+          <w:szCs w:val="24"/>
+        </w:rPr>
+        <w:t>cúal</w:t>
+      </w:r>
+      <w:proofErr w:type="spellEnd"/>
+      <w:r>
+        <w:rPr>
+          <w:sz w:val="24"/>
+          <w:szCs w:val="24"/>
+        </w:rPr>
+        <w:t xml:space="preserve"> es, se le asignará un color. Para lograr esto, existe una función JavaScript que devuelve un color dependiendo de la categoría dada.</w:t>
+      </w:r>
+    </w:p>
+    <w:p>
+      <w:pPr>
+        <w:rPr>
+          <w:sz w:val="24"/>
+          <w:szCs w:val="24"/>
+        </w:rPr>
+      </w:pPr>
+      <w:r>
+        <w:rPr>
+          <w:noProof/>
+        </w:rPr>
+        <w:lastRenderedPageBreak/>
+        <w:drawing>
+          <wp:inline distT="0" distB="0" distL="0" distR="0" wp14:anchorId="5D42E818" wp14:editId="7543E2D6">
+            <wp:extent cx="5400040" cy="3970655"/>
+            <wp:effectExtent l="0" t="0" r="0" b="0"/>
+            <wp:docPr id="457586136" name="Imagen 6"/>
+            <wp:cNvGraphicFramePr>
+              <a:graphicFrameLocks xmlns:a="http://schemas.openxmlformats.org/drawingml/2006/main" noChangeAspect="1"/>
+            </wp:cNvGraphicFramePr>
+            <a:graphic xmlns:a="http://schemas.openxmlformats.org/drawingml/2006/main">
+              <a:graphicData uri="http://schemas.openxmlformats.org/drawingml/2006/picture">
+                <pic:pic xmlns:pic="http://schemas.openxmlformats.org/drawingml/2006/picture">
+                  <pic:nvPicPr>
+                    <pic:cNvPr id="0" name="Picture 11"/>
+                    <pic:cNvPicPr>
+                      <a:picLocks noChangeAspect="1" noChangeArrowheads="1"/>
+                    </pic:cNvPicPr>
+                  </pic:nvPicPr>
+                  <pic:blipFill>
+                    <a:blip r:embed="rId10">
+                      <a:extLst>
+                        <a:ext uri="{28A0092B-C50C-407E-A947-70E740481C1C}">
+                          <a14:useLocalDpi xmlns:a14="http://schemas.microsoft.com/office/drawing/2010/main" val="0"/>
+                        </a:ext>
+                      </a:extLst>
+                    </a:blip>
+                    <a:srcRect/>
+                    <a:stretch>
+                      <a:fillRect/>
+                    </a:stretch>
+                  </pic:blipFill>
+                  <pic:spPr bwMode="auto">
+                    <a:xfrm>
+                      <a:off x="0" y="0"/>
+                      <a:ext cx="5400040" cy="3970655"/>
+                    </a:xfrm>
+                    <a:prstGeom prst="rect">
+                      <a:avLst/>
+                    </a:prstGeom>
+                    <a:noFill/>
+                    <a:ln>
+                      <a:noFill/>
+                    </a:ln>
+                  </pic:spPr>
+                </pic:pic>
+              </a:graphicData>
+            </a:graphic>
+          </wp:inline>
+        </w:drawing>
+      </w:r>
+    </w:p>
+    <w:p>
+      <w:pPr>
+        <w:rPr>
+          <w:sz w:val="24"/>
+          <w:szCs w:val="24"/>
+        </w:rPr>
+      </w:pPr>
+      <w:r>
+        <w:rPr>
+          <w:sz w:val="24"/>
+          <w:szCs w:val="24"/>
+        </w:rPr>
+        <w:t>Este sistema aporta una gran facilidad a la hora de crear eventos nuevos.</w:t>
+      </w:r>
+    </w:p>
+    <w:p>
+      <w:pPr>
+        <w:rPr>
+          <w:sz w:val="24"/>
+          <w:szCs w:val="24"/>
+        </w:rPr>
+      </w:pPr>
+    </w:p>
+    <w:p>
+      <w:pPr>
+        <w:rPr>
+          <w:sz w:val="24"/>
+          <w:szCs w:val="24"/>
+        </w:rPr>
+      </w:pPr>
+      <w:r>
+        <w:rPr>
+          <w:sz w:val="24"/>
+          <w:szCs w:val="24"/>
+        </w:rPr>
+        <w:tab/>
+      </w:r>
+      <w:r>
+        <w:rPr>
+          <w:sz w:val="24"/>
+          <w:szCs w:val="24"/>
         </w:rPr>
         <w:br w:type="page"/>
       </w:r>
@@ -714,7 +1925,7 @@
                     <pic:cNvPicPr/>
                   </pic:nvPicPr>
                   <pic:blipFill>
-                    <a:blip r:embed="rId5"/>
+                    <a:blip r:embed="rId11"/>
                     <a:stretch>
                       <a:fillRect/>
                     </a:stretch>
@@ -925,7 +2136,7 @@
                     <pic:cNvPicPr/>
                   </pic:nvPicPr>
                   <pic:blipFill>
-                    <a:blip r:embed="rId6"/>
+                    <a:blip r:embed="rId12"/>
                     <a:stretch>
                       <a:fillRect/>
                     </a:stretch>
@@ -1130,7 +2341,7 @@
                     <pic:cNvPicPr/>
                   </pic:nvPicPr>
                   <pic:blipFill>
-                    <a:blip r:embed="rId7"/>
+                    <a:blip r:embed="rId13"/>
                     <a:stretch>
                       <a:fillRect/>
                     </a:stretch>
@@ -1333,7 +2544,7 @@
                     <pic:cNvPicPr/>
                   </pic:nvPicPr>
                   <pic:blipFill>
-                    <a:blip r:embed="rId8"/>
+                    <a:blip r:embed="rId14"/>
                     <a:stretch>
                       <a:fillRect/>
                     </a:stretch>
@@ -1510,7 +2721,7 @@
                     <pic:cNvPicPr/>
                   </pic:nvPicPr>
                   <pic:blipFill>
-                    <a:blip r:embed="rId9"/>
+                    <a:blip r:embed="rId15"/>
                     <a:stretch>
                       <a:fillRect/>
                     </a:stretch>
@@ -1663,7 +2874,7 @@
                     <pic:cNvPicPr/>
                   </pic:nvPicPr>
                   <pic:blipFill>
-                    <a:blip r:embed="rId10"/>
+                    <a:blip r:embed="rId16"/>
                     <a:stretch>
                       <a:fillRect/>
                     </a:stretch>
@@ -1739,7 +2950,21 @@
           <w:sz w:val="24"/>
           <w:szCs w:val="24"/>
         </w:rPr>
-        <w:t>Los eventos insertados en la base de datos son:</w:t>
+        <w:t>Los eventos insertados en la base de datos son</w:t>
+      </w:r>
+      <w:r>
+        <w:rPr>
+          <w:sz w:val="24"/>
+          <w:szCs w:val="24"/>
+        </w:rPr>
+        <w:t xml:space="preserve"> (corresponden a los de la lista al principio del informe)</w:t>
+      </w:r>
+      <w:r>
+        <w:rPr>
+          <w:sz w:val="24"/>
+          <w:szCs w:val="24"/>
+        </w:rPr>
+        <w:t>:</w:t>
       </w:r>
     </w:p>
     <w:p>
@@ -1769,7 +2994,7 @@
                     <pic:cNvPicPr/>
                   </pic:nvPicPr>
                   <pic:blipFill>
-                    <a:blip r:embed="rId11"/>
+                    <a:blip r:embed="rId17"/>
                     <a:stretch>
                       <a:fillRect/>
                     </a:stretch>
@@ -1832,7 +3057,7 @@
                     <pic:cNvPicPr/>
                   </pic:nvPicPr>
                   <pic:blipFill>
-                    <a:blip r:embed="rId12"/>
+                    <a:blip r:embed="rId18"/>
                     <a:stretch>
                       <a:fillRect/>
                     </a:stretch>
@@ -1937,7 +3162,7 @@
                     <pic:cNvPicPr/>
                   </pic:nvPicPr>
                   <pic:blipFill>
-                    <a:blip r:embed="rId13"/>
+                    <a:blip r:embed="rId19"/>
                     <a:stretch>
                       <a:fillRect/>
                     </a:stretch>
@@ -2049,7 +3274,7 @@
                     <pic:cNvPicPr/>
                   </pic:nvPicPr>
                   <pic:blipFill>
-                    <a:blip r:embed="rId14"/>
+                    <a:blip r:embed="rId20"/>
                     <a:stretch>
                       <a:fillRect/>
                     </a:stretch>
@@ -2112,7 +3337,7 @@
                     <pic:cNvPicPr/>
                   </pic:nvPicPr>
                   <pic:blipFill>
-                    <a:blip r:embed="rId15"/>
+                    <a:blip r:embed="rId21"/>
                     <a:stretch>
                       <a:fillRect/>
                     </a:stretch>
@@ -2153,6 +3378,7 @@
           <w:sz w:val="24"/>
           <w:szCs w:val="24"/>
         </w:rPr>
+        <w:lastRenderedPageBreak/>
         <w:br w:type="page"/>
       </w:r>
     </w:p>
@@ -2231,7 +3457,7 @@
                     <pic:cNvPicPr/>
                   </pic:nvPicPr>
                   <pic:blipFill>
-                    <a:blip r:embed="rId16"/>
+                    <a:blip r:embed="rId22"/>
                     <a:stretch>
                       <a:fillRect/>
                     </a:stretch>
@@ -2279,7 +3505,7 @@
                     <pic:cNvPicPr/>
                   </pic:nvPicPr>
                   <pic:blipFill>
-                    <a:blip r:embed="rId17"/>
+                    <a:blip r:embed="rId23"/>
                     <a:stretch>
                       <a:fillRect/>
                     </a:stretch>
@@ -2316,43 +3542,7 @@
           <w:sz w:val="24"/>
           <w:szCs w:val="24"/>
         </w:rPr>
-        <w:t xml:space="preserve">Vista </w:t>
-      </w:r>
-      <w:r>
-        <w:rPr>
-          <w:b/>
-          <w:bCs/>
-          <w:sz w:val="24"/>
-          <w:szCs w:val="24"/>
-        </w:rPr>
-        <w:t>2</w:t>
-      </w:r>
-      <w:r>
-        <w:rPr>
-          <w:b/>
-          <w:bCs/>
-          <w:sz w:val="24"/>
-          <w:szCs w:val="24"/>
-        </w:rPr>
-        <w:t xml:space="preserve"> (Devolver </w:t>
-      </w:r>
-      <w:r>
-        <w:rPr>
-          <w:b/>
-          <w:bCs/>
-          <w:sz w:val="24"/>
-          <w:szCs w:val="24"/>
-        </w:rPr>
-        <w:t>los eventos favoritos del usuario 1</w:t>
-      </w:r>
-      <w:r>
-        <w:rPr>
-          <w:b/>
-          <w:bCs/>
-          <w:sz w:val="24"/>
-          <w:szCs w:val="24"/>
-        </w:rPr>
-        <w:t xml:space="preserve">): </w:t>
+        <w:t xml:space="preserve">Vista 2 (Devolver los eventos favoritos del usuario 1): </w:t>
       </w:r>
     </w:p>
     <w:p>
@@ -2382,7 +3572,7 @@
                     <pic:cNvPicPr/>
                   </pic:nvPicPr>
                   <pic:blipFill>
-                    <a:blip r:embed="rId18"/>
+                    <a:blip r:embed="rId24"/>
                     <a:stretch>
                       <a:fillRect/>
                     </a:stretch>
@@ -2430,7 +3620,7 @@
                     <pic:cNvPicPr/>
                   </pic:nvPicPr>
                   <pic:blipFill>
-                    <a:blip r:embed="rId19"/>
+                    <a:blip r:embed="rId25"/>
                     <a:stretch>
                       <a:fillRect/>
                     </a:stretch>
@@ -2467,43 +3657,7 @@
           <w:sz w:val="24"/>
           <w:szCs w:val="24"/>
         </w:rPr>
-        <w:t xml:space="preserve">Vista </w:t>
-      </w:r>
-      <w:r>
-        <w:rPr>
-          <w:b/>
-          <w:bCs/>
-          <w:sz w:val="24"/>
-          <w:szCs w:val="24"/>
-        </w:rPr>
-        <w:t>3</w:t>
-      </w:r>
-      <w:r>
-        <w:rPr>
-          <w:b/>
-          <w:bCs/>
-          <w:sz w:val="24"/>
-          <w:szCs w:val="24"/>
-        </w:rPr>
-        <w:t xml:space="preserve"> (Devolver</w:t>
-      </w:r>
-      <w:r>
-        <w:rPr>
-          <w:b/>
-          <w:bCs/>
-          <w:sz w:val="24"/>
-          <w:szCs w:val="24"/>
-        </w:rPr>
-        <w:t xml:space="preserve"> las imágenes de la galería del evento del 12-01-2026</w:t>
-      </w:r>
-      <w:r>
-        <w:rPr>
-          <w:b/>
-          <w:bCs/>
-          <w:sz w:val="24"/>
-          <w:szCs w:val="24"/>
-        </w:rPr>
-        <w:t xml:space="preserve">): </w:t>
+        <w:t xml:space="preserve">Vista 3 (Devolver las imágenes de la galería del evento del 12-01-2026): </w:t>
       </w:r>
     </w:p>
     <w:p>
@@ -2533,7 +3687,7 @@
                     <pic:cNvPicPr/>
                   </pic:nvPicPr>
                   <pic:blipFill>
-                    <a:blip r:embed="rId20"/>
+                    <a:blip r:embed="rId26"/>
                     <a:stretch>
                       <a:fillRect/>
                     </a:stretch>
@@ -2582,7 +3736,7 @@
                     <pic:cNvPicPr/>
                   </pic:nvPicPr>
                   <pic:blipFill>
-                    <a:blip r:embed="rId21"/>
+                    <a:blip r:embed="rId27"/>
                     <a:stretch>
                       <a:fillRect/>
                     </a:stretch>
@@ -2619,25 +3773,7 @@
           <w:sz w:val="24"/>
           <w:szCs w:val="24"/>
         </w:rPr>
-        <w:t xml:space="preserve">Vista </w:t>
-      </w:r>
-      <w:r>
-        <w:rPr>
-          <w:b/>
-          <w:bCs/>
-          <w:sz w:val="24"/>
-          <w:szCs w:val="24"/>
-        </w:rPr>
-        <w:t>4 (Devolver los eventos favoritos del usuario 2 posteriores al 28-02-2026</w:t>
-      </w:r>
-      <w:r>
-        <w:rPr>
-          <w:b/>
-          <w:bCs/>
-          <w:sz w:val="24"/>
-          <w:szCs w:val="24"/>
-        </w:rPr>
-        <w:t>):</w:t>
+        <w:t>Vista 4 (Devolver los eventos favoritos del usuario 2 posteriores al 28-02-2026):</w:t>
       </w:r>
     </w:p>
     <w:p>
@@ -2667,7 +3803,7 @@
                     <pic:cNvPicPr/>
                   </pic:nvPicPr>
                   <pic:blipFill>
-                    <a:blip r:embed="rId22"/>
+                    <a:blip r:embed="rId28"/>
                     <a:stretch>
                       <a:fillRect/>
                     </a:stretch>
@@ -2715,7 +3851,7 @@
                     <pic:cNvPicPr/>
                   </pic:nvPicPr>
                   <pic:blipFill>
-                    <a:blip r:embed="rId23"/>
+                    <a:blip r:embed="rId29"/>
                     <a:stretch>
                       <a:fillRect/>
                     </a:stretch>
@@ -2818,10 +3954,10 @@
           <w:noProof/>
         </w:rPr>
         <w:drawing>
-          <wp:inline distT="0" distB="0" distL="0" distR="0" wp14:anchorId="4CE8F0B7" wp14:editId="59075E7D">
-            <wp:extent cx="1775460" cy="2116139"/>
-            <wp:effectExtent l="0" t="0" r="0" b="0"/>
-            <wp:docPr id="1219167853" name="Imagen 1"/>
+          <wp:inline distT="0" distB="0" distL="0" distR="0" wp14:anchorId="22EB812E" wp14:editId="1636F27A">
+            <wp:extent cx="2094582" cy="1981200"/>
+            <wp:effectExtent l="0" t="0" r="1270" b="0"/>
+            <wp:docPr id="1899701912" name="Imagen 1"/>
             <wp:cNvGraphicFramePr>
               <a:graphicFrameLocks xmlns:a="http://schemas.openxmlformats.org/drawingml/2006/main" noChangeAspect="1"/>
             </wp:cNvGraphicFramePr>
@@ -2829,735 +3965,7 @@
               <a:graphicData uri="http://schemas.openxmlformats.org/drawingml/2006/picture">
                 <pic:pic xmlns:pic="http://schemas.openxmlformats.org/drawingml/2006/picture">
                   <pic:nvPicPr>
-                    <pic:cNvPr id="1219167853" name=""/>
-                    <pic:cNvPicPr/>
-                  </pic:nvPicPr>
-                  <pic:blipFill>
-                    <a:blip r:embed="rId24"/>
-                    <a:stretch>
-                      <a:fillRect/>
-                    </a:stretch>
-                  </pic:blipFill>
-                  <pic:spPr>
-                    <a:xfrm>
-                      <a:off x="0" y="0"/>
-                      <a:ext cx="1779066" cy="2120437"/>
-                    </a:xfrm>
-                    <a:prstGeom prst="rect">
-                      <a:avLst/>
-                    </a:prstGeom>
-                  </pic:spPr>
-                </pic:pic>
-              </a:graphicData>
-            </a:graphic>
-          </wp:inline>
-        </w:drawing>
-      </w:r>
-    </w:p>
-    <w:p>
-      <w:pPr>
-        <w:rPr>
-          <w:b/>
-          <w:bCs/>
-          <w:sz w:val="28"/>
-          <w:szCs w:val="28"/>
-        </w:rPr>
-      </w:pPr>
-    </w:p>
-    <w:p>
-      <w:pPr>
-        <w:rPr>
-          <w:b/>
-          <w:bCs/>
-          <w:sz w:val="28"/>
-          <w:szCs w:val="28"/>
-        </w:rPr>
-      </w:pPr>
-    </w:p>
-    <w:p>
-      <w:pPr>
-        <w:rPr>
-          <w:b/>
-          <w:bCs/>
-          <w:sz w:val="28"/>
-          <w:szCs w:val="28"/>
-        </w:rPr>
-      </w:pPr>
-    </w:p>
-    <w:p>
-      <w:pPr>
-        <w:rPr>
-          <w:b/>
-          <w:bCs/>
-          <w:sz w:val="28"/>
-          <w:szCs w:val="28"/>
-        </w:rPr>
-      </w:pPr>
-      <w:r>
-        <w:rPr>
-          <w:b/>
-          <w:bCs/>
-          <w:sz w:val="28"/>
-          <w:szCs w:val="28"/>
-        </w:rPr>
-        <w:t>Opción 1:</w:t>
-      </w:r>
-    </w:p>
-    <w:p>
-      <w:pPr>
-        <w:rPr>
-          <w:sz w:val="24"/>
-          <w:szCs w:val="24"/>
-        </w:rPr>
-      </w:pPr>
-      <w:r>
-        <w:rPr>
-          <w:sz w:val="24"/>
-          <w:szCs w:val="24"/>
-        </w:rPr>
-        <w:t>Se inicia el menú de creación de usuario.</w:t>
-      </w:r>
-    </w:p>
-    <w:p>
-      <w:pPr>
-        <w:rPr>
-          <w:sz w:val="24"/>
-          <w:szCs w:val="24"/>
-        </w:rPr>
-      </w:pPr>
-      <w:r>
-        <w:rPr>
-          <w:sz w:val="24"/>
-          <w:szCs w:val="24"/>
-        </w:rPr>
-        <w:t>La información requerida para crear un usuario es:</w:t>
-      </w:r>
-    </w:p>
-    <w:p>
-      <w:pPr>
-        <w:pStyle w:val="Prrafodelista"/>
-        <w:numPr>
-          <w:ilvl w:val="0"/>
-          <w:numId w:val="2"/>
-        </w:numPr>
-        <w:rPr>
-          <w:sz w:val="24"/>
-          <w:szCs w:val="24"/>
-        </w:rPr>
-      </w:pPr>
-      <w:r>
-        <w:rPr>
-          <w:sz w:val="24"/>
-          <w:szCs w:val="24"/>
-        </w:rPr>
-        <w:t>Nombre</w:t>
-      </w:r>
-    </w:p>
-    <w:p>
-      <w:pPr>
-        <w:pStyle w:val="Prrafodelista"/>
-        <w:numPr>
-          <w:ilvl w:val="0"/>
-          <w:numId w:val="2"/>
-        </w:numPr>
-        <w:rPr>
-          <w:sz w:val="24"/>
-          <w:szCs w:val="24"/>
-        </w:rPr>
-      </w:pPr>
-      <w:r>
-        <w:rPr>
-          <w:sz w:val="24"/>
-          <w:szCs w:val="24"/>
-        </w:rPr>
-        <w:t>Email del usuario (único)</w:t>
-      </w:r>
-    </w:p>
-    <w:p>
-      <w:pPr>
-        <w:pStyle w:val="Prrafodelista"/>
-        <w:numPr>
-          <w:ilvl w:val="0"/>
-          <w:numId w:val="2"/>
-        </w:numPr>
-        <w:rPr>
-          <w:sz w:val="24"/>
-          <w:szCs w:val="24"/>
-        </w:rPr>
-      </w:pPr>
-      <w:r>
-        <w:rPr>
-          <w:sz w:val="24"/>
-          <w:szCs w:val="24"/>
-        </w:rPr>
-        <w:t>Contraseña</w:t>
-      </w:r>
-    </w:p>
-    <w:p>
-      <w:pPr>
-        <w:rPr>
-          <w:sz w:val="24"/>
-          <w:szCs w:val="24"/>
-        </w:rPr>
-      </w:pPr>
-      <w:r>
-        <w:rPr>
-          <w:noProof/>
-        </w:rPr>
-        <w:drawing>
-          <wp:inline distT="0" distB="0" distL="0" distR="0" wp14:anchorId="17AB88B4" wp14:editId="07D96244">
-            <wp:extent cx="3589020" cy="1754983"/>
-            <wp:effectExtent l="0" t="0" r="0" b="0"/>
-            <wp:docPr id="1135892817" name="Imagen 1"/>
-            <wp:cNvGraphicFramePr>
-              <a:graphicFrameLocks xmlns:a="http://schemas.openxmlformats.org/drawingml/2006/main" noChangeAspect="1"/>
-            </wp:cNvGraphicFramePr>
-            <a:graphic xmlns:a="http://schemas.openxmlformats.org/drawingml/2006/main">
-              <a:graphicData uri="http://schemas.openxmlformats.org/drawingml/2006/picture">
-                <pic:pic xmlns:pic="http://schemas.openxmlformats.org/drawingml/2006/picture">
-                  <pic:nvPicPr>
-                    <pic:cNvPr id="1135892817" name=""/>
-                    <pic:cNvPicPr/>
-                  </pic:nvPicPr>
-                  <pic:blipFill>
-                    <a:blip r:embed="rId25"/>
-                    <a:stretch>
-                      <a:fillRect/>
-                    </a:stretch>
-                  </pic:blipFill>
-                  <pic:spPr>
-                    <a:xfrm>
-                      <a:off x="0" y="0"/>
-                      <a:ext cx="3595202" cy="1758006"/>
-                    </a:xfrm>
-                    <a:prstGeom prst="rect">
-                      <a:avLst/>
-                    </a:prstGeom>
-                  </pic:spPr>
-                </pic:pic>
-              </a:graphicData>
-            </a:graphic>
-          </wp:inline>
-        </w:drawing>
-      </w:r>
-    </w:p>
-    <w:p>
-      <w:pPr>
-        <w:rPr>
-          <w:sz w:val="24"/>
-          <w:szCs w:val="24"/>
-        </w:rPr>
-      </w:pPr>
-      <w:r>
-        <w:rPr>
-          <w:sz w:val="24"/>
-          <w:szCs w:val="24"/>
-        </w:rPr>
-        <w:t>En el caso de que se inserte un email ya registrado, el programa lanzará un error diciendo que el usuario ya existe, por lo que no podrá ser creado.</w:t>
-      </w:r>
-    </w:p>
-    <w:p>
-      <w:pPr>
-        <w:rPr>
-          <w:sz w:val="24"/>
-          <w:szCs w:val="24"/>
-        </w:rPr>
-      </w:pPr>
-      <w:r>
-        <w:rPr>
-          <w:noProof/>
-        </w:rPr>
-        <w:lastRenderedPageBreak/>
-        <w:drawing>
-          <wp:inline distT="0" distB="0" distL="0" distR="0" wp14:anchorId="324DBE2F" wp14:editId="702BE903">
-            <wp:extent cx="3291840" cy="1545007"/>
-            <wp:effectExtent l="0" t="0" r="3810" b="0"/>
-            <wp:docPr id="2049914446" name="Imagen 1"/>
-            <wp:cNvGraphicFramePr>
-              <a:graphicFrameLocks xmlns:a="http://schemas.openxmlformats.org/drawingml/2006/main" noChangeAspect="1"/>
-            </wp:cNvGraphicFramePr>
-            <a:graphic xmlns:a="http://schemas.openxmlformats.org/drawingml/2006/main">
-              <a:graphicData uri="http://schemas.openxmlformats.org/drawingml/2006/picture">
-                <pic:pic xmlns:pic="http://schemas.openxmlformats.org/drawingml/2006/picture">
-                  <pic:nvPicPr>
-                    <pic:cNvPr id="2049914446" name=""/>
-                    <pic:cNvPicPr/>
-                  </pic:nvPicPr>
-                  <pic:blipFill>
-                    <a:blip r:embed="rId26"/>
-                    <a:stretch>
-                      <a:fillRect/>
-                    </a:stretch>
-                  </pic:blipFill>
-                  <pic:spPr>
-                    <a:xfrm>
-                      <a:off x="0" y="0"/>
-                      <a:ext cx="3297203" cy="1547524"/>
-                    </a:xfrm>
-                    <a:prstGeom prst="rect">
-                      <a:avLst/>
-                    </a:prstGeom>
-                  </pic:spPr>
-                </pic:pic>
-              </a:graphicData>
-            </a:graphic>
-          </wp:inline>
-        </w:drawing>
-      </w:r>
-    </w:p>
-    <w:p>
-      <w:pPr>
-        <w:rPr>
-          <w:sz w:val="24"/>
-          <w:szCs w:val="24"/>
-        </w:rPr>
-      </w:pPr>
-    </w:p>
-    <w:p>
-      <w:pPr>
-        <w:rPr>
-          <w:sz w:val="24"/>
-          <w:szCs w:val="24"/>
-        </w:rPr>
-      </w:pPr>
-    </w:p>
-    <w:p>
-      <w:pPr>
-        <w:rPr>
-          <w:b/>
-          <w:bCs/>
-          <w:sz w:val="28"/>
-          <w:szCs w:val="28"/>
-        </w:rPr>
-      </w:pPr>
-      <w:r>
-        <w:rPr>
-          <w:b/>
-          <w:bCs/>
-          <w:sz w:val="28"/>
-          <w:szCs w:val="28"/>
-        </w:rPr>
-        <w:t>Opción 2:</w:t>
-      </w:r>
-    </w:p>
-    <w:p>
-      <w:pPr>
-        <w:rPr>
-          <w:sz w:val="24"/>
-          <w:szCs w:val="24"/>
-        </w:rPr>
-      </w:pPr>
-      <w:r>
-        <w:rPr>
-          <w:sz w:val="24"/>
-          <w:szCs w:val="24"/>
-        </w:rPr>
-        <w:t>Se inicia el menú de borrado de usuario.</w:t>
-      </w:r>
-    </w:p>
-    <w:p>
-      <w:pPr>
-        <w:rPr>
-          <w:sz w:val="24"/>
-          <w:szCs w:val="24"/>
-        </w:rPr>
-      </w:pPr>
-      <w:r>
-        <w:rPr>
-          <w:sz w:val="24"/>
-          <w:szCs w:val="24"/>
-        </w:rPr>
-        <w:t>La información requerida para eliminar un usuario es su email:</w:t>
-      </w:r>
-    </w:p>
-    <w:p>
-      <w:pPr>
-        <w:rPr>
-          <w:sz w:val="24"/>
-          <w:szCs w:val="24"/>
-        </w:rPr>
-      </w:pPr>
-      <w:r>
-        <w:rPr>
-          <w:noProof/>
-        </w:rPr>
-        <w:drawing>
-          <wp:inline distT="0" distB="0" distL="0" distR="0" wp14:anchorId="64B392D3" wp14:editId="16B6DB6B">
-            <wp:extent cx="5400040" cy="1065530"/>
-            <wp:effectExtent l="0" t="0" r="0" b="1270"/>
-            <wp:docPr id="597400221" name="Imagen 1"/>
-            <wp:cNvGraphicFramePr>
-              <a:graphicFrameLocks xmlns:a="http://schemas.openxmlformats.org/drawingml/2006/main" noChangeAspect="1"/>
-            </wp:cNvGraphicFramePr>
-            <a:graphic xmlns:a="http://schemas.openxmlformats.org/drawingml/2006/main">
-              <a:graphicData uri="http://schemas.openxmlformats.org/drawingml/2006/picture">
-                <pic:pic xmlns:pic="http://schemas.openxmlformats.org/drawingml/2006/picture">
-                  <pic:nvPicPr>
-                    <pic:cNvPr id="597400221" name=""/>
-                    <pic:cNvPicPr/>
-                  </pic:nvPicPr>
-                  <pic:blipFill>
-                    <a:blip r:embed="rId27"/>
-                    <a:stretch>
-                      <a:fillRect/>
-                    </a:stretch>
-                  </pic:blipFill>
-                  <pic:spPr>
-                    <a:xfrm>
-                      <a:off x="0" y="0"/>
-                      <a:ext cx="5400040" cy="1065530"/>
-                    </a:xfrm>
-                    <a:prstGeom prst="rect">
-                      <a:avLst/>
-                    </a:prstGeom>
-                  </pic:spPr>
-                </pic:pic>
-              </a:graphicData>
-            </a:graphic>
-          </wp:inline>
-        </w:drawing>
-      </w:r>
-    </w:p>
-    <w:p>
-      <w:pPr>
-        <w:rPr>
-          <w:sz w:val="24"/>
-          <w:szCs w:val="24"/>
-        </w:rPr>
-      </w:pPr>
-      <w:r>
-        <w:rPr>
-          <w:sz w:val="24"/>
-          <w:szCs w:val="24"/>
-        </w:rPr>
-        <w:t>Si no hay usuarios para eliminar, saltará el siguiente mensaje:</w:t>
-      </w:r>
-    </w:p>
-    <w:p>
-      <w:pPr>
-        <w:rPr>
-          <w:sz w:val="24"/>
-          <w:szCs w:val="24"/>
-        </w:rPr>
-      </w:pPr>
-      <w:r>
-        <w:rPr>
-          <w:noProof/>
-        </w:rPr>
-        <w:drawing>
-          <wp:inline distT="0" distB="0" distL="0" distR="0" wp14:anchorId="24455237" wp14:editId="126FD011">
-            <wp:extent cx="3657600" cy="933450"/>
-            <wp:effectExtent l="0" t="0" r="0" b="0"/>
-            <wp:docPr id="458587502" name="Imagen 1"/>
-            <wp:cNvGraphicFramePr>
-              <a:graphicFrameLocks xmlns:a="http://schemas.openxmlformats.org/drawingml/2006/main" noChangeAspect="1"/>
-            </wp:cNvGraphicFramePr>
-            <a:graphic xmlns:a="http://schemas.openxmlformats.org/drawingml/2006/main">
-              <a:graphicData uri="http://schemas.openxmlformats.org/drawingml/2006/picture">
-                <pic:pic xmlns:pic="http://schemas.openxmlformats.org/drawingml/2006/picture">
-                  <pic:nvPicPr>
-                    <pic:cNvPr id="458587502" name=""/>
-                    <pic:cNvPicPr/>
-                  </pic:nvPicPr>
-                  <pic:blipFill>
-                    <a:blip r:embed="rId28"/>
-                    <a:stretch>
-                      <a:fillRect/>
-                    </a:stretch>
-                  </pic:blipFill>
-                  <pic:spPr>
-                    <a:xfrm>
-                      <a:off x="0" y="0"/>
-                      <a:ext cx="3657600" cy="933450"/>
-                    </a:xfrm>
-                    <a:prstGeom prst="rect">
-                      <a:avLst/>
-                    </a:prstGeom>
-                  </pic:spPr>
-                </pic:pic>
-              </a:graphicData>
-            </a:graphic>
-          </wp:inline>
-        </w:drawing>
-      </w:r>
-    </w:p>
-    <w:p>
-      <w:pPr>
-        <w:rPr>
-          <w:sz w:val="24"/>
-          <w:szCs w:val="24"/>
-        </w:rPr>
-      </w:pPr>
-      <w:r>
-        <w:rPr>
-          <w:sz w:val="24"/>
-          <w:szCs w:val="24"/>
-        </w:rPr>
-        <w:t>Si se intenta eliminar un usuario que no existe, saltará el siguiente error:</w:t>
-      </w:r>
-    </w:p>
-    <w:p>
-      <w:pPr>
-        <w:rPr>
-          <w:sz w:val="24"/>
-          <w:szCs w:val="24"/>
-        </w:rPr>
-      </w:pPr>
-      <w:r>
-        <w:rPr>
-          <w:noProof/>
-        </w:rPr>
-        <w:drawing>
-          <wp:inline distT="0" distB="0" distL="0" distR="0" wp14:anchorId="5FF77942" wp14:editId="48E259FB">
-            <wp:extent cx="5400040" cy="1069340"/>
-            <wp:effectExtent l="0" t="0" r="0" b="0"/>
-            <wp:docPr id="1722643148" name="Imagen 1"/>
-            <wp:cNvGraphicFramePr>
-              <a:graphicFrameLocks xmlns:a="http://schemas.openxmlformats.org/drawingml/2006/main" noChangeAspect="1"/>
-            </wp:cNvGraphicFramePr>
-            <a:graphic xmlns:a="http://schemas.openxmlformats.org/drawingml/2006/main">
-              <a:graphicData uri="http://schemas.openxmlformats.org/drawingml/2006/picture">
-                <pic:pic xmlns:pic="http://schemas.openxmlformats.org/drawingml/2006/picture">
-                  <pic:nvPicPr>
-                    <pic:cNvPr id="1722643148" name=""/>
-                    <pic:cNvPicPr/>
-                  </pic:nvPicPr>
-                  <pic:blipFill>
-                    <a:blip r:embed="rId29"/>
-                    <a:stretch>
-                      <a:fillRect/>
-                    </a:stretch>
-                  </pic:blipFill>
-                  <pic:spPr>
-                    <a:xfrm>
-                      <a:off x="0" y="0"/>
-                      <a:ext cx="5400040" cy="1069340"/>
-                    </a:xfrm>
-                    <a:prstGeom prst="rect">
-                      <a:avLst/>
-                    </a:prstGeom>
-                  </pic:spPr>
-                </pic:pic>
-              </a:graphicData>
-            </a:graphic>
-          </wp:inline>
-        </w:drawing>
-      </w:r>
-    </w:p>
-    <w:p>
-      <w:pPr>
-        <w:rPr>
-          <w:sz w:val="24"/>
-          <w:szCs w:val="24"/>
-        </w:rPr>
-      </w:pPr>
-    </w:p>
-    <w:p>
-      <w:pPr>
-        <w:rPr>
-          <w:sz w:val="24"/>
-          <w:szCs w:val="24"/>
-        </w:rPr>
-      </w:pPr>
-    </w:p>
-    <w:p>
-      <w:pPr>
-        <w:rPr>
-          <w:sz w:val="24"/>
-          <w:szCs w:val="24"/>
-        </w:rPr>
-      </w:pPr>
-      <w:r>
-        <w:rPr>
-          <w:sz w:val="24"/>
-          <w:szCs w:val="24"/>
-        </w:rPr>
-        <w:br w:type="page"/>
-      </w:r>
-    </w:p>
-    <w:p>
-      <w:pPr>
-        <w:rPr>
-          <w:b/>
-          <w:bCs/>
-          <w:sz w:val="28"/>
-          <w:szCs w:val="28"/>
-        </w:rPr>
-      </w:pPr>
-      <w:r>
-        <w:rPr>
-          <w:b/>
-          <w:bCs/>
-          <w:sz w:val="28"/>
-          <w:szCs w:val="28"/>
-        </w:rPr>
-        <w:lastRenderedPageBreak/>
-        <w:t>Opción 3:</w:t>
-      </w:r>
-    </w:p>
-    <w:p>
-      <w:pPr>
-        <w:rPr>
-          <w:sz w:val="24"/>
-          <w:szCs w:val="24"/>
-        </w:rPr>
-      </w:pPr>
-      <w:r>
-        <w:rPr>
-          <w:sz w:val="24"/>
-          <w:szCs w:val="24"/>
-        </w:rPr>
-        <w:t xml:space="preserve">Se inicia el menú de </w:t>
-      </w:r>
-      <w:r>
-        <w:rPr>
-          <w:sz w:val="24"/>
-          <w:szCs w:val="24"/>
-        </w:rPr>
-        <w:t>creación de evento</w:t>
-      </w:r>
-      <w:r>
-        <w:rPr>
-          <w:sz w:val="24"/>
-          <w:szCs w:val="24"/>
-        </w:rPr>
-        <w:t>.</w:t>
-      </w:r>
-    </w:p>
-    <w:p>
-      <w:pPr>
-        <w:rPr>
-          <w:sz w:val="24"/>
-          <w:szCs w:val="24"/>
-        </w:rPr>
-      </w:pPr>
-      <w:r>
-        <w:rPr>
-          <w:sz w:val="24"/>
-          <w:szCs w:val="24"/>
-        </w:rPr>
-        <w:t>La información requerida para crear un evento es:</w:t>
-      </w:r>
-    </w:p>
-    <w:p>
-      <w:pPr>
-        <w:pStyle w:val="Prrafodelista"/>
-        <w:numPr>
-          <w:ilvl w:val="0"/>
-          <w:numId w:val="2"/>
-        </w:numPr>
-        <w:rPr>
-          <w:sz w:val="24"/>
-          <w:szCs w:val="24"/>
-        </w:rPr>
-      </w:pPr>
-      <w:r>
-        <w:rPr>
-          <w:sz w:val="24"/>
-          <w:szCs w:val="24"/>
-        </w:rPr>
-        <w:t>Fecha</w:t>
-      </w:r>
-    </w:p>
-    <w:p>
-      <w:pPr>
-        <w:pStyle w:val="Prrafodelista"/>
-        <w:numPr>
-          <w:ilvl w:val="0"/>
-          <w:numId w:val="2"/>
-        </w:numPr>
-        <w:rPr>
-          <w:sz w:val="24"/>
-          <w:szCs w:val="24"/>
-        </w:rPr>
-      </w:pPr>
-      <w:r>
-        <w:rPr>
-          <w:sz w:val="24"/>
-          <w:szCs w:val="24"/>
-        </w:rPr>
-        <w:t>Título</w:t>
-      </w:r>
-    </w:p>
-    <w:p>
-      <w:pPr>
-        <w:pStyle w:val="Prrafodelista"/>
-        <w:numPr>
-          <w:ilvl w:val="0"/>
-          <w:numId w:val="2"/>
-        </w:numPr>
-        <w:rPr>
-          <w:sz w:val="24"/>
-          <w:szCs w:val="24"/>
-        </w:rPr>
-      </w:pPr>
-      <w:r>
-        <w:rPr>
-          <w:sz w:val="24"/>
-          <w:szCs w:val="24"/>
-        </w:rPr>
-        <w:t>Ubicación</w:t>
-      </w:r>
-    </w:p>
-    <w:p>
-      <w:pPr>
-        <w:pStyle w:val="Prrafodelista"/>
-        <w:numPr>
-          <w:ilvl w:val="0"/>
-          <w:numId w:val="2"/>
-        </w:numPr>
-        <w:rPr>
-          <w:sz w:val="24"/>
-          <w:szCs w:val="24"/>
-        </w:rPr>
-      </w:pPr>
-      <w:r>
-        <w:rPr>
-          <w:sz w:val="24"/>
-          <w:szCs w:val="24"/>
-        </w:rPr>
-        <w:t>Descripción</w:t>
-      </w:r>
-    </w:p>
-    <w:p>
-      <w:pPr>
-        <w:rPr>
-          <w:sz w:val="24"/>
-          <w:szCs w:val="24"/>
-        </w:rPr>
-      </w:pPr>
-      <w:r>
-        <w:rPr>
-          <w:sz w:val="24"/>
-          <w:szCs w:val="24"/>
-        </w:rPr>
-        <w:t>Adicionalmente, se crea automáticamente un ID único para cada evento.</w:t>
-      </w:r>
-    </w:p>
-    <w:p>
-      <w:pPr>
-        <w:rPr>
-          <w:sz w:val="24"/>
-          <w:szCs w:val="24"/>
-        </w:rPr>
-      </w:pPr>
-      <w:r>
-        <w:rPr>
-          <w:noProof/>
-        </w:rPr>
-        <w:drawing>
-          <wp:inline distT="0" distB="0" distL="0" distR="0" wp14:anchorId="7D78A2A9" wp14:editId="1805317F">
-            <wp:extent cx="4486275" cy="2752725"/>
-            <wp:effectExtent l="0" t="0" r="9525" b="9525"/>
-            <wp:docPr id="994480538" name="Imagen 1"/>
-            <wp:cNvGraphicFramePr>
-              <a:graphicFrameLocks xmlns:a="http://schemas.openxmlformats.org/drawingml/2006/main" noChangeAspect="1"/>
-            </wp:cNvGraphicFramePr>
-            <a:graphic xmlns:a="http://schemas.openxmlformats.org/drawingml/2006/main">
-              <a:graphicData uri="http://schemas.openxmlformats.org/drawingml/2006/picture">
-                <pic:pic xmlns:pic="http://schemas.openxmlformats.org/drawingml/2006/picture">
-                  <pic:nvPicPr>
-                    <pic:cNvPr id="994480538" name=""/>
+                    <pic:cNvPr id="1899701912" name=""/>
                     <pic:cNvPicPr/>
                   </pic:nvPicPr>
                   <pic:blipFill>
@@ -3569,7 +3977,7 @@
                   <pic:spPr>
                     <a:xfrm>
                       <a:off x="0" y="0"/>
-                      <a:ext cx="4486275" cy="2752725"/>
+                      <a:ext cx="2103217" cy="1989368"/>
                     </a:xfrm>
                     <a:prstGeom prst="rect">
                       <a:avLst/>
@@ -3585,102 +3993,124 @@
     <w:p>
       <w:pPr>
         <w:rPr>
-          <w:sz w:val="24"/>
-          <w:szCs w:val="24"/>
-        </w:rPr>
-      </w:pPr>
-    </w:p>
-    <w:p>
-      <w:pPr>
-        <w:rPr>
-          <w:sz w:val="24"/>
-          <w:szCs w:val="24"/>
-        </w:rPr>
-      </w:pPr>
-    </w:p>
-    <w:p>
-      <w:pPr>
-        <w:rPr>
           <w:b/>
           <w:bCs/>
           <w:sz w:val="28"/>
           <w:szCs w:val="28"/>
         </w:rPr>
       </w:pPr>
-      <w:r>
+    </w:p>
+    <w:p>
+      <w:pPr>
         <w:rPr>
           <w:b/>
           <w:bCs/>
           <w:sz w:val="28"/>
           <w:szCs w:val="28"/>
         </w:rPr>
-        <w:t>Opción 4:</w:t>
-      </w:r>
-    </w:p>
-    <w:p>
-      <w:pPr>
-        <w:rPr>
-          <w:sz w:val="24"/>
-          <w:szCs w:val="24"/>
-        </w:rPr>
-      </w:pPr>
-      <w:r>
-        <w:rPr>
-          <w:sz w:val="24"/>
-          <w:szCs w:val="24"/>
-        </w:rPr>
-        <w:t xml:space="preserve">Se inicia el menú de </w:t>
-      </w:r>
-      <w:r>
-        <w:rPr>
-          <w:sz w:val="24"/>
-          <w:szCs w:val="24"/>
-        </w:rPr>
-        <w:t>borrado</w:t>
-      </w:r>
-      <w:r>
-        <w:rPr>
-          <w:sz w:val="24"/>
-          <w:szCs w:val="24"/>
-        </w:rPr>
-        <w:t xml:space="preserve"> de evento.</w:t>
-      </w:r>
-    </w:p>
-    <w:p>
-      <w:pPr>
-        <w:rPr>
-          <w:sz w:val="24"/>
-          <w:szCs w:val="24"/>
-        </w:rPr>
-      </w:pPr>
-      <w:r>
-        <w:rPr>
-          <w:sz w:val="24"/>
-          <w:szCs w:val="24"/>
-        </w:rPr>
-        <w:t>Se muestra una tabla con los eventos disponibles , mostrando sus ID y título</w:t>
-      </w:r>
-      <w:r>
-        <w:rPr>
-          <w:sz w:val="24"/>
-          <w:szCs w:val="24"/>
-        </w:rPr>
-        <w:t>.</w:t>
-      </w:r>
-    </w:p>
-    <w:p>
-      <w:pPr>
-        <w:rPr>
-          <w:sz w:val="24"/>
-          <w:szCs w:val="24"/>
-        </w:rPr>
-      </w:pPr>
-      <w:r>
-        <w:rPr>
-          <w:sz w:val="24"/>
-          <w:szCs w:val="24"/>
-        </w:rPr>
-        <w:t>Solamente hace falta introducir el ID del evento que se quiere eliminar.</w:t>
+      </w:pPr>
+      <w:r>
+        <w:rPr>
+          <w:b/>
+          <w:bCs/>
+          <w:sz w:val="28"/>
+          <w:szCs w:val="28"/>
+        </w:rPr>
+        <w:t>Opción 1:</w:t>
+      </w:r>
+    </w:p>
+    <w:p>
+      <w:pPr>
+        <w:rPr>
+          <w:b/>
+          <w:bCs/>
+          <w:sz w:val="24"/>
+          <w:szCs w:val="24"/>
+        </w:rPr>
+      </w:pPr>
+      <w:r>
+        <w:rPr>
+          <w:b/>
+          <w:bCs/>
+          <w:sz w:val="24"/>
+          <w:szCs w:val="24"/>
+        </w:rPr>
+        <w:t>Se inicia el menú de creación de usuario.</w:t>
+      </w:r>
+    </w:p>
+    <w:p>
+      <w:pPr>
+        <w:rPr>
+          <w:sz w:val="24"/>
+          <w:szCs w:val="24"/>
+        </w:rPr>
+      </w:pPr>
+      <w:r>
+        <w:rPr>
+          <w:sz w:val="24"/>
+          <w:szCs w:val="24"/>
+        </w:rPr>
+        <w:t>La información requerida para crear un usuario es:</w:t>
+      </w:r>
+    </w:p>
+    <w:p>
+      <w:pPr>
+        <w:pStyle w:val="Prrafodelista"/>
+        <w:numPr>
+          <w:ilvl w:val="0"/>
+          <w:numId w:val="2"/>
+        </w:numPr>
+        <w:rPr>
+          <w:sz w:val="24"/>
+          <w:szCs w:val="24"/>
+        </w:rPr>
+      </w:pPr>
+      <w:r>
+        <w:rPr>
+          <w:sz w:val="24"/>
+          <w:szCs w:val="24"/>
+        </w:rPr>
+        <w:t>Nombre</w:t>
+      </w:r>
+    </w:p>
+    <w:p>
+      <w:pPr>
+        <w:pStyle w:val="Prrafodelista"/>
+        <w:numPr>
+          <w:ilvl w:val="0"/>
+          <w:numId w:val="2"/>
+        </w:numPr>
+        <w:rPr>
+          <w:sz w:val="24"/>
+          <w:szCs w:val="24"/>
+        </w:rPr>
+      </w:pPr>
+      <w:r>
+        <w:rPr>
+          <w:sz w:val="24"/>
+          <w:szCs w:val="24"/>
+        </w:rPr>
+        <w:t>Email del usuario (único)</w:t>
+      </w:r>
+    </w:p>
+    <w:p>
+      <w:pPr>
+        <w:pStyle w:val="Prrafodelista"/>
+        <w:numPr>
+          <w:ilvl w:val="0"/>
+          <w:numId w:val="2"/>
+        </w:numPr>
+        <w:rPr>
+          <w:sz w:val="24"/>
+          <w:szCs w:val="24"/>
+        </w:rPr>
+      </w:pPr>
+      <w:r>
+        <w:rPr>
+          <w:sz w:val="24"/>
+          <w:szCs w:val="24"/>
+        </w:rPr>
+        <w:t>Contraseña</w:t>
       </w:r>
     </w:p>
     <w:p>
@@ -3695,10 +4125,10 @@
           <w:noProof/>
         </w:rPr>
         <w:drawing>
-          <wp:inline distT="0" distB="0" distL="0" distR="0" wp14:anchorId="4D194F94" wp14:editId="6481485B">
-            <wp:extent cx="5400040" cy="1558290"/>
-            <wp:effectExtent l="0" t="0" r="0" b="3810"/>
-            <wp:docPr id="358596131" name="Imagen 1"/>
+          <wp:inline distT="0" distB="0" distL="0" distR="0" wp14:anchorId="53691401" wp14:editId="46AACE6A">
+            <wp:extent cx="3207327" cy="1380202"/>
+            <wp:effectExtent l="0" t="0" r="0" b="0"/>
+            <wp:docPr id="1900748383" name="Imagen 1"/>
             <wp:cNvGraphicFramePr>
               <a:graphicFrameLocks xmlns:a="http://schemas.openxmlformats.org/drawingml/2006/main" noChangeAspect="1"/>
             </wp:cNvGraphicFramePr>
@@ -3706,7 +4136,7 @@
               <a:graphicData uri="http://schemas.openxmlformats.org/drawingml/2006/picture">
                 <pic:pic xmlns:pic="http://schemas.openxmlformats.org/drawingml/2006/picture">
                   <pic:nvPicPr>
-                    <pic:cNvPr id="358596131" name=""/>
+                    <pic:cNvPr id="1900748383" name=""/>
                     <pic:cNvPicPr/>
                   </pic:nvPicPr>
                   <pic:blipFill>
@@ -3718,7 +4148,7 @@
                   <pic:spPr>
                     <a:xfrm>
                       <a:off x="0" y="0"/>
-                      <a:ext cx="5400040" cy="1558290"/>
+                      <a:ext cx="3216209" cy="1384024"/>
                     </a:xfrm>
                     <a:prstGeom prst="rect">
                       <a:avLst/>
@@ -3738,21 +4168,12 @@
           <w:szCs w:val="24"/>
         </w:rPr>
       </w:pPr>
-    </w:p>
-    <w:p>
-      <w:pPr>
-        <w:rPr>
-          <w:sz w:val="24"/>
-          <w:szCs w:val="24"/>
-        </w:rPr>
-      </w:pPr>
-      <w:r>
-        <w:rPr>
-          <w:sz w:val="24"/>
-          <w:szCs w:val="24"/>
-        </w:rPr>
-        <w:lastRenderedPageBreak/>
-        <w:t>Si no hay eventos disponibles para eliminar, se mostrará el siguiente mensaje:</w:t>
+      <w:r>
+        <w:rPr>
+          <w:sz w:val="24"/>
+          <w:szCs w:val="24"/>
+        </w:rPr>
+        <w:t>En el caso de que se inserte un email ya registrado, el programa lanzará un error diciendo que el usuario ya existe, por lo que no podrá ser creado.</w:t>
       </w:r>
     </w:p>
     <w:p>
@@ -3767,10 +4188,10 @@
           <w:noProof/>
         </w:rPr>
         <w:drawing>
-          <wp:inline distT="0" distB="0" distL="0" distR="0" wp14:anchorId="58665548" wp14:editId="68E296D3">
-            <wp:extent cx="3714750" cy="676275"/>
-            <wp:effectExtent l="0" t="0" r="0" b="9525"/>
-            <wp:docPr id="1932251765" name="Imagen 1"/>
+          <wp:inline distT="0" distB="0" distL="0" distR="0" wp14:anchorId="32760DC4" wp14:editId="73FBD0E6">
+            <wp:extent cx="2930807" cy="1309254"/>
+            <wp:effectExtent l="0" t="0" r="3175" b="5715"/>
+            <wp:docPr id="1297009547" name="Imagen 1"/>
             <wp:cNvGraphicFramePr>
               <a:graphicFrameLocks xmlns:a="http://schemas.openxmlformats.org/drawingml/2006/main" noChangeAspect="1"/>
             </wp:cNvGraphicFramePr>
@@ -3778,7 +4199,7 @@
               <a:graphicData uri="http://schemas.openxmlformats.org/drawingml/2006/picture">
                 <pic:pic xmlns:pic="http://schemas.openxmlformats.org/drawingml/2006/picture">
                   <pic:nvPicPr>
-                    <pic:cNvPr id="1932251765" name=""/>
+                    <pic:cNvPr id="1297009547" name=""/>
                     <pic:cNvPicPr/>
                   </pic:nvPicPr>
                   <pic:blipFill>
@@ -3790,7 +4211,7 @@
                   <pic:spPr>
                     <a:xfrm>
                       <a:off x="0" y="0"/>
-                      <a:ext cx="3714750" cy="676275"/>
+                      <a:ext cx="2940909" cy="1313767"/>
                     </a:xfrm>
                     <a:prstGeom prst="rect">
                       <a:avLst/>
@@ -3810,12 +4231,66 @@
           <w:szCs w:val="24"/>
         </w:rPr>
       </w:pPr>
-      <w:r>
-        <w:rPr>
-          <w:sz w:val="24"/>
-          <w:szCs w:val="24"/>
-        </w:rPr>
-        <w:t>Asimismo, si se intenta eliminar un evento que no existe, el siguiente mensaje será mostrado:</w:t>
+    </w:p>
+    <w:p>
+      <w:pPr>
+        <w:rPr>
+          <w:sz w:val="24"/>
+          <w:szCs w:val="24"/>
+        </w:rPr>
+      </w:pPr>
+    </w:p>
+    <w:p>
+      <w:pPr>
+        <w:rPr>
+          <w:b/>
+          <w:bCs/>
+          <w:sz w:val="28"/>
+          <w:szCs w:val="28"/>
+        </w:rPr>
+      </w:pPr>
+      <w:r>
+        <w:rPr>
+          <w:b/>
+          <w:bCs/>
+          <w:sz w:val="28"/>
+          <w:szCs w:val="28"/>
+        </w:rPr>
+        <w:t>Opción 2:</w:t>
+      </w:r>
+    </w:p>
+    <w:p>
+      <w:pPr>
+        <w:rPr>
+          <w:b/>
+          <w:bCs/>
+          <w:sz w:val="24"/>
+          <w:szCs w:val="24"/>
+        </w:rPr>
+      </w:pPr>
+      <w:r>
+        <w:rPr>
+          <w:b/>
+          <w:bCs/>
+          <w:sz w:val="24"/>
+          <w:szCs w:val="24"/>
+        </w:rPr>
+        <w:t>Se inicia el menú de borrado de usuario.</w:t>
+      </w:r>
+    </w:p>
+    <w:p>
+      <w:pPr>
+        <w:rPr>
+          <w:sz w:val="24"/>
+          <w:szCs w:val="24"/>
+        </w:rPr>
+      </w:pPr>
+      <w:r>
+        <w:rPr>
+          <w:sz w:val="24"/>
+          <w:szCs w:val="24"/>
+        </w:rPr>
+        <w:t>La información requerida para eliminar un usuario es su email:</w:t>
       </w:r>
     </w:p>
     <w:p>
@@ -3830,10 +4305,10 @@
           <w:noProof/>
         </w:rPr>
         <w:drawing>
-          <wp:inline distT="0" distB="0" distL="0" distR="0" wp14:anchorId="3BE70D47" wp14:editId="5B01BD71">
-            <wp:extent cx="4826000" cy="1424419"/>
-            <wp:effectExtent l="0" t="0" r="0" b="4445"/>
-            <wp:docPr id="1349619701" name="Imagen 1"/>
+          <wp:inline distT="0" distB="0" distL="0" distR="0" wp14:anchorId="5E913236" wp14:editId="4DF69020">
+            <wp:extent cx="4918363" cy="1082109"/>
+            <wp:effectExtent l="0" t="0" r="0" b="3810"/>
+            <wp:docPr id="173266650" name="Imagen 1"/>
             <wp:cNvGraphicFramePr>
               <a:graphicFrameLocks xmlns:a="http://schemas.openxmlformats.org/drawingml/2006/main" noChangeAspect="1"/>
             </wp:cNvGraphicFramePr>
@@ -3841,7 +4316,7 @@
               <a:graphicData uri="http://schemas.openxmlformats.org/drawingml/2006/picture">
                 <pic:pic xmlns:pic="http://schemas.openxmlformats.org/drawingml/2006/picture">
                   <pic:nvPicPr>
-                    <pic:cNvPr id="1349619701" name=""/>
+                    <pic:cNvPr id="173266650" name=""/>
                     <pic:cNvPicPr/>
                   </pic:nvPicPr>
                   <pic:blipFill>
@@ -3853,7 +4328,7 @@
                   <pic:spPr>
                     <a:xfrm>
                       <a:off x="0" y="0"/>
-                      <a:ext cx="4835430" cy="1427202"/>
+                      <a:ext cx="4922445" cy="1083007"/>
                     </a:xfrm>
                     <a:prstGeom prst="rect">
                       <a:avLst/>
@@ -3869,57 +4344,16 @@
     <w:p>
       <w:pPr>
         <w:rPr>
-          <w:b/>
-          <w:bCs/>
-          <w:sz w:val="28"/>
-          <w:szCs w:val="28"/>
-        </w:rPr>
-      </w:pPr>
-      <w:r>
-        <w:rPr>
-          <w:b/>
-          <w:bCs/>
-          <w:sz w:val="28"/>
-          <w:szCs w:val="28"/>
-        </w:rPr>
-        <w:t>Opción 5:</w:t>
-      </w:r>
-    </w:p>
-    <w:p>
-      <w:pPr>
-        <w:rPr>
-          <w:sz w:val="24"/>
-          <w:szCs w:val="24"/>
-        </w:rPr>
-      </w:pPr>
-      <w:r>
-        <w:rPr>
-          <w:sz w:val="24"/>
-          <w:szCs w:val="24"/>
-        </w:rPr>
-        <w:t>Se inicia el menú de creación de galerías</w:t>
-      </w:r>
-    </w:p>
-    <w:p>
-      <w:pPr>
-        <w:rPr>
-          <w:sz w:val="24"/>
-          <w:szCs w:val="24"/>
-        </w:rPr>
-      </w:pPr>
-      <w:r>
-        <w:rPr>
-          <w:sz w:val="24"/>
-          <w:szCs w:val="24"/>
-        </w:rPr>
-        <w:t xml:space="preserve">Para crear una galería hace falta como mínimo un evento disponible. </w:t>
-      </w:r>
-      <w:r>
-        <w:rPr>
-          <w:sz w:val="24"/>
-          <w:szCs w:val="24"/>
-        </w:rPr>
-        <w:t>Tras elegir el evento donde se quiere crear la galería, se deberá introducir el título de dicha galería.</w:t>
+          <w:sz w:val="24"/>
+          <w:szCs w:val="24"/>
+        </w:rPr>
+      </w:pPr>
+      <w:r>
+        <w:rPr>
+          <w:sz w:val="24"/>
+          <w:szCs w:val="24"/>
+        </w:rPr>
+        <w:t>Si no hay usuarios para eliminar, saltará el siguiente mensaje:</w:t>
       </w:r>
     </w:p>
     <w:p>
@@ -3934,10 +4368,10 @@
           <w:noProof/>
         </w:rPr>
         <w:drawing>
-          <wp:inline distT="0" distB="0" distL="0" distR="0" wp14:anchorId="651D669F" wp14:editId="78435372">
-            <wp:extent cx="5400040" cy="2617470"/>
-            <wp:effectExtent l="0" t="0" r="0" b="0"/>
-            <wp:docPr id="1751370057" name="Imagen 1"/>
+          <wp:inline distT="0" distB="0" distL="0" distR="0" wp14:anchorId="0B11118A" wp14:editId="1459A8DF">
+            <wp:extent cx="3997036" cy="562848"/>
+            <wp:effectExtent l="0" t="0" r="3810" b="8890"/>
+            <wp:docPr id="1092781828" name="Imagen 1"/>
             <wp:cNvGraphicFramePr>
               <a:graphicFrameLocks xmlns:a="http://schemas.openxmlformats.org/drawingml/2006/main" noChangeAspect="1"/>
             </wp:cNvGraphicFramePr>
@@ -3945,7 +4379,7 @@
               <a:graphicData uri="http://schemas.openxmlformats.org/drawingml/2006/picture">
                 <pic:pic xmlns:pic="http://schemas.openxmlformats.org/drawingml/2006/picture">
                   <pic:nvPicPr>
-                    <pic:cNvPr id="1751370057" name=""/>
+                    <pic:cNvPr id="1092781828" name=""/>
                     <pic:cNvPicPr/>
                   </pic:nvPicPr>
                   <pic:blipFill>
@@ -3957,7 +4391,7 @@
                   <pic:spPr>
                     <a:xfrm>
                       <a:off x="0" y="0"/>
-                      <a:ext cx="5400040" cy="2617470"/>
+                      <a:ext cx="4015770" cy="565486"/>
                     </a:xfrm>
                     <a:prstGeom prst="rect">
                       <a:avLst/>
@@ -3977,20 +4411,12 @@
           <w:szCs w:val="24"/>
         </w:rPr>
       </w:pPr>
-    </w:p>
-    <w:p>
-      <w:pPr>
-        <w:rPr>
-          <w:sz w:val="24"/>
-          <w:szCs w:val="24"/>
-        </w:rPr>
-      </w:pPr>
-      <w:r>
-        <w:rPr>
-          <w:sz w:val="24"/>
-          <w:szCs w:val="24"/>
-        </w:rPr>
-        <w:t>En el caso de que no haya eventos disponibles, se mostrará el siguiente mensaje:</w:t>
+      <w:r>
+        <w:rPr>
+          <w:sz w:val="24"/>
+          <w:szCs w:val="24"/>
+        </w:rPr>
+        <w:t>Si se intenta eliminar un usuario que no existe, saltará el siguiente error:</w:t>
       </w:r>
     </w:p>
     <w:p>
@@ -4005,10 +4431,10 @@
           <w:noProof/>
         </w:rPr>
         <w:drawing>
-          <wp:inline distT="0" distB="0" distL="0" distR="0" wp14:anchorId="26787093" wp14:editId="75838759">
-            <wp:extent cx="4762500" cy="962025"/>
-            <wp:effectExtent l="0" t="0" r="0" b="9525"/>
-            <wp:docPr id="687857313" name="Imagen 1"/>
+          <wp:inline distT="0" distB="0" distL="0" distR="0" wp14:anchorId="414BE9CC" wp14:editId="0D4B782B">
+            <wp:extent cx="3803072" cy="756679"/>
+            <wp:effectExtent l="0" t="0" r="6985" b="5715"/>
+            <wp:docPr id="1933687151" name="Imagen 1"/>
             <wp:cNvGraphicFramePr>
               <a:graphicFrameLocks xmlns:a="http://schemas.openxmlformats.org/drawingml/2006/main" noChangeAspect="1"/>
             </wp:cNvGraphicFramePr>
@@ -4016,7 +4442,7 @@
               <a:graphicData uri="http://schemas.openxmlformats.org/drawingml/2006/picture">
                 <pic:pic xmlns:pic="http://schemas.openxmlformats.org/drawingml/2006/picture">
                   <pic:nvPicPr>
-                    <pic:cNvPr id="687857313" name=""/>
+                    <pic:cNvPr id="1933687151" name=""/>
                     <pic:cNvPicPr/>
                   </pic:nvPicPr>
                   <pic:blipFill>
@@ -4028,7 +4454,7 @@
                   <pic:spPr>
                     <a:xfrm>
                       <a:off x="0" y="0"/>
-                      <a:ext cx="4762500" cy="962025"/>
+                      <a:ext cx="3835305" cy="763092"/>
                     </a:xfrm>
                     <a:prstGeom prst="rect">
                       <a:avLst/>
@@ -4048,13 +4474,177 @@
           <w:szCs w:val="24"/>
         </w:rPr>
       </w:pPr>
-      <w:r>
-        <w:rPr>
-          <w:sz w:val="24"/>
-          <w:szCs w:val="24"/>
+    </w:p>
+    <w:p>
+      <w:pPr>
+        <w:rPr>
+          <w:sz w:val="24"/>
+          <w:szCs w:val="24"/>
+        </w:rPr>
+      </w:pPr>
+    </w:p>
+    <w:p>
+      <w:pPr>
+        <w:rPr>
+          <w:sz w:val="24"/>
+          <w:szCs w:val="24"/>
+        </w:rPr>
+      </w:pPr>
+      <w:r>
+        <w:rPr>
+          <w:sz w:val="24"/>
+          <w:szCs w:val="24"/>
+        </w:rPr>
+        <w:br w:type="page"/>
+      </w:r>
+    </w:p>
+    <w:p>
+      <w:pPr>
+        <w:rPr>
+          <w:b/>
+          <w:bCs/>
+          <w:sz w:val="28"/>
+          <w:szCs w:val="28"/>
+        </w:rPr>
+      </w:pPr>
+      <w:r>
+        <w:rPr>
+          <w:b/>
+          <w:bCs/>
+          <w:sz w:val="28"/>
+          <w:szCs w:val="28"/>
         </w:rPr>
         <w:lastRenderedPageBreak/>
-        <w:t>En el caso de que el evento seleccionado no exista, se mostrará el siguiente mensaje:</w:t>
+        <w:t>Opción 3:</w:t>
+      </w:r>
+    </w:p>
+    <w:p>
+      <w:pPr>
+        <w:rPr>
+          <w:b/>
+          <w:bCs/>
+          <w:sz w:val="24"/>
+          <w:szCs w:val="24"/>
+        </w:rPr>
+      </w:pPr>
+      <w:r>
+        <w:rPr>
+          <w:b/>
+          <w:bCs/>
+          <w:sz w:val="24"/>
+          <w:szCs w:val="24"/>
+        </w:rPr>
+        <w:t>Se inicia el menú de creación de evento.</w:t>
+      </w:r>
+    </w:p>
+    <w:p>
+      <w:pPr>
+        <w:rPr>
+          <w:sz w:val="24"/>
+          <w:szCs w:val="24"/>
+        </w:rPr>
+      </w:pPr>
+      <w:r>
+        <w:rPr>
+          <w:sz w:val="24"/>
+          <w:szCs w:val="24"/>
+        </w:rPr>
+        <w:t>La información requerida para crear un evento es:</w:t>
+      </w:r>
+    </w:p>
+    <w:p>
+      <w:pPr>
+        <w:pStyle w:val="Prrafodelista"/>
+        <w:numPr>
+          <w:ilvl w:val="0"/>
+          <w:numId w:val="2"/>
+        </w:numPr>
+        <w:rPr>
+          <w:sz w:val="24"/>
+          <w:szCs w:val="24"/>
+        </w:rPr>
+      </w:pPr>
+      <w:r>
+        <w:rPr>
+          <w:sz w:val="24"/>
+          <w:szCs w:val="24"/>
+        </w:rPr>
+        <w:t>Fecha</w:t>
+      </w:r>
+    </w:p>
+    <w:p>
+      <w:pPr>
+        <w:pStyle w:val="Prrafodelista"/>
+        <w:numPr>
+          <w:ilvl w:val="0"/>
+          <w:numId w:val="2"/>
+        </w:numPr>
+        <w:rPr>
+          <w:sz w:val="24"/>
+          <w:szCs w:val="24"/>
+        </w:rPr>
+      </w:pPr>
+      <w:r>
+        <w:rPr>
+          <w:sz w:val="24"/>
+          <w:szCs w:val="24"/>
+        </w:rPr>
+        <w:t>Título</w:t>
+      </w:r>
+    </w:p>
+    <w:p>
+      <w:pPr>
+        <w:pStyle w:val="Prrafodelista"/>
+        <w:numPr>
+          <w:ilvl w:val="0"/>
+          <w:numId w:val="2"/>
+        </w:numPr>
+        <w:rPr>
+          <w:sz w:val="24"/>
+          <w:szCs w:val="24"/>
+        </w:rPr>
+      </w:pPr>
+      <w:r>
+        <w:rPr>
+          <w:sz w:val="24"/>
+          <w:szCs w:val="24"/>
+        </w:rPr>
+        <w:t>Ubicación</w:t>
+      </w:r>
+    </w:p>
+    <w:p>
+      <w:pPr>
+        <w:pStyle w:val="Prrafodelista"/>
+        <w:numPr>
+          <w:ilvl w:val="0"/>
+          <w:numId w:val="2"/>
+        </w:numPr>
+        <w:rPr>
+          <w:sz w:val="24"/>
+          <w:szCs w:val="24"/>
+        </w:rPr>
+      </w:pPr>
+      <w:r>
+        <w:rPr>
+          <w:sz w:val="24"/>
+          <w:szCs w:val="24"/>
+        </w:rPr>
+        <w:t>Descripción</w:t>
+      </w:r>
+    </w:p>
+    <w:p>
+      <w:pPr>
+        <w:rPr>
+          <w:sz w:val="24"/>
+          <w:szCs w:val="24"/>
+        </w:rPr>
+      </w:pPr>
+      <w:r>
+        <w:rPr>
+          <w:sz w:val="24"/>
+          <w:szCs w:val="24"/>
+        </w:rPr>
+        <w:t>Adicionalmente, se crea automáticamente un ID único para cada evento.</w:t>
       </w:r>
     </w:p>
     <w:p>
@@ -4069,10 +4659,10 @@
           <w:noProof/>
         </w:rPr>
         <w:drawing>
-          <wp:inline distT="0" distB="0" distL="0" distR="0" wp14:anchorId="703A17C6" wp14:editId="07A31F45">
-            <wp:extent cx="5400040" cy="2224405"/>
-            <wp:effectExtent l="0" t="0" r="0" b="4445"/>
-            <wp:docPr id="834235790" name="Imagen 1"/>
+          <wp:inline distT="0" distB="0" distL="0" distR="0" wp14:anchorId="19482CDA" wp14:editId="419E68B5">
+            <wp:extent cx="2964872" cy="1661564"/>
+            <wp:effectExtent l="0" t="0" r="6985" b="0"/>
+            <wp:docPr id="1956343125" name="Imagen 1"/>
             <wp:cNvGraphicFramePr>
               <a:graphicFrameLocks xmlns:a="http://schemas.openxmlformats.org/drawingml/2006/main" noChangeAspect="1"/>
             </wp:cNvGraphicFramePr>
@@ -4080,7 +4670,7 @@
               <a:graphicData uri="http://schemas.openxmlformats.org/drawingml/2006/picture">
                 <pic:pic xmlns:pic="http://schemas.openxmlformats.org/drawingml/2006/picture">
                   <pic:nvPicPr>
-                    <pic:cNvPr id="834235790" name=""/>
+                    <pic:cNvPr id="1956343125" name=""/>
                     <pic:cNvPicPr/>
                   </pic:nvPicPr>
                   <pic:blipFill>
@@ -4092,7 +4682,7 @@
                   <pic:spPr>
                     <a:xfrm>
                       <a:off x="0" y="0"/>
-                      <a:ext cx="5400040" cy="2224405"/>
+                      <a:ext cx="2969197" cy="1663988"/>
                     </a:xfrm>
                     <a:prstGeom prst="rect">
                       <a:avLst/>
@@ -4124,35 +4714,12 @@
     <w:p>
       <w:pPr>
         <w:rPr>
-          <w:sz w:val="24"/>
-          <w:szCs w:val="24"/>
-        </w:rPr>
-      </w:pPr>
-    </w:p>
-    <w:p>
-      <w:pPr>
-        <w:rPr>
-          <w:sz w:val="24"/>
-          <w:szCs w:val="24"/>
-        </w:rPr>
-      </w:pPr>
-    </w:p>
-    <w:p>
-      <w:pPr>
-        <w:rPr>
-          <w:sz w:val="24"/>
-          <w:szCs w:val="24"/>
-        </w:rPr>
-      </w:pPr>
-      <w:r>
-        <w:rPr>
           <w:b/>
           <w:bCs/>
           <w:sz w:val="28"/>
           <w:szCs w:val="28"/>
         </w:rPr>
-        <w:t xml:space="preserve">Opción </w:t>
-      </w:r>
+      </w:pPr>
       <w:r>
         <w:rPr>
           <w:b/>
@@ -4160,45 +4727,41 @@
           <w:sz w:val="28"/>
           <w:szCs w:val="28"/>
         </w:rPr>
-        <w:t>6</w:t>
-      </w:r>
-      <w:r>
-        <w:rPr>
-          <w:b/>
-          <w:bCs/>
-          <w:sz w:val="28"/>
-          <w:szCs w:val="28"/>
-        </w:rPr>
-        <w:t>:</w:t>
-      </w:r>
-    </w:p>
-    <w:p>
-      <w:pPr>
-        <w:rPr>
-          <w:sz w:val="24"/>
-          <w:szCs w:val="24"/>
-        </w:rPr>
-      </w:pPr>
-      <w:r>
-        <w:rPr>
-          <w:sz w:val="24"/>
-          <w:szCs w:val="24"/>
-        </w:rPr>
-        <w:t xml:space="preserve">Se inicia el menú de </w:t>
-      </w:r>
-      <w:r>
-        <w:rPr>
-          <w:sz w:val="24"/>
-          <w:szCs w:val="24"/>
-        </w:rPr>
-        <w:t>borrado</w:t>
-      </w:r>
-      <w:r>
-        <w:rPr>
-          <w:sz w:val="24"/>
-          <w:szCs w:val="24"/>
-        </w:rPr>
-        <w:t xml:space="preserve"> de galerías</w:t>
+        <w:t>Opción 4:</w:t>
+      </w:r>
+    </w:p>
+    <w:p>
+      <w:pPr>
+        <w:rPr>
+          <w:b/>
+          <w:bCs/>
+          <w:sz w:val="24"/>
+          <w:szCs w:val="24"/>
+        </w:rPr>
+      </w:pPr>
+      <w:r>
+        <w:rPr>
+          <w:b/>
+          <w:bCs/>
+          <w:sz w:val="24"/>
+          <w:szCs w:val="24"/>
+        </w:rPr>
+        <w:t>Se inicia el menú de borrado de evento.</w:t>
+      </w:r>
+    </w:p>
+    <w:p>
+      <w:pPr>
+        <w:rPr>
+          <w:sz w:val="24"/>
+          <w:szCs w:val="24"/>
+        </w:rPr>
+      </w:pPr>
+      <w:r>
+        <w:rPr>
+          <w:sz w:val="24"/>
+          <w:szCs w:val="24"/>
+        </w:rPr>
+        <w:t>Se muestra una tabla con los eventos disponibles , mostrando sus ID y título</w:t>
       </w:r>
       <w:r>
         <w:rPr>
@@ -4220,14 +4783,7 @@
           <w:sz w:val="24"/>
           <w:szCs w:val="24"/>
         </w:rPr>
-        <w:t>Tras abrir el menú, se mostrará una tabla con los eventos disponibles. Tras seleccionar el evento, se mostrarán las galerías que tiene.</w:t>
-      </w:r>
-      <w:r>
-        <w:rPr>
-          <w:sz w:val="24"/>
-          <w:szCs w:val="24"/>
-        </w:rPr>
-        <w:t xml:space="preserve"> Si se selecciona una galería esta será borrada.</w:t>
+        <w:t>Solamente hace falta introducir el ID del evento que se quiere eliminar.</w:t>
       </w:r>
     </w:p>
     <w:p>
@@ -4242,10 +4798,10 @@
           <w:noProof/>
         </w:rPr>
         <w:drawing>
-          <wp:inline distT="0" distB="0" distL="0" distR="0" wp14:anchorId="64476E28" wp14:editId="556B43F7">
-            <wp:extent cx="5400040" cy="2949575"/>
-            <wp:effectExtent l="0" t="0" r="0" b="3175"/>
-            <wp:docPr id="686857859" name="Imagen 1"/>
+          <wp:inline distT="0" distB="0" distL="0" distR="0" wp14:anchorId="5CB73698" wp14:editId="62A3BB29">
+            <wp:extent cx="4777740" cy="1406804"/>
+            <wp:effectExtent l="0" t="0" r="3810" b="3175"/>
+            <wp:docPr id="1546679247" name="Imagen 1"/>
             <wp:cNvGraphicFramePr>
               <a:graphicFrameLocks xmlns:a="http://schemas.openxmlformats.org/drawingml/2006/main" noChangeAspect="1"/>
             </wp:cNvGraphicFramePr>
@@ -4253,7 +4809,7 @@
               <a:graphicData uri="http://schemas.openxmlformats.org/drawingml/2006/picture">
                 <pic:pic xmlns:pic="http://schemas.openxmlformats.org/drawingml/2006/picture">
                   <pic:nvPicPr>
-                    <pic:cNvPr id="686857859" name=""/>
+                    <pic:cNvPr id="1546679247" name=""/>
                     <pic:cNvPicPr/>
                   </pic:nvPicPr>
                   <pic:blipFill>
@@ -4265,7 +4821,7 @@
                   <pic:spPr>
                     <a:xfrm>
                       <a:off x="0" y="0"/>
-                      <a:ext cx="5400040" cy="2949575"/>
+                      <a:ext cx="4781409" cy="1407884"/>
                     </a:xfrm>
                     <a:prstGeom prst="rect">
                       <a:avLst/>
@@ -4276,6 +4832,1283 @@
             </a:graphic>
           </wp:inline>
         </w:drawing>
+      </w:r>
+    </w:p>
+    <w:p>
+      <w:pPr>
+        <w:rPr>
+          <w:sz w:val="24"/>
+          <w:szCs w:val="24"/>
+        </w:rPr>
+      </w:pPr>
+    </w:p>
+    <w:p>
+      <w:pPr>
+        <w:rPr>
+          <w:sz w:val="24"/>
+          <w:szCs w:val="24"/>
+        </w:rPr>
+      </w:pPr>
+      <w:r>
+        <w:rPr>
+          <w:sz w:val="24"/>
+          <w:szCs w:val="24"/>
+        </w:rPr>
+        <w:t>Si no hay eventos disponibles para eliminar, se mostrará el siguiente mensaje:</w:t>
+      </w:r>
+    </w:p>
+    <w:p>
+      <w:pPr>
+        <w:rPr>
+          <w:sz w:val="24"/>
+          <w:szCs w:val="24"/>
+        </w:rPr>
+      </w:pPr>
+      <w:r>
+        <w:rPr>
+          <w:noProof/>
+        </w:rPr>
+        <w:drawing>
+          <wp:inline distT="0" distB="0" distL="0" distR="0" wp14:anchorId="53F80DDA" wp14:editId="7955AC24">
+            <wp:extent cx="3886200" cy="568712"/>
+            <wp:effectExtent l="0" t="0" r="0" b="3175"/>
+            <wp:docPr id="1933619318" name="Imagen 1"/>
+            <wp:cNvGraphicFramePr>
+              <a:graphicFrameLocks xmlns:a="http://schemas.openxmlformats.org/drawingml/2006/main" noChangeAspect="1"/>
+            </wp:cNvGraphicFramePr>
+            <a:graphic xmlns:a="http://schemas.openxmlformats.org/drawingml/2006/main">
+              <a:graphicData uri="http://schemas.openxmlformats.org/drawingml/2006/picture">
+                <pic:pic xmlns:pic="http://schemas.openxmlformats.org/drawingml/2006/picture">
+                  <pic:nvPicPr>
+                    <pic:cNvPr id="1933619318" name=""/>
+                    <pic:cNvPicPr/>
+                  </pic:nvPicPr>
+                  <pic:blipFill>
+                    <a:blip r:embed="rId38"/>
+                    <a:stretch>
+                      <a:fillRect/>
+                    </a:stretch>
+                  </pic:blipFill>
+                  <pic:spPr>
+                    <a:xfrm>
+                      <a:off x="0" y="0"/>
+                      <a:ext cx="3894426" cy="569916"/>
+                    </a:xfrm>
+                    <a:prstGeom prst="rect">
+                      <a:avLst/>
+                    </a:prstGeom>
+                  </pic:spPr>
+                </pic:pic>
+              </a:graphicData>
+            </a:graphic>
+          </wp:inline>
+        </w:drawing>
+      </w:r>
+    </w:p>
+    <w:p>
+      <w:pPr>
+        <w:rPr>
+          <w:sz w:val="24"/>
+          <w:szCs w:val="24"/>
+        </w:rPr>
+      </w:pPr>
+      <w:r>
+        <w:rPr>
+          <w:sz w:val="24"/>
+          <w:szCs w:val="24"/>
+        </w:rPr>
+        <w:lastRenderedPageBreak/>
+        <w:t>Asimismo, si se intenta eliminar un evento que no existe, el siguiente mensaje será mostrado:</w:t>
+      </w:r>
+    </w:p>
+    <w:p>
+      <w:pPr>
+        <w:rPr>
+          <w:sz w:val="24"/>
+          <w:szCs w:val="24"/>
+        </w:rPr>
+      </w:pPr>
+      <w:r>
+        <w:rPr>
+          <w:noProof/>
+        </w:rPr>
+        <w:drawing>
+          <wp:inline distT="0" distB="0" distL="0" distR="0" wp14:anchorId="0333722E" wp14:editId="67DB3617">
+            <wp:extent cx="3870960" cy="1102022"/>
+            <wp:effectExtent l="0" t="0" r="0" b="3175"/>
+            <wp:docPr id="1893107187" name="Imagen 1"/>
+            <wp:cNvGraphicFramePr>
+              <a:graphicFrameLocks xmlns:a="http://schemas.openxmlformats.org/drawingml/2006/main" noChangeAspect="1"/>
+            </wp:cNvGraphicFramePr>
+            <a:graphic xmlns:a="http://schemas.openxmlformats.org/drawingml/2006/main">
+              <a:graphicData uri="http://schemas.openxmlformats.org/drawingml/2006/picture">
+                <pic:pic xmlns:pic="http://schemas.openxmlformats.org/drawingml/2006/picture">
+                  <pic:nvPicPr>
+                    <pic:cNvPr id="1893107187" name=""/>
+                    <pic:cNvPicPr/>
+                  </pic:nvPicPr>
+                  <pic:blipFill>
+                    <a:blip r:embed="rId39"/>
+                    <a:stretch>
+                      <a:fillRect/>
+                    </a:stretch>
+                  </pic:blipFill>
+                  <pic:spPr>
+                    <a:xfrm>
+                      <a:off x="0" y="0"/>
+                      <a:ext cx="3879958" cy="1104584"/>
+                    </a:xfrm>
+                    <a:prstGeom prst="rect">
+                      <a:avLst/>
+                    </a:prstGeom>
+                  </pic:spPr>
+                </pic:pic>
+              </a:graphicData>
+            </a:graphic>
+          </wp:inline>
+        </w:drawing>
+      </w:r>
+    </w:p>
+    <w:p>
+      <w:pPr>
+        <w:rPr>
+          <w:b/>
+          <w:bCs/>
+          <w:sz w:val="28"/>
+          <w:szCs w:val="28"/>
+        </w:rPr>
+      </w:pPr>
+      <w:r>
+        <w:rPr>
+          <w:b/>
+          <w:bCs/>
+          <w:sz w:val="28"/>
+          <w:szCs w:val="28"/>
+        </w:rPr>
+        <w:t>Opción 5:</w:t>
+      </w:r>
+    </w:p>
+    <w:p>
+      <w:pPr>
+        <w:rPr>
+          <w:b/>
+          <w:bCs/>
+          <w:sz w:val="24"/>
+          <w:szCs w:val="24"/>
+        </w:rPr>
+      </w:pPr>
+      <w:r>
+        <w:rPr>
+          <w:b/>
+          <w:bCs/>
+          <w:sz w:val="24"/>
+          <w:szCs w:val="24"/>
+        </w:rPr>
+        <w:t>Se inicia el menú de creación de galerías</w:t>
+      </w:r>
+    </w:p>
+    <w:p>
+      <w:pPr>
+        <w:rPr>
+          <w:sz w:val="24"/>
+          <w:szCs w:val="24"/>
+        </w:rPr>
+      </w:pPr>
+      <w:r>
+        <w:rPr>
+          <w:sz w:val="24"/>
+          <w:szCs w:val="24"/>
+        </w:rPr>
+        <w:t xml:space="preserve">Para crear una galería hace falta como mínimo un evento disponible. </w:t>
+      </w:r>
+      <w:r>
+        <w:rPr>
+          <w:sz w:val="24"/>
+          <w:szCs w:val="24"/>
+        </w:rPr>
+        <w:t>Tras elegir el evento donde se quiere crear la galería, se deberá introducir el título de dicha galería.</w:t>
+      </w:r>
+    </w:p>
+    <w:p>
+      <w:pPr>
+        <w:rPr>
+          <w:sz w:val="24"/>
+          <w:szCs w:val="24"/>
+        </w:rPr>
+      </w:pPr>
+      <w:r>
+        <w:rPr>
+          <w:noProof/>
+        </w:rPr>
+        <w:drawing>
+          <wp:inline distT="0" distB="0" distL="0" distR="0" wp14:anchorId="2AD86971" wp14:editId="44052C80">
+            <wp:extent cx="3747654" cy="1478966"/>
+            <wp:effectExtent l="0" t="0" r="5715" b="6985"/>
+            <wp:docPr id="974951193" name="Imagen 1"/>
+            <wp:cNvGraphicFramePr>
+              <a:graphicFrameLocks xmlns:a="http://schemas.openxmlformats.org/drawingml/2006/main" noChangeAspect="1"/>
+            </wp:cNvGraphicFramePr>
+            <a:graphic xmlns:a="http://schemas.openxmlformats.org/drawingml/2006/main">
+              <a:graphicData uri="http://schemas.openxmlformats.org/drawingml/2006/picture">
+                <pic:pic xmlns:pic="http://schemas.openxmlformats.org/drawingml/2006/picture">
+                  <pic:nvPicPr>
+                    <pic:cNvPr id="974951193" name=""/>
+                    <pic:cNvPicPr/>
+                  </pic:nvPicPr>
+                  <pic:blipFill>
+                    <a:blip r:embed="rId40"/>
+                    <a:stretch>
+                      <a:fillRect/>
+                    </a:stretch>
+                  </pic:blipFill>
+                  <pic:spPr>
+                    <a:xfrm>
+                      <a:off x="0" y="0"/>
+                      <a:ext cx="3759196" cy="1483521"/>
+                    </a:xfrm>
+                    <a:prstGeom prst="rect">
+                      <a:avLst/>
+                    </a:prstGeom>
+                  </pic:spPr>
+                </pic:pic>
+              </a:graphicData>
+            </a:graphic>
+          </wp:inline>
+        </w:drawing>
+      </w:r>
+    </w:p>
+    <w:p>
+      <w:pPr>
+        <w:rPr>
+          <w:sz w:val="24"/>
+          <w:szCs w:val="24"/>
+        </w:rPr>
+      </w:pPr>
+    </w:p>
+    <w:p>
+      <w:pPr>
+        <w:rPr>
+          <w:sz w:val="24"/>
+          <w:szCs w:val="24"/>
+        </w:rPr>
+      </w:pPr>
+      <w:r>
+        <w:rPr>
+          <w:sz w:val="24"/>
+          <w:szCs w:val="24"/>
+        </w:rPr>
+        <w:t>En el caso de que no haya eventos disponibles, se mostrará el siguiente mensaje:</w:t>
+      </w:r>
+    </w:p>
+    <w:p>
+      <w:pPr>
+        <w:rPr>
+          <w:sz w:val="24"/>
+          <w:szCs w:val="24"/>
+        </w:rPr>
+      </w:pPr>
+      <w:r>
+        <w:rPr>
+          <w:noProof/>
+        </w:rPr>
+        <w:drawing>
+          <wp:inline distT="0" distB="0" distL="0" distR="0" wp14:anchorId="2B34DB94" wp14:editId="6164F0C6">
+            <wp:extent cx="3470563" cy="480861"/>
+            <wp:effectExtent l="0" t="0" r="0" b="0"/>
+            <wp:docPr id="1144619541" name="Imagen 1"/>
+            <wp:cNvGraphicFramePr>
+              <a:graphicFrameLocks xmlns:a="http://schemas.openxmlformats.org/drawingml/2006/main" noChangeAspect="1"/>
+            </wp:cNvGraphicFramePr>
+            <a:graphic xmlns:a="http://schemas.openxmlformats.org/drawingml/2006/main">
+              <a:graphicData uri="http://schemas.openxmlformats.org/drawingml/2006/picture">
+                <pic:pic xmlns:pic="http://schemas.openxmlformats.org/drawingml/2006/picture">
+                  <pic:nvPicPr>
+                    <pic:cNvPr id="1144619541" name=""/>
+                    <pic:cNvPicPr/>
+                  </pic:nvPicPr>
+                  <pic:blipFill>
+                    <a:blip r:embed="rId41"/>
+                    <a:stretch>
+                      <a:fillRect/>
+                    </a:stretch>
+                  </pic:blipFill>
+                  <pic:spPr>
+                    <a:xfrm>
+                      <a:off x="0" y="0"/>
+                      <a:ext cx="3487941" cy="483269"/>
+                    </a:xfrm>
+                    <a:prstGeom prst="rect">
+                      <a:avLst/>
+                    </a:prstGeom>
+                  </pic:spPr>
+                </pic:pic>
+              </a:graphicData>
+            </a:graphic>
+          </wp:inline>
+        </w:drawing>
+      </w:r>
+    </w:p>
+    <w:p>
+      <w:pPr>
+        <w:rPr>
+          <w:sz w:val="24"/>
+          <w:szCs w:val="24"/>
+        </w:rPr>
+      </w:pPr>
+      <w:r>
+        <w:rPr>
+          <w:sz w:val="24"/>
+          <w:szCs w:val="24"/>
+        </w:rPr>
+        <w:t>En el caso de que el evento seleccionado no exista, se mostrará el siguiente mensaje:</w:t>
+      </w:r>
+    </w:p>
+    <w:p>
+      <w:pPr>
+        <w:rPr>
+          <w:sz w:val="24"/>
+          <w:szCs w:val="24"/>
+        </w:rPr>
+      </w:pPr>
+      <w:r>
+        <w:rPr>
+          <w:noProof/>
+        </w:rPr>
+        <w:drawing>
+          <wp:inline distT="0" distB="0" distL="0" distR="0" wp14:anchorId="0DA270DB" wp14:editId="002145CD">
+            <wp:extent cx="4232563" cy="1344327"/>
+            <wp:effectExtent l="0" t="0" r="0" b="8255"/>
+            <wp:docPr id="1110289721" name="Imagen 1"/>
+            <wp:cNvGraphicFramePr>
+              <a:graphicFrameLocks xmlns:a="http://schemas.openxmlformats.org/drawingml/2006/main" noChangeAspect="1"/>
+            </wp:cNvGraphicFramePr>
+            <a:graphic xmlns:a="http://schemas.openxmlformats.org/drawingml/2006/main">
+              <a:graphicData uri="http://schemas.openxmlformats.org/drawingml/2006/picture">
+                <pic:pic xmlns:pic="http://schemas.openxmlformats.org/drawingml/2006/picture">
+                  <pic:nvPicPr>
+                    <pic:cNvPr id="1110289721" name=""/>
+                    <pic:cNvPicPr/>
+                  </pic:nvPicPr>
+                  <pic:blipFill>
+                    <a:blip r:embed="rId42"/>
+                    <a:stretch>
+                      <a:fillRect/>
+                    </a:stretch>
+                  </pic:blipFill>
+                  <pic:spPr>
+                    <a:xfrm>
+                      <a:off x="0" y="0"/>
+                      <a:ext cx="4241292" cy="1347099"/>
+                    </a:xfrm>
+                    <a:prstGeom prst="rect">
+                      <a:avLst/>
+                    </a:prstGeom>
+                  </pic:spPr>
+                </pic:pic>
+              </a:graphicData>
+            </a:graphic>
+          </wp:inline>
+        </w:drawing>
+      </w:r>
+    </w:p>
+    <w:p>
+      <w:pPr>
+        <w:rPr>
+          <w:sz w:val="24"/>
+          <w:szCs w:val="24"/>
+        </w:rPr>
+      </w:pPr>
+    </w:p>
+    <w:p>
+      <w:pPr>
+        <w:rPr>
+          <w:sz w:val="24"/>
+          <w:szCs w:val="24"/>
+        </w:rPr>
+      </w:pPr>
+    </w:p>
+    <w:p>
+      <w:pPr>
+        <w:rPr>
+          <w:sz w:val="24"/>
+          <w:szCs w:val="24"/>
+        </w:rPr>
+      </w:pPr>
+    </w:p>
+    <w:p>
+      <w:pPr>
+        <w:rPr>
+          <w:sz w:val="24"/>
+          <w:szCs w:val="24"/>
+        </w:rPr>
+      </w:pPr>
+    </w:p>
+    <w:p>
+      <w:pPr>
+        <w:rPr>
+          <w:b/>
+          <w:bCs/>
+          <w:sz w:val="28"/>
+          <w:szCs w:val="28"/>
+        </w:rPr>
+      </w:pPr>
+      <w:r>
+        <w:rPr>
+          <w:b/>
+          <w:bCs/>
+          <w:sz w:val="28"/>
+          <w:szCs w:val="28"/>
+        </w:rPr>
+        <w:br w:type="page"/>
+      </w:r>
+    </w:p>
+    <w:p>
+      <w:pPr>
+        <w:rPr>
+          <w:sz w:val="24"/>
+          <w:szCs w:val="24"/>
+        </w:rPr>
+      </w:pPr>
+      <w:r>
+        <w:rPr>
+          <w:b/>
+          <w:bCs/>
+          <w:sz w:val="28"/>
+          <w:szCs w:val="28"/>
+        </w:rPr>
+        <w:lastRenderedPageBreak/>
+        <w:t xml:space="preserve">Opción </w:t>
+      </w:r>
+      <w:r>
+        <w:rPr>
+          <w:b/>
+          <w:bCs/>
+          <w:sz w:val="28"/>
+          <w:szCs w:val="28"/>
+        </w:rPr>
+        <w:t>6</w:t>
+      </w:r>
+      <w:r>
+        <w:rPr>
+          <w:b/>
+          <w:bCs/>
+          <w:sz w:val="28"/>
+          <w:szCs w:val="28"/>
+        </w:rPr>
+        <w:t>:</w:t>
+      </w:r>
+    </w:p>
+    <w:p>
+      <w:pPr>
+        <w:rPr>
+          <w:b/>
+          <w:bCs/>
+          <w:sz w:val="24"/>
+          <w:szCs w:val="24"/>
+        </w:rPr>
+      </w:pPr>
+      <w:r>
+        <w:rPr>
+          <w:b/>
+          <w:bCs/>
+          <w:sz w:val="24"/>
+          <w:szCs w:val="24"/>
+        </w:rPr>
+        <w:t>Se inicia el menú de borrado de galerías</w:t>
+      </w:r>
+      <w:r>
+        <w:rPr>
+          <w:b/>
+          <w:bCs/>
+          <w:sz w:val="24"/>
+          <w:szCs w:val="24"/>
+        </w:rPr>
+        <w:t>.</w:t>
+      </w:r>
+    </w:p>
+    <w:p>
+      <w:pPr>
+        <w:rPr>
+          <w:sz w:val="24"/>
+          <w:szCs w:val="24"/>
+        </w:rPr>
+      </w:pPr>
+      <w:r>
+        <w:rPr>
+          <w:sz w:val="24"/>
+          <w:szCs w:val="24"/>
+        </w:rPr>
+        <w:t>Tras abrir el menú, se mostrará una tabla con los eventos disponibles. Tras seleccionar el evento, se mostrarán las galerías que tiene.</w:t>
+      </w:r>
+      <w:r>
+        <w:rPr>
+          <w:sz w:val="24"/>
+          <w:szCs w:val="24"/>
+        </w:rPr>
+        <w:t xml:space="preserve"> Si se selecciona una galería</w:t>
+      </w:r>
+      <w:r>
+        <w:rPr>
+          <w:sz w:val="24"/>
+          <w:szCs w:val="24"/>
+        </w:rPr>
+        <w:t>,</w:t>
+      </w:r>
+      <w:r>
+        <w:rPr>
+          <w:sz w:val="24"/>
+          <w:szCs w:val="24"/>
+        </w:rPr>
+        <w:t xml:space="preserve"> esta será borrada.</w:t>
+      </w:r>
+    </w:p>
+    <w:p>
+      <w:pPr>
+        <w:rPr>
+          <w:sz w:val="24"/>
+          <w:szCs w:val="24"/>
+        </w:rPr>
+      </w:pPr>
+      <w:r>
+        <w:rPr>
+          <w:noProof/>
+        </w:rPr>
+        <w:drawing>
+          <wp:inline distT="0" distB="0" distL="0" distR="0" wp14:anchorId="171699FE" wp14:editId="79AA593A">
+            <wp:extent cx="4236720" cy="1858796"/>
+            <wp:effectExtent l="0" t="0" r="0" b="8255"/>
+            <wp:docPr id="914907368" name="Imagen 1"/>
+            <wp:cNvGraphicFramePr>
+              <a:graphicFrameLocks xmlns:a="http://schemas.openxmlformats.org/drawingml/2006/main" noChangeAspect="1"/>
+            </wp:cNvGraphicFramePr>
+            <a:graphic xmlns:a="http://schemas.openxmlformats.org/drawingml/2006/main">
+              <a:graphicData uri="http://schemas.openxmlformats.org/drawingml/2006/picture">
+                <pic:pic xmlns:pic="http://schemas.openxmlformats.org/drawingml/2006/picture">
+                  <pic:nvPicPr>
+                    <pic:cNvPr id="914907368" name=""/>
+                    <pic:cNvPicPr/>
+                  </pic:nvPicPr>
+                  <pic:blipFill>
+                    <a:blip r:embed="rId43"/>
+                    <a:stretch>
+                      <a:fillRect/>
+                    </a:stretch>
+                  </pic:blipFill>
+                  <pic:spPr>
+                    <a:xfrm>
+                      <a:off x="0" y="0"/>
+                      <a:ext cx="4244876" cy="1862374"/>
+                    </a:xfrm>
+                    <a:prstGeom prst="rect">
+                      <a:avLst/>
+                    </a:prstGeom>
+                  </pic:spPr>
+                </pic:pic>
+              </a:graphicData>
+            </a:graphic>
+          </wp:inline>
+        </w:drawing>
+      </w:r>
+    </w:p>
+    <w:p>
+      <w:pPr>
+        <w:rPr>
+          <w:sz w:val="24"/>
+          <w:szCs w:val="24"/>
+        </w:rPr>
+      </w:pPr>
+      <w:r>
+        <w:rPr>
+          <w:sz w:val="24"/>
+          <w:szCs w:val="24"/>
+        </w:rPr>
+        <w:t>Si no hay eventos disponibles, el siguiente error saldrá:</w:t>
+      </w:r>
+    </w:p>
+    <w:p>
+      <w:pPr>
+        <w:rPr>
+          <w:sz w:val="24"/>
+          <w:szCs w:val="24"/>
+        </w:rPr>
+      </w:pPr>
+      <w:r>
+        <w:rPr>
+          <w:noProof/>
+        </w:rPr>
+        <w:drawing>
+          <wp:inline distT="0" distB="0" distL="0" distR="0" wp14:anchorId="55764C27" wp14:editId="12955950">
+            <wp:extent cx="3703320" cy="470148"/>
+            <wp:effectExtent l="0" t="0" r="0" b="6350"/>
+            <wp:docPr id="1524109309" name="Imagen 1"/>
+            <wp:cNvGraphicFramePr>
+              <a:graphicFrameLocks xmlns:a="http://schemas.openxmlformats.org/drawingml/2006/main" noChangeAspect="1"/>
+            </wp:cNvGraphicFramePr>
+            <a:graphic xmlns:a="http://schemas.openxmlformats.org/drawingml/2006/main">
+              <a:graphicData uri="http://schemas.openxmlformats.org/drawingml/2006/picture">
+                <pic:pic xmlns:pic="http://schemas.openxmlformats.org/drawingml/2006/picture">
+                  <pic:nvPicPr>
+                    <pic:cNvPr id="1524109309" name=""/>
+                    <pic:cNvPicPr/>
+                  </pic:nvPicPr>
+                  <pic:blipFill>
+                    <a:blip r:embed="rId44"/>
+                    <a:stretch>
+                      <a:fillRect/>
+                    </a:stretch>
+                  </pic:blipFill>
+                  <pic:spPr>
+                    <a:xfrm>
+                      <a:off x="0" y="0"/>
+                      <a:ext cx="3738076" cy="474560"/>
+                    </a:xfrm>
+                    <a:prstGeom prst="rect">
+                      <a:avLst/>
+                    </a:prstGeom>
+                  </pic:spPr>
+                </pic:pic>
+              </a:graphicData>
+            </a:graphic>
+          </wp:inline>
+        </w:drawing>
+      </w:r>
+    </w:p>
+    <w:p>
+      <w:pPr>
+        <w:rPr>
+          <w:sz w:val="24"/>
+          <w:szCs w:val="24"/>
+        </w:rPr>
+      </w:pPr>
+      <w:r>
+        <w:rPr>
+          <w:sz w:val="24"/>
+          <w:szCs w:val="24"/>
+        </w:rPr>
+        <w:t>Si se selecciona un evento que no existe, el siguiente mensaje saldrá:</w:t>
+      </w:r>
+    </w:p>
+    <w:p>
+      <w:pPr>
+        <w:rPr>
+          <w:sz w:val="24"/>
+          <w:szCs w:val="24"/>
+        </w:rPr>
+      </w:pPr>
+      <w:r>
+        <w:rPr>
+          <w:noProof/>
+        </w:rPr>
+        <w:drawing>
+          <wp:inline distT="0" distB="0" distL="0" distR="0" wp14:anchorId="210C6192" wp14:editId="253FBE98">
+            <wp:extent cx="3672840" cy="1018410"/>
+            <wp:effectExtent l="0" t="0" r="3810" b="0"/>
+            <wp:docPr id="1460240258" name="Imagen 1"/>
+            <wp:cNvGraphicFramePr>
+              <a:graphicFrameLocks xmlns:a="http://schemas.openxmlformats.org/drawingml/2006/main" noChangeAspect="1"/>
+            </wp:cNvGraphicFramePr>
+            <a:graphic xmlns:a="http://schemas.openxmlformats.org/drawingml/2006/main">
+              <a:graphicData uri="http://schemas.openxmlformats.org/drawingml/2006/picture">
+                <pic:pic xmlns:pic="http://schemas.openxmlformats.org/drawingml/2006/picture">
+                  <pic:nvPicPr>
+                    <pic:cNvPr id="1460240258" name=""/>
+                    <pic:cNvPicPr/>
+                  </pic:nvPicPr>
+                  <pic:blipFill>
+                    <a:blip r:embed="rId45"/>
+                    <a:stretch>
+                      <a:fillRect/>
+                    </a:stretch>
+                  </pic:blipFill>
+                  <pic:spPr>
+                    <a:xfrm>
+                      <a:off x="0" y="0"/>
+                      <a:ext cx="3679591" cy="1020282"/>
+                    </a:xfrm>
+                    <a:prstGeom prst="rect">
+                      <a:avLst/>
+                    </a:prstGeom>
+                  </pic:spPr>
+                </pic:pic>
+              </a:graphicData>
+            </a:graphic>
+          </wp:inline>
+        </w:drawing>
+      </w:r>
+    </w:p>
+    <w:p>
+      <w:pPr>
+        <w:rPr>
+          <w:sz w:val="24"/>
+          <w:szCs w:val="24"/>
+        </w:rPr>
+      </w:pPr>
+    </w:p>
+    <w:p>
+      <w:pPr>
+        <w:rPr>
+          <w:sz w:val="24"/>
+          <w:szCs w:val="24"/>
+        </w:rPr>
+      </w:pPr>
+      <w:r>
+        <w:rPr>
+          <w:sz w:val="24"/>
+          <w:szCs w:val="24"/>
+        </w:rPr>
+        <w:t xml:space="preserve">Si </w:t>
+      </w:r>
+      <w:r>
+        <w:rPr>
+          <w:sz w:val="24"/>
+          <w:szCs w:val="24"/>
+        </w:rPr>
+        <w:t>después de seleccionar un evento válido se</w:t>
+      </w:r>
+      <w:r>
+        <w:rPr>
+          <w:sz w:val="24"/>
+          <w:szCs w:val="24"/>
+        </w:rPr>
+        <w:t xml:space="preserve"> introduce un ID de galería que no existe, el siguiente mensaje saldrá:</w:t>
+      </w:r>
+    </w:p>
+    <w:p>
+      <w:pPr>
+        <w:rPr>
+          <w:sz w:val="24"/>
+          <w:szCs w:val="24"/>
+        </w:rPr>
+      </w:pPr>
+      <w:r>
+        <w:rPr>
+          <w:noProof/>
+        </w:rPr>
+        <w:drawing>
+          <wp:inline distT="0" distB="0" distL="0" distR="0" wp14:anchorId="2C938EB3" wp14:editId="4AD97204">
+            <wp:extent cx="4545159" cy="1897380"/>
+            <wp:effectExtent l="0" t="0" r="8255" b="7620"/>
+            <wp:docPr id="2030502079" name="Imagen 1"/>
+            <wp:cNvGraphicFramePr>
+              <a:graphicFrameLocks xmlns:a="http://schemas.openxmlformats.org/drawingml/2006/main" noChangeAspect="1"/>
+            </wp:cNvGraphicFramePr>
+            <a:graphic xmlns:a="http://schemas.openxmlformats.org/drawingml/2006/main">
+              <a:graphicData uri="http://schemas.openxmlformats.org/drawingml/2006/picture">
+                <pic:pic xmlns:pic="http://schemas.openxmlformats.org/drawingml/2006/picture">
+                  <pic:nvPicPr>
+                    <pic:cNvPr id="2030502079" name=""/>
+                    <pic:cNvPicPr/>
+                  </pic:nvPicPr>
+                  <pic:blipFill>
+                    <a:blip r:embed="rId46"/>
+                    <a:stretch>
+                      <a:fillRect/>
+                    </a:stretch>
+                  </pic:blipFill>
+                  <pic:spPr>
+                    <a:xfrm>
+                      <a:off x="0" y="0"/>
+                      <a:ext cx="4551807" cy="1900155"/>
+                    </a:xfrm>
+                    <a:prstGeom prst="rect">
+                      <a:avLst/>
+                    </a:prstGeom>
+                  </pic:spPr>
+                </pic:pic>
+              </a:graphicData>
+            </a:graphic>
+          </wp:inline>
+        </w:drawing>
+      </w:r>
+    </w:p>
+    <w:p>
+      <w:pPr>
+        <w:rPr>
+          <w:b/>
+          <w:bCs/>
+          <w:sz w:val="28"/>
+          <w:szCs w:val="28"/>
+        </w:rPr>
+      </w:pPr>
+    </w:p>
+    <w:p>
+      <w:pPr>
+        <w:rPr>
+          <w:b/>
+          <w:bCs/>
+          <w:sz w:val="28"/>
+          <w:szCs w:val="28"/>
+        </w:rPr>
+      </w:pPr>
+      <w:r>
+        <w:rPr>
+          <w:b/>
+          <w:bCs/>
+          <w:sz w:val="28"/>
+          <w:szCs w:val="28"/>
+        </w:rPr>
+        <w:lastRenderedPageBreak/>
+        <w:t>Opción 7</w:t>
+      </w:r>
+      <w:r>
+        <w:rPr>
+          <w:b/>
+          <w:bCs/>
+          <w:sz w:val="28"/>
+          <w:szCs w:val="28"/>
+        </w:rPr>
+        <w:t>:</w:t>
+      </w:r>
+    </w:p>
+    <w:p>
+      <w:pPr>
+        <w:rPr>
+          <w:b/>
+          <w:bCs/>
+          <w:sz w:val="24"/>
+          <w:szCs w:val="24"/>
+        </w:rPr>
+      </w:pPr>
+      <w:r>
+        <w:rPr>
+          <w:b/>
+          <w:bCs/>
+          <w:sz w:val="24"/>
+          <w:szCs w:val="24"/>
+        </w:rPr>
+        <w:t>Se inicia el menú de creación de favoritos</w:t>
+      </w:r>
+    </w:p>
+    <w:p>
+      <w:pPr>
+        <w:rPr>
+          <w:sz w:val="24"/>
+          <w:szCs w:val="24"/>
+        </w:rPr>
+      </w:pPr>
+      <w:r>
+        <w:rPr>
+          <w:sz w:val="24"/>
+          <w:szCs w:val="24"/>
+        </w:rPr>
+        <w:t>Tras introducir un ID de evento y un email de usuario, se creará un favorito mediando esos datos.</w:t>
+      </w:r>
+    </w:p>
+    <w:p>
+      <w:pPr>
+        <w:rPr>
+          <w:sz w:val="24"/>
+          <w:szCs w:val="24"/>
+        </w:rPr>
+      </w:pPr>
+      <w:r>
+        <w:rPr>
+          <w:noProof/>
+        </w:rPr>
+        <w:drawing>
+          <wp:inline distT="0" distB="0" distL="0" distR="0" wp14:anchorId="13E36B81" wp14:editId="6D438669">
+            <wp:extent cx="4777740" cy="2010763"/>
+            <wp:effectExtent l="0" t="0" r="3810" b="8890"/>
+            <wp:docPr id="589006267" name="Imagen 1"/>
+            <wp:cNvGraphicFramePr>
+              <a:graphicFrameLocks xmlns:a="http://schemas.openxmlformats.org/drawingml/2006/main" noChangeAspect="1"/>
+            </wp:cNvGraphicFramePr>
+            <a:graphic xmlns:a="http://schemas.openxmlformats.org/drawingml/2006/main">
+              <a:graphicData uri="http://schemas.openxmlformats.org/drawingml/2006/picture">
+                <pic:pic xmlns:pic="http://schemas.openxmlformats.org/drawingml/2006/picture">
+                  <pic:nvPicPr>
+                    <pic:cNvPr id="589006267" name=""/>
+                    <pic:cNvPicPr/>
+                  </pic:nvPicPr>
+                  <pic:blipFill>
+                    <a:blip r:embed="rId47"/>
+                    <a:stretch>
+                      <a:fillRect/>
+                    </a:stretch>
+                  </pic:blipFill>
+                  <pic:spPr>
+                    <a:xfrm>
+                      <a:off x="0" y="0"/>
+                      <a:ext cx="4781999" cy="2012555"/>
+                    </a:xfrm>
+                    <a:prstGeom prst="rect">
+                      <a:avLst/>
+                    </a:prstGeom>
+                  </pic:spPr>
+                </pic:pic>
+              </a:graphicData>
+            </a:graphic>
+          </wp:inline>
+        </w:drawing>
+      </w:r>
+    </w:p>
+    <w:p>
+      <w:pPr>
+        <w:rPr>
+          <w:sz w:val="24"/>
+          <w:szCs w:val="24"/>
+        </w:rPr>
+      </w:pPr>
+      <w:r>
+        <w:rPr>
+          <w:sz w:val="24"/>
+          <w:szCs w:val="24"/>
+        </w:rPr>
+        <w:t>Si se selecciona un evento que no existe, el siguiente error saldrá:</w:t>
+      </w:r>
+    </w:p>
+    <w:p>
+      <w:pPr>
+        <w:rPr>
+          <w:sz w:val="24"/>
+          <w:szCs w:val="24"/>
+        </w:rPr>
+      </w:pPr>
+      <w:r>
+        <w:rPr>
+          <w:noProof/>
+        </w:rPr>
+        <w:drawing>
+          <wp:anchor distT="0" distB="0" distL="114300" distR="114300" simplePos="0" relativeHeight="251658240" behindDoc="0" locked="0" layoutInCell="1" allowOverlap="1" wp14:anchorId="51194746" wp14:editId="3E265832">
+            <wp:simplePos x="1082040" y="4480560"/>
+            <wp:positionH relativeFrom="column">
+              <wp:align>left</wp:align>
+            </wp:positionH>
+            <wp:positionV relativeFrom="paragraph">
+              <wp:align>top</wp:align>
+            </wp:positionV>
+            <wp:extent cx="4282401" cy="629920"/>
+            <wp:effectExtent l="0" t="0" r="4445" b="0"/>
+            <wp:wrapSquare wrapText="bothSides"/>
+            <wp:docPr id="1946187921" name="Imagen 1"/>
+            <wp:cNvGraphicFramePr>
+              <a:graphicFrameLocks xmlns:a="http://schemas.openxmlformats.org/drawingml/2006/main" noChangeAspect="1"/>
+            </wp:cNvGraphicFramePr>
+            <a:graphic xmlns:a="http://schemas.openxmlformats.org/drawingml/2006/main">
+              <a:graphicData uri="http://schemas.openxmlformats.org/drawingml/2006/picture">
+                <pic:pic xmlns:pic="http://schemas.openxmlformats.org/drawingml/2006/picture">
+                  <pic:nvPicPr>
+                    <pic:cNvPr id="1946187921" name=""/>
+                    <pic:cNvPicPr/>
+                  </pic:nvPicPr>
+                  <pic:blipFill rotWithShape="1">
+                    <a:blip r:embed="rId48">
+                      <a:extLst>
+                        <a:ext uri="{28A0092B-C50C-407E-A947-70E740481C1C}">
+                          <a14:useLocalDpi xmlns:a14="http://schemas.microsoft.com/office/drawing/2010/main" val="0"/>
+                        </a:ext>
+                      </a:extLst>
+                    </a:blip>
+                    <a:srcRect t="56415"/>
+                    <a:stretch>
+                      <a:fillRect/>
+                    </a:stretch>
+                  </pic:blipFill>
+                  <pic:spPr bwMode="auto">
+                    <a:xfrm>
+                      <a:off x="0" y="0"/>
+                      <a:ext cx="4282401" cy="629920"/>
+                    </a:xfrm>
+                    <a:prstGeom prst="rect">
+                      <a:avLst/>
+                    </a:prstGeom>
+                    <a:ln>
+                      <a:noFill/>
+                    </a:ln>
+                    <a:extLst>
+                      <a:ext uri="{53640926-AAD7-44D8-BBD7-CCE9431645EC}">
+                        <a14:shadowObscured xmlns:a14="http://schemas.microsoft.com/office/drawing/2010/main"/>
+                      </a:ext>
+                    </a:extLst>
+                  </pic:spPr>
+                </pic:pic>
+              </a:graphicData>
+            </a:graphic>
+          </wp:anchor>
+        </w:drawing>
+      </w:r>
+      <w:r>
+        <w:rPr>
+          <w:sz w:val="24"/>
+          <w:szCs w:val="24"/>
+        </w:rPr>
+        <w:br w:type="textWrapping" w:clear="all"/>
+      </w:r>
+    </w:p>
+    <w:p>
+      <w:pPr>
+        <w:rPr>
+          <w:sz w:val="24"/>
+          <w:szCs w:val="24"/>
+        </w:rPr>
+      </w:pPr>
+      <w:r>
+        <w:rPr>
+          <w:sz w:val="24"/>
+          <w:szCs w:val="24"/>
+        </w:rPr>
+        <w:t>Si se selecciona un usuario que no existe, el siguiente error saldrá:</w:t>
+      </w:r>
+    </w:p>
+    <w:p>
+      <w:pPr>
+        <w:rPr>
+          <w:sz w:val="24"/>
+          <w:szCs w:val="24"/>
+        </w:rPr>
+      </w:pPr>
+      <w:r>
+        <w:rPr>
+          <w:noProof/>
+        </w:rPr>
+        <w:drawing>
+          <wp:inline distT="0" distB="0" distL="0" distR="0" wp14:anchorId="66EBE816" wp14:editId="000CF427">
+            <wp:extent cx="4289601" cy="970280"/>
+            <wp:effectExtent l="0" t="0" r="0" b="1270"/>
+            <wp:docPr id="1850394881" name="Imagen 1"/>
+            <wp:cNvGraphicFramePr>
+              <a:graphicFrameLocks xmlns:a="http://schemas.openxmlformats.org/drawingml/2006/main" noChangeAspect="1"/>
+            </wp:cNvGraphicFramePr>
+            <a:graphic xmlns:a="http://schemas.openxmlformats.org/drawingml/2006/main">
+              <a:graphicData uri="http://schemas.openxmlformats.org/drawingml/2006/picture">
+                <pic:pic xmlns:pic="http://schemas.openxmlformats.org/drawingml/2006/picture">
+                  <pic:nvPicPr>
+                    <pic:cNvPr id="1850394881" name=""/>
+                    <pic:cNvPicPr/>
+                  </pic:nvPicPr>
+                  <pic:blipFill rotWithShape="1">
+                    <a:blip r:embed="rId49"/>
+                    <a:srcRect t="47885"/>
+                    <a:stretch>
+                      <a:fillRect/>
+                    </a:stretch>
+                  </pic:blipFill>
+                  <pic:spPr bwMode="auto">
+                    <a:xfrm>
+                      <a:off x="0" y="0"/>
+                      <a:ext cx="4308648" cy="974588"/>
+                    </a:xfrm>
+                    <a:prstGeom prst="rect">
+                      <a:avLst/>
+                    </a:prstGeom>
+                    <a:ln>
+                      <a:noFill/>
+                    </a:ln>
+                    <a:extLst>
+                      <a:ext uri="{53640926-AAD7-44D8-BBD7-CCE9431645EC}">
+                        <a14:shadowObscured xmlns:a14="http://schemas.microsoft.com/office/drawing/2010/main"/>
+                      </a:ext>
+                    </a:extLst>
+                  </pic:spPr>
+                </pic:pic>
+              </a:graphicData>
+            </a:graphic>
+          </wp:inline>
+        </w:drawing>
+      </w:r>
+    </w:p>
+    <w:p>
+      <w:pPr>
+        <w:rPr>
+          <w:sz w:val="24"/>
+          <w:szCs w:val="24"/>
+        </w:rPr>
+      </w:pPr>
+    </w:p>
+    <w:p>
+      <w:pPr>
+        <w:rPr>
+          <w:sz w:val="24"/>
+          <w:szCs w:val="24"/>
+        </w:rPr>
+      </w:pPr>
+      <w:r>
+        <w:rPr>
+          <w:sz w:val="24"/>
+          <w:szCs w:val="24"/>
+        </w:rPr>
+        <w:br w:type="page"/>
+      </w:r>
+    </w:p>
+    <w:p>
+      <w:pPr>
+        <w:rPr>
+          <w:b/>
+          <w:bCs/>
+          <w:sz w:val="28"/>
+          <w:szCs w:val="28"/>
+        </w:rPr>
+      </w:pPr>
+      <w:r>
+        <w:rPr>
+          <w:b/>
+          <w:bCs/>
+          <w:sz w:val="28"/>
+          <w:szCs w:val="28"/>
+        </w:rPr>
+        <w:lastRenderedPageBreak/>
+        <w:t>Opción 8:</w:t>
+      </w:r>
+    </w:p>
+    <w:p>
+      <w:pPr>
+        <w:rPr>
+          <w:b/>
+          <w:bCs/>
+          <w:sz w:val="24"/>
+          <w:szCs w:val="24"/>
+        </w:rPr>
+      </w:pPr>
+      <w:r>
+        <w:rPr>
+          <w:b/>
+          <w:bCs/>
+          <w:sz w:val="24"/>
+          <w:szCs w:val="24"/>
+        </w:rPr>
+        <w:t>Se inicia el menú de borrado de favoritos.</w:t>
+      </w:r>
+    </w:p>
+    <w:p>
+      <w:pPr>
+        <w:rPr>
+          <w:sz w:val="24"/>
+          <w:szCs w:val="24"/>
+        </w:rPr>
+      </w:pPr>
+      <w:r>
+        <w:rPr>
+          <w:sz w:val="24"/>
+          <w:szCs w:val="24"/>
+        </w:rPr>
+        <w:t>Para eliminar un favorito, hacen falta los mismos datos que para crearlo:</w:t>
+      </w:r>
+    </w:p>
+    <w:p>
+      <w:pPr>
+        <w:pStyle w:val="Prrafodelista"/>
+        <w:numPr>
+          <w:ilvl w:val="0"/>
+          <w:numId w:val="2"/>
+        </w:numPr>
+        <w:rPr>
+          <w:sz w:val="24"/>
+          <w:szCs w:val="24"/>
+        </w:rPr>
+      </w:pPr>
+      <w:r>
+        <w:rPr>
+          <w:sz w:val="24"/>
+          <w:szCs w:val="24"/>
+        </w:rPr>
+        <w:t>ID de evento</w:t>
+      </w:r>
+    </w:p>
+    <w:p>
+      <w:pPr>
+        <w:pStyle w:val="Prrafodelista"/>
+        <w:numPr>
+          <w:ilvl w:val="0"/>
+          <w:numId w:val="2"/>
+        </w:numPr>
+        <w:rPr>
+          <w:sz w:val="24"/>
+          <w:szCs w:val="24"/>
+        </w:rPr>
+      </w:pPr>
+      <w:r>
+        <w:rPr>
+          <w:sz w:val="24"/>
+          <w:szCs w:val="24"/>
+        </w:rPr>
+        <w:t>Email del usuario</w:t>
+      </w:r>
+    </w:p>
+    <w:p>
+      <w:pPr>
+        <w:ind w:left="360"/>
+        <w:rPr>
+          <w:sz w:val="24"/>
+          <w:szCs w:val="24"/>
+        </w:rPr>
+      </w:pPr>
+    </w:p>
+    <w:p>
+      <w:pPr>
+        <w:rPr>
+          <w:sz w:val="24"/>
+          <w:szCs w:val="24"/>
+        </w:rPr>
+      </w:pPr>
+      <w:r>
+        <w:rPr>
+          <w:noProof/>
+        </w:rPr>
+        <w:drawing>
+          <wp:inline distT="0" distB="0" distL="0" distR="0" wp14:anchorId="559A3A08" wp14:editId="247783A2">
+            <wp:extent cx="5400040" cy="1978660"/>
+            <wp:effectExtent l="0" t="0" r="0" b="2540"/>
+            <wp:docPr id="1489977083" name="Imagen 1"/>
+            <wp:cNvGraphicFramePr>
+              <a:graphicFrameLocks xmlns:a="http://schemas.openxmlformats.org/drawingml/2006/main" noChangeAspect="1"/>
+            </wp:cNvGraphicFramePr>
+            <a:graphic xmlns:a="http://schemas.openxmlformats.org/drawingml/2006/main">
+              <a:graphicData uri="http://schemas.openxmlformats.org/drawingml/2006/picture">
+                <pic:pic xmlns:pic="http://schemas.openxmlformats.org/drawingml/2006/picture">
+                  <pic:nvPicPr>
+                    <pic:cNvPr id="1489977083" name=""/>
+                    <pic:cNvPicPr/>
+                  </pic:nvPicPr>
+                  <pic:blipFill>
+                    <a:blip r:embed="rId50"/>
+                    <a:stretch>
+                      <a:fillRect/>
+                    </a:stretch>
+                  </pic:blipFill>
+                  <pic:spPr>
+                    <a:xfrm>
+                      <a:off x="0" y="0"/>
+                      <a:ext cx="5400040" cy="1978660"/>
+                    </a:xfrm>
+                    <a:prstGeom prst="rect">
+                      <a:avLst/>
+                    </a:prstGeom>
+                  </pic:spPr>
+                </pic:pic>
+              </a:graphicData>
+            </a:graphic>
+          </wp:inline>
+        </w:drawing>
+      </w:r>
+    </w:p>
+    <w:p>
+      <w:pPr>
+        <w:rPr>
+          <w:sz w:val="24"/>
+          <w:szCs w:val="24"/>
+        </w:rPr>
+      </w:pPr>
+    </w:p>
+    <w:p>
+      <w:pPr>
+        <w:rPr>
+          <w:sz w:val="24"/>
+          <w:szCs w:val="24"/>
+        </w:rPr>
+      </w:pPr>
+      <w:r>
+        <w:rPr>
+          <w:sz w:val="24"/>
+          <w:szCs w:val="24"/>
+        </w:rPr>
+        <w:t>Si alguno de lo datos no es correcto, saltará un erro</w:t>
+      </w:r>
+      <w:r>
+        <w:rPr>
+          <w:sz w:val="24"/>
+          <w:szCs w:val="24"/>
+        </w:rPr>
+        <w:t>r.</w:t>
       </w:r>
     </w:p>
     <w:sectPr>
@@ -5474,6 +7307,38 @@
       <w:u w:val="single"/>
     </w:rPr>
   </w:style>
+  <w:style w:type="paragraph" w:customStyle="1" w:styleId="codigo">
+    <w:name w:val="codigo"/>
+    <w:basedOn w:val="Normal"/>
+    <w:link w:val="codigoCar"/>
+    <w:qFormat/>
+    <w:rsid w:val="00BE530C"/>
+    <w:pPr>
+      <w:spacing w:line="240" w:lineRule="auto"/>
+    </w:pPr>
+    <w:rPr>
+      <w:rFonts w:ascii="Courier New" w:hAnsi="Courier New"/>
+      <w:b/>
+      <w:color w:val="000000" w:themeColor="text1"/>
+      <w:spacing w:val="-20"/>
+      <w:sz w:val="24"/>
+      <w:szCs w:val="24"/>
+    </w:rPr>
+  </w:style>
+  <w:style w:type="character" w:customStyle="1" w:styleId="codigoCar">
+    <w:name w:val="codigo Car"/>
+    <w:basedOn w:val="Fuentedeprrafopredeter"/>
+    <w:link w:val="codigo"/>
+    <w:rsid w:val="00BE530C"/>
+    <w:rPr>
+      <w:rFonts w:ascii="Courier New" w:hAnsi="Courier New"/>
+      <w:b/>
+      <w:color w:val="000000" w:themeColor="text1"/>
+      <w:spacing w:val="-20"/>
+      <w:sz w:val="24"/>
+      <w:szCs w:val="24"/>
+    </w:rPr>
+  </w:style>
 </w:styles>
 </file>
 

</xml_diff>